<commit_message>
Standard-compliant formatting: APA7 exports rebuilt on the house template
- Title page, double spacing, justified body, black headings, page numbers
- Resumo and Abstract each on their own page with keywords
- References: Bibliography style with hanging indent, no bullets
- Figure 1 headroom fixed; short table labels with APA note; single-spaced table cells
- README fully in English
</commit_message>
<xml_diff>
--- a/docs/paper/paper-final.docx
+++ b/docs/paper/paper-final.docx
@@ -4,14 +4,70 @@
   <w:body>
     <w:p>
       <w:pPr>
-        <w:pStyle w:val="FirstParagraph"/>
+        <w:pStyle w:val="CoverOrg"/>
+      </w:pPr>
+      <w:r>
+        <w:t xml:space="preserve">CODEX HASH RESEARCH LABORATORY</w:t>
+      </w:r>
+    </w:p>
+    <w:p>
+      <w:pPr>
+        <w:pStyle w:val="BodyText"/>
+      </w:pPr>
+      <w:r>
+        <w:t xml:space="preserve"> </w:t>
+      </w:r>
+    </w:p>
+    <w:p>
+      <w:pPr>
+        <w:pStyle w:val="CoverTitle"/>
+      </w:pPr>
+      <w:r>
+        <w:t xml:space="preserve">Ponto de operação, protocolo e a fragilidade do ranking de arquiteturas na detecção de fraude em cartões</w:t>
+      </w:r>
+    </w:p>
+    <w:p>
+      <w:pPr>
+        <w:pStyle w:val="CoverSubtitle"/>
+      </w:pPr>
+      <w:r>
+        <w:t xml:space="preserve">Um estudo de caso confirmatório e auditável no benchmark ULB/Worldline</w:t>
+      </w:r>
+    </w:p>
+    <w:p>
+      <w:pPr>
+        <w:pStyle w:val="BodyText"/>
+      </w:pPr>
+      <w:r>
+        <w:t xml:space="preserve"> </w:t>
+      </w:r>
+    </w:p>
+    <w:p>
+      <w:pPr>
+        <w:pStyle w:val="CoverInfo"/>
       </w:pPr>
       <w:r>
         <w:rPr>
           <w:b/>
           <w:bCs/>
         </w:rPr>
-        <w:t xml:space="preserve">CODEX HASH RESEARCH LABORATORY</w:t>
+        <w:t xml:space="preserve">Carlos Ulisses Flores</w:t>
+      </w:r>
+    </w:p>
+    <w:p>
+      <w:pPr>
+        <w:pStyle w:val="CoverInfo"/>
+      </w:pPr>
+      <w:r>
+        <w:t xml:space="preserve">Codex Hash Research Laboratory, Codex Hash Ltda., Brazil</w:t>
+      </w:r>
+    </w:p>
+    <w:p>
+      <w:pPr>
+        <w:pStyle w:val="CoverInfo"/>
+      </w:pPr>
+      <w:r>
+        <w:t xml:space="preserve">ORCID: 0000-0002-6034-7765</w:t>
       </w:r>
     </w:p>
     <w:p>
@@ -24,19 +80,24 @@
     </w:p>
     <w:p>
       <w:pPr>
-        <w:pStyle w:val="BodyText"/>
-      </w:pPr>
-      <w:r>
-        <w:t xml:space="preserve"> </w:t>
-      </w:r>
-    </w:p>
-    <w:bookmarkStart w:id="49" w:name="X9aadb40de3ac7d25b1675cdcfa500578c4f44d2"/>
-    <w:p>
-      <w:pPr>
-        <w:pStyle w:val="Heading1"/>
-      </w:pPr>
-      <w:r>
-        <w:t xml:space="preserve">Ponto de operação, protocolo e a fragilidade do ranking de arquiteturas na detecção de fraude em cartões: um estudo de caso confirmatório e auditável no benchmark ULB/Worldline</w:t>
+        <w:pStyle w:val="CoverInfo"/>
+      </w:pPr>
+      <w:r>
+        <w:t xml:space="preserve">Data: 4 de julho de 2026</w:t>
+      </w:r>
+    </w:p>
+    <w:p>
+      <w:r>
+        <w:br w:type="page"/>
+      </w:r>
+    </w:p>
+    <w:bookmarkStart w:id="28" w:name="resumo"/>
+    <w:p>
+      <w:pPr>
+        <w:pStyle w:val="Heading2"/>
+      </w:pPr>
+      <w:r>
+        <w:t xml:space="preserve">Resumo</w:t>
       </w:r>
     </w:p>
     <w:p>
@@ -44,7 +105,7 @@
         <w:pStyle w:val="FirstParagraph"/>
       </w:pPr>
       <w:r>
-        <w:t xml:space="preserve"> </w:t>
+        <w:t xml:space="preserve">Detectar fraude em cartões de crédito é um problema de classe rara — no benchmark público ULB/Worldline, apenas 0,173% das 284.807 transações são fraudulentas — e a literatura disputa há anos qual arquitetura de modelo detecta melhor. Este artigo mede uma pergunta anterior e mais prática: quanto do desempenho operacional vem da escolha da arquitetura, e quanto vem de um único escalar, o limiar de decisão (o ponto de operação) selecionado em validação sob reponderação de custo. Quatro famílias — Perceptron Multi-Camadas (MLP), Regressão Logística (LR), Autoencoder e Isolation Forest — são comparadas sob protocolo auditável, sem vazamento de pré-processamento, com dados ancorados por SHA-256 e determinismo verificado por re-execução idêntica. A assimetria encontrada é de duas ordens de magnitude: deslocar o limiar do MLP do valor-padrão 0,5 para o ótimo de validação (0,9994) eleva o F1 de teste de 0,267 para 0,812, enquanto trocar a arquitetura desloca −0,007, com intervalo bootstrap pareado de 95% [−0,055; +0,042] — indistinguível de zero e menor que o desvio-padrão de treino do próprio MLP sob 20 sementes (0,016). Uma aparente vitória do MLP (ΔF1 = +0,053, intervalo excluindo zero) é demonstrada como artefato de protocolo: a grade de limiares herdada do material precedente, truncada em 0,99, fabricava a diferença. Conclui-se que a alavanca dominante de engenharia e de governança é o acoplamento entre reponderação de custo e limiar auditável, não a família do modelo — e que micro-decisões de protocolo bastam para inverter conclusões de comparações de arquitetura.</w:t>
       </w:r>
     </w:p>
     <w:p>
@@ -56,50 +117,13 @@
           <w:b/>
           <w:bCs/>
         </w:rPr>
-        <w:t xml:space="preserve">Carlos Ulisses Flores</w:t>
-      </w:r>
-    </w:p>
-    <w:p>
-      <w:pPr>
-        <w:pStyle w:val="BodyText"/>
-      </w:pPr>
-      <w:r>
-        <w:t xml:space="preserve">Codex Hash Research Laboratory, Codex Hash Ltda., Brazil</w:t>
-      </w:r>
-    </w:p>
-    <w:p>
-      <w:pPr>
-        <w:pStyle w:val="BodyText"/>
-      </w:pPr>
-      <w:r>
-        <w:t xml:space="preserve">ORCID:</w:t>
-      </w:r>
-      <w:r>
-        <w:t xml:space="preserve"> </w:t>
-      </w:r>
-      <w:hyperlink r:id="rId9">
-        <w:r>
-          <w:rPr>
-            <w:rStyle w:val="Hyperlink"/>
-          </w:rPr>
-          <w:t xml:space="preserve">0000-0002-6034-7765</w:t>
-        </w:r>
-      </w:hyperlink>
-    </w:p>
-    <w:p>
-      <w:pPr>
-        <w:pStyle w:val="BodyText"/>
-      </w:pPr>
-      <w:r>
-        <w:t xml:space="preserve"> </w:t>
-      </w:r>
-    </w:p>
-    <w:p>
-      <w:pPr>
-        <w:pStyle w:val="BodyText"/>
-      </w:pPr>
-      <w:r>
-        <w:t xml:space="preserve">Julho de 2026</w:t>
+        <w:t xml:space="preserve">Palavras-chave:</w:t>
+      </w:r>
+      <w:r>
+        <w:t xml:space="preserve"> </w:t>
+      </w:r>
+      <w:r>
+        <w:t xml:space="preserve">detecção de fraude; classe rara; ponto de operação; aprendizado sensível a custo; vazamento de dados; reprodutibilidade</w:t>
       </w:r>
     </w:p>
     <w:p>
@@ -107,13 +131,14 @@
         <w:br w:type="page"/>
       </w:r>
     </w:p>
-    <w:bookmarkStart w:id="10" w:name="resumo"/>
+    <w:bookmarkEnd w:id="28"/>
+    <w:bookmarkStart w:id="29" w:name="abstract"/>
     <w:p>
       <w:pPr>
         <w:pStyle w:val="Heading2"/>
       </w:pPr>
       <w:r>
-        <w:t xml:space="preserve">Resumo</w:t>
+        <w:t xml:space="preserve">Abstract</w:t>
       </w:r>
     </w:p>
     <w:p>
@@ -121,7 +146,7 @@
         <w:pStyle w:val="FirstParagraph"/>
       </w:pPr>
       <w:r>
-        <w:t xml:space="preserve">Detectar fraude em cartões de crédito é um problema de classe rara: no benchmark público ULB/Worldline, apenas 0,173% das 284.807 transações são fraudulentas, e a literatura da área disputa há anos qual arquitetura de modelo detecta melhor. Este artigo mede uma pergunta anterior e mais prática: quanto do desempenho operacional de um detector vem, de fato, da escolha da arquitetura — e quanto vem de um único escalar, o limiar de decisão (o ponto de operação) selecionado em validação sob reponderação de custo. Quatro famílias de modelos — Perceptron Multi-Camadas (MLP), Regressão Logística (LR), Autoencoder e Isolation Forest — são comparadas sob protocolo auditável e sem vazamento de pré-processamento: padronização ajustada apenas no treino, reponderação de custo em vez de sobreamostragem sintética, dados ancorados por SHA-256 e determinismo verificado por re-execução idêntica. A assimetria encontrada é de duas ordens de magnitude. Deslocar o limiar do MLP do valor-padrão 0,5 para o ótimo selecionado em validação (0,9994) eleva o F1 de teste de 0,267 para 0,812; trocar a arquitetura, no mesmo regime, desloca −0,007, com intervalo bootstrap pareado de 95% [−0,055; +0,042] — indistinguível de zero e menor que o desvio-padrão de treino do próprio MLP re-treinado sob 20 sementes (0,016). Uma aparente vitória do MLP (ΔF1 = +0,053, com intervalo excluindo zero) é demonstrada como artefato de protocolo: a grade de limiares herdada do material precedente, truncada em 0,99, fabricava a diferença. Conclui-se que, neste regime tabular de classe rara pós-análise de componentes principais (PCA), a alavanca dominante de engenharia e de governança é o acoplamento entre reponderação de custo e limiar auditável — não a família do modelo — e que micro-decisões de protocolo, herdadas sem exame, bastam para inverter conclusões de comparações de arquitetura.</w:t>
+        <w:t xml:space="preserve">Credit-card fraud detection is a rare-class problem — in the public ULB/Worldline benchmark, only 0.173% of the 284,807 transactions are fraudulent — and the literature has long disputed which model architecture detects fraud best. This paper measures a prior and more practical question: how much of operational performance comes from architecture choice, and how much comes from a single scalar, the decision threshold (the operating point) selected on validation under cost reweighting. Four families — Multi-Layer Perceptron (MLP), Logistic Regression (LR), Autoencoder, and Isolation Forest — are compared under an auditable protocol, free of preprocessing leakage, with SHA-256-anchored data and determinism verified by identical re-execution. The asymmetry found spans two orders of magnitude: moving the MLP threshold from the 0.5 default to the validation optimum (0.9994) raises test F1 from 0.267 to 0.812, while switching architectures moves −0.007, with a 95% paired-bootstrap interval of [−0.055; +0.042] — indistinguishable from zero and smaller than the training standard deviation of the MLP itself under 20 seeds (0.016). An apparent MLP win (ΔF1 = +0.053, interval excluding zero) is shown to be a protocol artifact: the threshold grid inherited from the precedent material, truncated at 0.99, manufactured the difference. We conclude that the dominant engineering and governance lever is the coupling between cost reweighting and an auditable threshold, not the model family — and that protocol micro-decisions suffice to flip the conclusions of architecture comparisons.</w:t>
       </w:r>
     </w:p>
     <w:p>
@@ -133,23 +158,28 @@
           <w:b/>
           <w:bCs/>
         </w:rPr>
-        <w:t xml:space="preserve">Palavras-chave:</w:t>
-      </w:r>
-      <w:r>
-        <w:t xml:space="preserve"> </w:t>
-      </w:r>
-      <w:r>
-        <w:t xml:space="preserve">detecção de fraude; classe rara; ponto de operação; aprendizado sensível a custo; vazamento de dados; reprodutibilidade</w:t>
-      </w:r>
-    </w:p>
-    <w:bookmarkEnd w:id="10"/>
-    <w:bookmarkStart w:id="11" w:name="abstract"/>
+        <w:t xml:space="preserve">Keywords:</w:t>
+      </w:r>
+      <w:r>
+        <w:t xml:space="preserve"> </w:t>
+      </w:r>
+      <w:r>
+        <w:t xml:space="preserve">fraud detection; rare class; operating point; cost-sensitive learning; data leakage; reproducibility</w:t>
+      </w:r>
+    </w:p>
+    <w:p>
+      <w:r>
+        <w:br w:type="page"/>
+      </w:r>
+    </w:p>
+    <w:bookmarkEnd w:id="29"/>
+    <w:bookmarkStart w:id="30" w:name="introdução"/>
     <w:p>
       <w:pPr>
         <w:pStyle w:val="Heading2"/>
       </w:pPr>
       <w:r>
-        <w:t xml:space="preserve">Abstract</w:t>
+        <w:t xml:space="preserve">1. Introdução</w:t>
       </w:r>
     </w:p>
     <w:p>
@@ -157,7 +187,93 @@
         <w:pStyle w:val="FirstParagraph"/>
       </w:pPr>
       <w:r>
-        <w:t xml:space="preserve">Credit-card fraud detection is a rare-class problem: in the public ULB/Worldline benchmark, only 0.173% of the 284,807 transactions are fraudulent, and the literature has long disputed which model architecture detects fraud best. This paper measures a prior and more practical question: how much of a detector’s operational performance actually comes from architecture choice — and how much comes from a single scalar, the decision threshold (the operating point) selected on validation under cost reweighting. Four model families — Multi-Layer Perceptron (MLP), Logistic Regression (LR), Autoencoder, and Isolation Forest — are compared under an auditable protocol free of preprocessing leakage: standardization fitted on the training split only, cost reweighting instead of synthetic oversampling, SHA-256-anchored data, and determinism verified by identical re-execution. The asymmetry found spans two orders of magnitude. Moving the MLP threshold from the 0.5 default to the validation-selected optimum (0.9994) raises test F1 from 0.267 to 0.812; switching architectures, in the same regime, moves −0.007, with a 95% paired-bootstrap interval of [−0.055; +0.042] — indistinguishable from zero and smaller than the training standard deviation of the MLP itself retrained under 20 seeds (0.016). An apparent MLP win (ΔF1 = +0.053, with an interval excluding zero) is shown to be a protocol artifact: the threshold grid inherited from the precedent material, truncated at 0.99, manufactured the difference. We conclude that, in this rare-class tabular regime post principal component analysis (PCA), the dominant engineering and governance lever is the coupling between cost reweighting and an auditable threshold — not the model family — and that protocol micro-decisions, inherited without scrutiny, suffice to flip the conclusions of architecture comparisons.</w:t>
+        <w:t xml:space="preserve">A literatura de detecção de fraude em cartões acumula, há duas décadas, ganhos reportados de arquitetura que raramente sobrevivem a escrutínio metodológico — o fenômeno que Hand (2006) denominou ilusão de progresso e que Hayat e Magnier (2025) documentaram especificamente no benchmark ULB/Worldline: vazamento de pré-processamento, validação temporal inadequada e reporte seletivo de métricas produzem, juntos, redes neurais triviais com 99,9% de revocação aparente. Este artigo aborda uma pergunta complementar: mesmo sob protocolo correto, quanto do desempenho operacional reportado se deve à arquitetura escolhida — e quanto se deve a um único escalar, o limiar de decisão?</w:t>
+      </w:r>
+    </w:p>
+    <w:p>
+      <w:pPr>
+        <w:pStyle w:val="BodyText"/>
+      </w:pPr>
+      <w:r>
+        <w:t xml:space="preserve">A pergunta importa porque as duas alavancas têm custos de engenharia radicalmente distintos. Trocar a família do modelo custa re-treino, re-validação e re-homologação; deslocar o ponto de operação custa a escolha de um número em validação, é auditável linha a linha e é reversível. Se o efeito do segundo domina o efeito do primeiro, a prioridade de esforço da engenharia antifraude — e o objeto adequado da governança de modelo — está historicamente invertida. Evidência multi-domínio nesta direção já existe: em 9.000 experimentos sobre 30 conjuntos de dados, a calibração do limiar de decisão foi a intervenção mais consistentemente eficaz contra desbalanceamento, à frente de SMOTE e de reponderação de classe (Abdelhamid &amp; Desai, 2024). O delta deste trabalho é deliberadamente modesto: dar a essa decomposição — já indicada, sem inferência pareada, por Leevy et al. (2023) e por Abdelhamid e Desai (2024) — intervalos pareados, uma régua de variância de treino e um protocolo auditável, no benchmark canônico da literatura de fraude, cuja comunidade citante de Hayat e Magnier (2025) segue não adotando as práticas que cita.</w:t>
+      </w:r>
+    </w:p>
+    <w:p>
+      <w:pPr>
+        <w:pStyle w:val="BodyText"/>
+      </w:pPr>
+      <w:r>
+        <w:t xml:space="preserve">Este é, deliberadamente, um estudo de caso confirmatório e auditável — não a proposição de uma tese nova. As contribuições são três, mais uma nota. Primeira, a decomposição: com bootstrap pareado de 10.000 réplicas e um estudo de variância de treino com 20 sementes, mostra-se que o deslocamento do limiar move o F1 de teste do MLP em +0,545 (de 0,267 para 0,812), enquanto o gap entre MLP e Regressão Logística no regime correto de seleção é −0,007 [−0,055; +0,042] — indistinguível de zero, menor que o desvio-padrão de treino do próprio MLP (0,016) e com sinal que se inverte em 12 das 20 sementes. Segunda, a operacionalização reprodutível da crítica: padronização ajustada só no treino, reponderação de custo em lugar de qualquer sobreamostragem sintética, limiar selecionado exclusivamente em validação, dados ancorados por SHA-256, invariantes de protocolo cobertos por testes automatizados e determinismo verificado por re-execução bit-idêntica. Terceira, uma forense de reprodutibilidade do material precedente do próprio autor, da qual resultam dois achados: a aparente superioridade do MLP produzida pela censura da grade de limiares (Seção 6.2) e um defeito de reamostragem que invalidava o teste de robustez a prevalência (Seção 6.5). As implicações regulatórias da tese — incluindo a correção de uma leitura corrente do Regulamento (UE) 2024/1689 — são tratadas na Discussão (Seção 7).</w:t>
+      </w:r>
+    </w:p>
+    <w:p>
+      <w:pPr>
+        <w:pStyle w:val="BodyText"/>
+      </w:pPr>
+      <w:r>
+        <w:t xml:space="preserve">O compromisso (</w:t>
+      </w:r>
+      <w:r>
+        <w:rPr>
+          <w:i/>
+          <w:iCs/>
+        </w:rPr>
+        <w:t xml:space="preserve">trade-off</w:t>
+      </w:r>
+      <w:r>
+        <w:t xml:space="preserve">) central do problema tem nome clássico: é a fronteira de decisão de Neyman-Pearson no espaço precisão-revocação, sob assimetria de custo em que falsos negativos (fraude não detectada) custam ordens de magnitude mais que falsos positivos (transação legítima bloqueada) (Bishop, 2006; Cherif et al., 2023; Fawcett, 2006).</w:t>
+      </w:r>
+    </w:p>
+    <w:bookmarkEnd w:id="30"/>
+    <w:bookmarkStart w:id="31" w:name="trabalhos-relacionados"/>
+    <w:p>
+      <w:pPr>
+        <w:pStyle w:val="Heading2"/>
+      </w:pPr>
+      <w:r>
+        <w:t xml:space="preserve">2. Trabalhos relacionados</w:t>
+      </w:r>
+    </w:p>
+    <w:p>
+      <w:pPr>
+        <w:pStyle w:val="FirstParagraph"/>
+      </w:pPr>
+      <w:r>
+        <w:t xml:space="preserve">Três linhagens convergem neste estudo. A primeira é a da crítica metodológica. Hand (2006) argumentou que ganhos marginais de classificadores sofisticados raramente sobrevivem fora do laboratório; Kapoor e Narayanan (2023) sistematizaram a taxonomia do vazamento de dados como motor da crise de reprodutibilidade em ciência baseada em aprendizado de máquina; Boulesteix e Strobl (2009) quantificaram o viés otimista induzido pela seleção de modelo no próprio conjunto de avaliação. No nicho de fraude em cartões, Kabane (2024) demonstrou que reamostragem aplicada antes da partição infla métricas de XGBoost no mesmo conjunto ULB, e Hayat e Magnier (2025) consolidaram quatro falhas sistêmicas da literatura do benchmark. A resposta da comunidade a essa crítica tem sido, até aqui, citá-la e ignorá-la: os trabalhos que a referenciam seguem reportando estado-da-arte no mesmo benchmark sem alterar protocolo.</w:t>
+      </w:r>
+    </w:p>
+    <w:p>
+      <w:pPr>
+        <w:pStyle w:val="BodyText"/>
+      </w:pPr>
+      <w:r>
+        <w:t xml:space="preserve">A segunda linhagem é a do ponto de operação e do custo. O limiar ótimo para F1 e sua relação com probabilidades calibradas foram formalizados por Lipton et al. (2014); King e Zeng (2001) já haviam mostrado que modelos logísticos subestimam eventos raros sem correção. A evidência contemporânea é convergente (para um panorama do campo, Chen et al., 2024): correções de desbalanceamento por reamostragem degradam a calibração sem ganho discriminativo (van den Goorbergh et al., 2022); sobreamostragem sintética não beneficia classificadores fortes, bastando ajustar o ponto de operação (Elor &amp; Averbuch-Elor, 2022); a calibração de limiar é a intervenção mais consistente entre 15 modelos e 30 conjuntos (Abdelhamid &amp; Desai, 2024); e amostras sintéticas de fraude geradas por CTGAN degradaram tanto modelos individuais quanto fusões no benchmark IEEE-CIS (Han &amp; Wu, 2026). No próprio conjunto ULB, Leevy et al. (2023) compararam otimização de limiar com e sem sub-amostragem aleatória — obtendo os melhores resultados sem a sub-amostragem —, e Ngoc Thanh Sang (2026) propôs exatamente o receituário aqui adotado — perda ponderada por custo, calibração de limiar e validação consciente de vazamento. Nenhum desses trabalhos, contudo, decompõe e compara o efeito-limiar contra o efeito-arquitetura com inferência pareada, nem publica o protocolo com testes, hashes e verificação de determinismo; é essa a lacuna que este estudo de caso preenche. A institucionalização da prática confirma sua maturidade: desde 2024 a biblioteca scikit-learn 1.5 (Pedregosa et al., 2011) expõe o ajuste pós-treino de limiar como API de primeira classe, TunedThresholdClassifierCV.</w:t>
+      </w:r>
+    </w:p>
+    <w:p>
+      <w:pPr>
+        <w:pStyle w:val="BodyText"/>
+      </w:pPr>
+      <w:r>
+        <w:t xml:space="preserve">A terceira linhagem explica por que o empate entre arquiteturas era esperável a priori. Grinsztajn et al. (2022) identificaram que redes neurais são aproximadamente invariantes a rotação, enquanto árvores exploram o alinhamento axial das variáveis originais — e as variáveis V1–V28 do conjunto ULB são componentes principais (PCA, na sigla em inglês), isto é, o resultado de uma rotação. Se a projeção PCA torna as classes aproximadamente separáveis por fronteira linear, modelos lineares e MLPs saturam o mesmo teto de sinal (Hastie et al., 2009). McElfresh et al. (2023) acrescentam, sobre 176 conjuntos tabulares, que ajuste leve de hiperparâmetros em árvores impulsionadas importa com frequência mais que a própria escolha entre redes neurais e árvores. Por fim, a instabilidade de treino de redes profundas está documentada por Bouthillier et al. (2021): fontes de variância rotineiramente ignoradas — amostragem dos dados, inicialização de pesos, escolha de hiperparâmetros — impactam marcadamente os resultados e distorcem a detecção de melhorias entre métodos; este estudo mede essa variância diretamente no caso em questão (Seção 6.3).</w:t>
+      </w:r>
+    </w:p>
+    <w:bookmarkEnd w:id="31"/>
+    <w:bookmarkStart w:id="35" w:name="dados"/>
+    <w:p>
+      <w:pPr>
+        <w:pStyle w:val="Heading2"/>
+      </w:pPr>
+      <w:r>
+        <w:t xml:space="preserve">3. Dados</w:t>
+      </w:r>
+    </w:p>
+    <w:p>
+      <w:pPr>
+        <w:pStyle w:val="FirstParagraph"/>
+      </w:pPr>
+      <w:r>
+        <w:t xml:space="preserve">O conjunto ULB/Worldline (Machine Learning Group da Université Libre de Bruxelles; Kaggle) contém 284.807 transações de dois dias de setembro de 2013, com 30 variáveis preditoras — 28 componentes principais anonimizados (V1–V28), o tempo decorrido (Time) e o valor (Amount) — e rótulo binário Class com 492 fraudes (prevalência de 0,173%; Figura 1) (Dal Pozzolo, 2015; ULB/Worldline, 2013). A cópia utilizada foi verificada contra o SHA-256 registrado na execução original do material precedente (76274b691b16a6c49d3f159c883398e03ccd6d1ee12d9d8ee38f4b4b98551a89), garantindo identidade bit a bit da cadeia de dados entre as duas execuções.</w:t>
       </w:r>
     </w:p>
     <w:p>
@@ -169,128 +285,6 @@
           <w:b/>
           <w:bCs/>
         </w:rPr>
-        <w:t xml:space="preserve">Keywords:</w:t>
-      </w:r>
-      <w:r>
-        <w:t xml:space="preserve"> </w:t>
-      </w:r>
-      <w:r>
-        <w:t xml:space="preserve">fraud detection; rare class; operating point; cost-sensitive learning; data leakage; reproducibility</w:t>
-      </w:r>
-    </w:p>
-    <w:bookmarkEnd w:id="11"/>
-    <w:bookmarkStart w:id="12" w:name="introdução"/>
-    <w:p>
-      <w:pPr>
-        <w:pStyle w:val="Heading2"/>
-      </w:pPr>
-      <w:r>
-        <w:t xml:space="preserve">1. Introdução</w:t>
-      </w:r>
-    </w:p>
-    <w:p>
-      <w:pPr>
-        <w:pStyle w:val="FirstParagraph"/>
-      </w:pPr>
-      <w:r>
-        <w:t xml:space="preserve">A literatura de detecção de fraude em cartões acumula, há duas décadas, ganhos reportados de arquitetura que raramente sobrevivem a escrutínio metodológico — o fenômeno que Hand (2006) denominou ilusão de progresso e que Hayat e Magnier (2025) documentaram especificamente no benchmark ULB/Worldline: vazamento de pré-processamento, validação temporal inadequada e reporte seletivo de métricas produzem, juntos, redes neurais triviais com 99,9% de revocação aparente. Este artigo aborda uma pergunta complementar: mesmo sob protocolo correto, quanto do desempenho operacional reportado se deve à arquitetura escolhida — e quanto se deve a um único escalar, o limiar de decisão?</w:t>
-      </w:r>
-    </w:p>
-    <w:p>
-      <w:pPr>
-        <w:pStyle w:val="BodyText"/>
-      </w:pPr>
-      <w:r>
-        <w:t xml:space="preserve">A pergunta importa porque as duas alavancas têm custos de engenharia radicalmente distintos. Trocar a família do modelo custa re-treino, re-validação e re-homologação; deslocar o ponto de operação custa a escolha de um número em validação, é auditável linha a linha e é reversível. Se o efeito do segundo domina o efeito do primeiro, a prioridade de esforço da engenharia antifraude — e o objeto adequado da governança de modelo — está historicamente invertida. Evidência multi-domínio nesta direção já existe: em 9.000 experimentos sobre 30 conjuntos de dados, a calibração do limiar de decisão foi a intervenção mais consistentemente eficaz contra desbalanceamento, à frente de SMOTE e de reponderação de classe (Abdelhamid &amp; Desai, 2024). O delta deste trabalho é deliberadamente modesto: dar a essa decomposição — já indicada, sem inferência pareada, por Leevy et al. (2023) e por Abdelhamid e Desai (2024) — intervalos pareados, uma régua de variância de treino e um protocolo auditável, no benchmark canônico da literatura de fraude, cuja comunidade citante de Hayat e Magnier (2025) segue não adotando as práticas que cita.</w:t>
-      </w:r>
-    </w:p>
-    <w:p>
-      <w:pPr>
-        <w:pStyle w:val="BodyText"/>
-      </w:pPr>
-      <w:r>
-        <w:t xml:space="preserve">Este é, deliberadamente, um estudo de caso confirmatório e auditável — não a proposição de uma tese nova. As contribuições são três, mais uma nota. Primeira, a decomposição: com bootstrap pareado de 10.000 réplicas e um estudo de variância de treino com 20 sementes, mostra-se que o deslocamento do limiar move o F1 de teste do MLP em +0,545 (de 0,267 para 0,812), enquanto o gap entre MLP e Regressão Logística no regime correto de seleção é −0,007 [−0,055; +0,042] — indistinguível de zero, menor que o desvio-padrão de treino do próprio MLP (0,016) e com sinal que se inverte em 12 das 20 sementes. Segunda, a operacionalização reprodutível da crítica: padronização ajustada só no treino, reponderação de custo em lugar de qualquer sobreamostragem sintética, limiar selecionado exclusivamente em validação, dados ancorados por SHA-256, invariantes de protocolo cobertos por testes automatizados e determinismo verificado por re-execução bit-idêntica. Terceira, uma forense de reprodutibilidade do material precedente do próprio autor, da qual resultam dois achados: a aparente superioridade do MLP produzida pela censura da grade de limiares (Seção 6.2) e um defeito de reamostragem que invalidava o teste de robustez a prevalência (Seção 6.5). As implicações regulatórias da tese — incluindo a correção de uma leitura corrente do Regulamento (UE) 2024/1689 — são tratadas na Discussão (Seção 7).</w:t>
-      </w:r>
-    </w:p>
-    <w:p>
-      <w:pPr>
-        <w:pStyle w:val="BodyText"/>
-      </w:pPr>
-      <w:r>
-        <w:t xml:space="preserve">O compromisso (</w:t>
-      </w:r>
-      <w:r>
-        <w:rPr>
-          <w:i/>
-          <w:iCs/>
-        </w:rPr>
-        <w:t xml:space="preserve">trade-off</w:t>
-      </w:r>
-      <w:r>
-        <w:t xml:space="preserve">) central do problema tem nome clássico: é a fronteira de decisão de Neyman-Pearson no espaço precisão-revocação, sob assimetria de custo em que falsos negativos (fraude não detectada) custam ordens de magnitude mais que falsos positivos (transação legítima bloqueada) (Bishop, 2006; Cherif et al., 2023; Fawcett, 2006).</w:t>
-      </w:r>
-    </w:p>
-    <w:bookmarkEnd w:id="12"/>
-    <w:bookmarkStart w:id="13" w:name="trabalhos-relacionados"/>
-    <w:p>
-      <w:pPr>
-        <w:pStyle w:val="Heading2"/>
-      </w:pPr>
-      <w:r>
-        <w:t xml:space="preserve">2. Trabalhos relacionados</w:t>
-      </w:r>
-    </w:p>
-    <w:p>
-      <w:pPr>
-        <w:pStyle w:val="FirstParagraph"/>
-      </w:pPr>
-      <w:r>
-        <w:t xml:space="preserve">Três linhagens convergem neste estudo. A primeira é a da crítica metodológica. Hand (2006) argumentou que ganhos marginais de classificadores sofisticados raramente sobrevivem fora do laboratório; Kapoor e Narayanan (2023) sistematizaram a taxonomia do vazamento de dados como motor da crise de reprodutibilidade em ciência baseada em aprendizado de máquina; Boulesteix e Strobl (2009) quantificaram o viés otimista induzido pela seleção de modelo no próprio conjunto de avaliação. No nicho de fraude em cartões, Kabane (2024) demonstrou que reamostragem aplicada antes da partição infla métricas de XGBoost no mesmo conjunto ULB, e Hayat e Magnier (2025) consolidaram quatro falhas sistêmicas da literatura do benchmark. A resposta da comunidade a essa crítica tem sido, até aqui, citá-la e ignorá-la: os trabalhos que a referenciam seguem reportando estado-da-arte no mesmo benchmark sem alterar protocolo.</w:t>
-      </w:r>
-    </w:p>
-    <w:p>
-      <w:pPr>
-        <w:pStyle w:val="BodyText"/>
-      </w:pPr>
-      <w:r>
-        <w:t xml:space="preserve">A segunda linhagem é a do ponto de operação e do custo. O limiar ótimo para F1 e sua relação com probabilidades calibradas foram formalizados por Lipton et al. (2014); King e Zeng (2001) já haviam mostrado que modelos logísticos subestimam eventos raros sem correção. A evidência contemporânea é convergente (para um panorama do campo, Chen et al., 2024): correções de desbalanceamento por reamostragem degradam a calibração sem ganho discriminativo (van den Goorbergh et al., 2022); sobreamostragem sintética não beneficia classificadores fortes, bastando ajustar o ponto de operação (Elor &amp; Averbuch-Elor, 2022); a calibração de limiar é a intervenção mais consistente entre 15 modelos e 30 conjuntos (Abdelhamid &amp; Desai, 2024); e amostras sintéticas de fraude geradas por CTGAN degradaram tanto modelos individuais quanto fusões no benchmark IEEE-CIS (Han &amp; Wu, 2026). No próprio conjunto ULB, Leevy et al. (2023) compararam otimização de limiar com e sem sub-amostragem aleatória — obtendo os melhores resultados sem a sub-amostragem —, e Ngoc Thanh Sang (2026) propôs exatamente o receituário aqui adotado — perda ponderada por custo, calibração de limiar e validação consciente de vazamento. Nenhum desses trabalhos, contudo, decompõe e compara o efeito-limiar contra o efeito-arquitetura com inferência pareada, nem publica o protocolo com testes, hashes e verificação de determinismo; é essa a lacuna que este estudo de caso preenche. A institucionalização da prática confirma sua maturidade: desde 2024 a biblioteca scikit-learn 1.5 (Pedregosa et al., 2011) expõe o ajuste pós-treino de limiar como API de primeira classe, TunedThresholdClassifierCV.</w:t>
-      </w:r>
-    </w:p>
-    <w:p>
-      <w:pPr>
-        <w:pStyle w:val="BodyText"/>
-      </w:pPr>
-      <w:r>
-        <w:t xml:space="preserve">A terceira linhagem explica por que o empate entre arquiteturas era esperável a priori. Grinsztajn et al. (2022) identificaram que redes neurais são aproximadamente invariantes a rotação, enquanto árvores exploram o alinhamento axial das variáveis originais — e as variáveis V1–V28 do conjunto ULB são componentes principais (PCA, na sigla em inglês), isto é, o resultado de uma rotação. Se a projeção PCA torna as classes aproximadamente separáveis por fronteira linear, modelos lineares e MLPs saturam o mesmo teto de sinal (Hastie et al., 2009). McElfresh et al. (2023) acrescentam, sobre 176 conjuntos tabulares, que ajuste leve de hiperparâmetros em árvores impulsionadas importa com frequência mais que a própria escolha entre redes neurais e árvores. Por fim, a instabilidade de treino de redes profundas está documentada por Bouthillier et al. (2021): fontes de variância rotineiramente ignoradas — amostragem dos dados, inicialização de pesos, escolha de hiperparâmetros — impactam marcadamente os resultados e distorcem a detecção de melhorias entre métodos; este estudo mede essa variância diretamente no caso em questão (Seção 6.3).</w:t>
-      </w:r>
-    </w:p>
-    <w:bookmarkEnd w:id="13"/>
-    <w:bookmarkStart w:id="17" w:name="dados"/>
-    <w:p>
-      <w:pPr>
-        <w:pStyle w:val="Heading2"/>
-      </w:pPr>
-      <w:r>
-        <w:t xml:space="preserve">3. Dados</w:t>
-      </w:r>
-    </w:p>
-    <w:p>
-      <w:pPr>
-        <w:pStyle w:val="FirstParagraph"/>
-      </w:pPr>
-      <w:r>
-        <w:t xml:space="preserve">O conjunto ULB/Worldline (Machine Learning Group da Université Libre de Bruxelles; Kaggle) contém 284.807 transações de dois dias de setembro de 2013, com 30 variáveis preditoras — 28 componentes principais anonimizados (V1–V28), o tempo decorrido (Time) e o valor (Amount) — e rótulo binário Class com 492 fraudes (prevalência de 0,173%; Figura 1) (Dal Pozzolo, 2015; ULB/Worldline, 2013). A cópia utilizada foi verificada contra o SHA-256 registrado na execução original do material precedente (76274b691b16a6c49d3f159c883398e03ccd6d1ee12d9d8ee38f4b4b98551a89), garantindo identidade bit a bit da cadeia de dados entre as duas execuções.</w:t>
-      </w:r>
-    </w:p>
-    <w:p>
-      <w:pPr>
-        <w:pStyle w:val="BodyText"/>
-      </w:pPr>
-      <w:r>
-        <w:rPr>
-          <w:b/>
-          <w:bCs/>
-        </w:rPr>
         <w:t xml:space="preserve">Figura 1</w:t>
       </w:r>
     </w:p>
@@ -313,20 +307,20 @@
       <w:r>
         <w:drawing>
           <wp:inline>
-            <wp:extent cx="4572000" cy="2926080"/>
+            <wp:extent cx="5029200" cy="3108960"/>
             <wp:effectExtent b="0" l="0" r="0" t="0"/>
-            <wp:docPr descr="" title="" id="15" name="Picture"/>
+            <wp:docPr descr="" title="" id="33" name="Picture"/>
             <a:graphic>
               <a:graphicData uri="http://schemas.openxmlformats.org/drawingml/2006/picture">
                 <pic:pic>
                   <pic:nvPicPr>
-                    <pic:cNvPr descr="../../output/figures/fig1_class_distribution.png" id="16" name="Picture"/>
+                    <pic:cNvPr descr="../../output/figures/fig1_class_distribution.png" id="34" name="Picture"/>
                     <pic:cNvPicPr>
                       <a:picLocks noChangeArrowheads="1" noChangeAspect="1"/>
                     </pic:cNvPicPr>
                   </pic:nvPicPr>
                   <pic:blipFill>
-                    <a:blip r:embed="rId14"/>
+                    <a:blip r:embed="rId32"/>
                     <a:stretch>
                       <a:fillRect/>
                     </a:stretch>
@@ -334,7 +328,7 @@
                   <pic:spPr bwMode="auto">
                     <a:xfrm>
                       <a:off x="0" y="0"/>
-                      <a:ext cx="4572000" cy="2926080"/>
+                      <a:ext cx="5029200" cy="3108960"/>
                     </a:xfrm>
                     <a:prstGeom prst="rect">
                       <a:avLst/>
@@ -361,8 +355,8 @@
         <w:t xml:space="preserve">O papel científico atribuído ao benchmark aqui é deliberadamente restrito. Como leaderboard, o conjunto está saturado e comprometido: métricas acima de 99% são sintoma de vazamento, não de avanço (Hayat &amp; Magnier, 2025; Kabane, 2024); a anonimização por PCA pode, no limite, preservar 99,9999% da variância e ainda assim destruir o sinal decisório (Tembine, 2026); e as suítes tabulares curadas modernas o excluem pelo desbalanceamento extremo. Como instrumento metodológico para decompor efeitos de protocolo — o uso feito neste artigo — ele permanece adequado, precisamente porque é o benchmark sobre o qual as conclusões enviesadas da literatura foram construídas.</w:t>
       </w:r>
     </w:p>
-    <w:bookmarkEnd w:id="17"/>
-    <w:bookmarkStart w:id="18" w:name="métodos"/>
+    <w:bookmarkEnd w:id="35"/>
+    <w:bookmarkStart w:id="36" w:name="métodos"/>
     <w:p>
       <w:pPr>
         <w:pStyle w:val="Heading2"/>
@@ -425,8 +419,8 @@
         <w:t xml:space="preserve">A seleção de limiares ocorre exclusivamente em validação, em dois regimes reportados separadamente. O regime de fidelidade reproduz a grade do material precedente, 99 pontos uniformes em [0,01; 0,99] — grade censurada à direita, pois o ótimo pode residir além de 0,99. O regime primário elimina a censura, avaliando todos os pontos de corte da curva precisão-revocação da validação. Para Autoencoder e Isolation Forest, o corte é selecionado sobre percentis (50 a 99,9) da pontuação em validação, como no material precedente. A inferência sobre o gap entre MLP e Regressão Logística usa bootstrap pareado de 10.000 réplicas sobre os índices do teste, reportando intervalos percentílicos de 95% para F1 de cada modelo, para a diferença pareada de F1 e para a diferença pareada de AUC-PR; esses intervalos capturam a variância de amostragem do teste condicional aos modelos treinados e limiares fixos — não a variância de treino, medida separadamente por 20 re-treinos do MLP com sementes 1–20 sobre partição e padronização fixas. A execução é determinística (sementes fixas, thread única, algoritmos determinísticos): duas execuções completas produziram resultados idênticos em todos os blocos, e todos os artefatos — código, configuração, resultados, tabelas e figuras — são registrados em manifesto com SHA-256 individual.</w:t>
       </w:r>
     </w:p>
-    <w:bookmarkEnd w:id="18"/>
-    <w:bookmarkStart w:id="19" w:name="protocolo-de-avaliação"/>
+    <w:bookmarkEnd w:id="36"/>
+    <w:bookmarkStart w:id="37" w:name="protocolo-de-avaliação"/>
     <w:p>
       <w:pPr>
         <w:pStyle w:val="Heading2"/>
@@ -443,8 +437,8 @@
         <w:t xml:space="preserve">A métrica primária é a área sob a curva precisão-revocação (AUC-PR), mais informativa que a ROC sob desbalanceamento severo porque ignora os verdadeiros negativos abundantes (Davis &amp; Goadrich, 2006; Saito &amp; Rehmsmeier, 2015); a ROC é reportada por tradição (Fawcett, 2006). O desempenho pontual usa F1 e Fβ com β=2 no limiar selecionado em validação — a ponderação da revocação sobre a precisão reflete o custo assimétrico do domínio, prática recorrente na literatura de fraude (Hernandez Aros et al., 2024) —, matrizes de confusão completas e acurácia apenas como ilustração de sua inutilidade no regime de classe rara (99,2% no limiar 0,5 coexistindo com precisão de 0,157). A interpretabilidade usa importância por permutação em validação (5 repetições, com desvio-padrão). A sensibilidade à prevalência é tratada analiticamente na Seção 6.5.</w:t>
       </w:r>
     </w:p>
-    <w:bookmarkEnd w:id="19"/>
-    <w:bookmarkStart w:id="44" w:name="resultados"/>
+    <w:bookmarkEnd w:id="37"/>
+    <w:bookmarkStart w:id="62" w:name="resultados"/>
     <w:p>
       <w:pPr>
         <w:pStyle w:val="Heading2"/>
@@ -494,18 +488,18 @@
           <wp:inline>
             <wp:extent cx="5029200" cy="3657600"/>
             <wp:effectExtent b="0" l="0" r="0" t="0"/>
-            <wp:docPr descr="" title="" id="21" name="Picture"/>
+            <wp:docPr descr="" title="" id="39" name="Picture"/>
             <a:graphic>
               <a:graphicData uri="http://schemas.openxmlformats.org/drawingml/2006/picture">
                 <pic:pic>
                   <pic:nvPicPr>
-                    <pic:cNvPr descr="../../output/figures/fig2_pr_curves_test.png" id="22" name="Picture"/>
+                    <pic:cNvPr descr="../../output/figures/fig2_pr_curves_test.png" id="40" name="Picture"/>
                     <pic:cNvPicPr>
                       <a:picLocks noChangeArrowheads="1" noChangeAspect="1"/>
                     </pic:cNvPicPr>
                   </pic:nvPicPr>
                   <pic:blipFill>
-                    <a:blip r:embed="rId20"/>
+                    <a:blip r:embed="rId38"/>
                     <a:stretch>
                       <a:fillRect/>
                     </a:stretch>
@@ -581,7 +575,7 @@
               <w:pStyle w:val="Compact"/>
             </w:pPr>
             <w:r>
-              <w:t xml:space="preserve">Modelo @ limiar</w:t>
+              <w:t xml:space="preserve">Modelo e limiar</w:t>
             </w:r>
           </w:p>
         </w:tc>
@@ -649,7 +643,7 @@
               <w:pStyle w:val="Compact"/>
             </w:pPr>
             <w:r>
-              <w:t xml:space="preserve">MLP @ 0,50 (default)</w:t>
+              <w:t xml:space="preserve">MLP, 0,50</w:t>
             </w:r>
           </w:p>
         </w:tc>
@@ -717,7 +711,7 @@
               <w:pStyle w:val="Compact"/>
             </w:pPr>
             <w:r>
-              <w:t xml:space="preserve">MLP @ 0,99 (grade censurada)</w:t>
+              <w:t xml:space="preserve">MLP, 0,99</w:t>
             </w:r>
           </w:p>
         </w:tc>
@@ -785,7 +779,7 @@
               <w:pStyle w:val="Compact"/>
             </w:pPr>
             <w:r>
-              <w:t xml:space="preserve">MLP @ τ*=0,9994 (primário)</w:t>
+              <w:t xml:space="preserve">MLP, τ*</w:t>
             </w:r>
           </w:p>
         </w:tc>
@@ -853,7 +847,7 @@
               <w:pStyle w:val="Compact"/>
             </w:pPr>
             <w:r>
-              <w:t xml:space="preserve">LR @ τ*≈1,0 (primário)</w:t>
+              <w:t xml:space="preserve">LR, τ*</w:t>
             </w:r>
           </w:p>
         </w:tc>
@@ -921,7 +915,7 @@
               <w:pStyle w:val="Compact"/>
             </w:pPr>
             <w:r>
-              <w:t xml:space="preserve">Autoencoder @ F1-ótimo</w:t>
+              <w:t xml:space="preserve">Autoencoder</w:t>
             </w:r>
           </w:p>
         </w:tc>
@@ -989,7 +983,7 @@
               <w:pStyle w:val="Compact"/>
             </w:pPr>
             <w:r>
-              <w:t xml:space="preserve">Isolation Forest @ F1-ótimo</w:t>
+              <w:t xml:space="preserve">Isolation Forest</w:t>
             </w:r>
           </w:p>
         </w:tc>
@@ -1050,7 +1044,25 @@
         </w:tc>
       </w:tr>
     </w:tbl>
-    <w:bookmarkStart w:id="29" w:name="o-efeito-do-ponto-de-operação"/>
+    <w:p>
+      <w:pPr>
+        <w:pStyle w:val="BodyText"/>
+      </w:pPr>
+      <w:r>
+        <w:rPr>
+          <w:i/>
+          <w:iCs/>
+        </w:rPr>
+        <w:t xml:space="preserve">Nota.</w:t>
+      </w:r>
+      <w:r>
+        <w:t xml:space="preserve"> </w:t>
+      </w:r>
+      <w:r>
+        <w:t xml:space="preserve">0,50 = limiar-padrão das bibliotecas; 0,99 = teto da grade censurada (fidelidade v3.2); τ* = ótimo de validação sem censura (MLP 0,9994; LR ≈1,0); Autoencoder e Isolation Forest no corte F1-ótimo de validação.</w:t>
+      </w:r>
+    </w:p>
+    <w:bookmarkStart w:id="47" w:name="o-efeito-do-ponto-de-operação"/>
     <w:p>
       <w:pPr>
         <w:pStyle w:val="Heading3"/>
@@ -1100,18 +1112,18 @@
           <wp:inline>
             <wp:extent cx="5029200" cy="3657600"/>
             <wp:effectExtent b="0" l="0" r="0" t="0"/>
-            <wp:docPr descr="" title="" id="24" name="Picture"/>
+            <wp:docPr descr="" title="" id="42" name="Picture"/>
             <a:graphic>
               <a:graphicData uri="http://schemas.openxmlformats.org/drawingml/2006/picture">
                 <pic:pic>
                   <pic:nvPicPr>
-                    <pic:cNvPr descr="../../output/figures/fig3_threshold_sweep.png" id="25" name="Picture"/>
+                    <pic:cNvPr descr="../../output/figures/fig3_threshold_sweep.png" id="43" name="Picture"/>
                     <pic:cNvPicPr>
                       <a:picLocks noChangeArrowheads="1" noChangeAspect="1"/>
                     </pic:cNvPicPr>
                   </pic:nvPicPr>
                   <pic:blipFill>
-                    <a:blip r:embed="rId23"/>
+                    <a:blip r:embed="rId41"/>
                     <a:stretch>
                       <a:fillRect/>
                     </a:stretch>
@@ -1175,20 +1187,20 @@
       <w:r>
         <w:drawing>
           <wp:inline>
-            <wp:extent cx="5334000" cy="2438400"/>
+            <wp:extent cx="5943600" cy="2717074"/>
             <wp:effectExtent b="0" l="0" r="0" t="0"/>
-            <wp:docPr descr="" title="" id="27" name="Picture"/>
+            <wp:docPr descr="" title="" id="45" name="Picture"/>
             <a:graphic>
               <a:graphicData uri="http://schemas.openxmlformats.org/drawingml/2006/picture">
                 <pic:pic>
                   <pic:nvPicPr>
-                    <pic:cNvPr descr="../../output/figures/fig4_confusion_shift.png" id="28" name="Picture"/>
+                    <pic:cNvPr descr="../../output/figures/fig4_confusion_shift.png" id="46" name="Picture"/>
                     <pic:cNvPicPr>
                       <a:picLocks noChangeArrowheads="1" noChangeAspect="1"/>
                     </pic:cNvPicPr>
                   </pic:nvPicPr>
                   <pic:blipFill>
-                    <a:blip r:embed="rId26"/>
+                    <a:blip r:embed="rId44"/>
                     <a:stretch>
                       <a:fillRect/>
                     </a:stretch>
@@ -1196,7 +1208,7 @@
                   <pic:spPr bwMode="auto">
                     <a:xfrm>
                       <a:off x="0" y="0"/>
-                      <a:ext cx="5334000" cy="2438400"/>
+                      <a:ext cx="5943600" cy="2717074"/>
                     </a:xfrm>
                     <a:prstGeom prst="rect">
                       <a:avLst/>
@@ -1221,8 +1233,8 @@
         <w:t xml:space="preserve">O Fβ=2, que pesa revocação sobre precisão, atinge 0,779 no teste no limiar correspondente. A comparação entre o swing de limiar e o gap entre arquiteturas exige uma ressalva de comensurabilidade: o primeiro corrige uma má configuração (o default 0,5 é um ponto operacional catastrófico sob reponderação de custo), enquanto o segundo compara alternativas ambas otimizadas. É exatamente essa a mensagem de engenharia: a correção barata e auditável precede — e excede em efeito, aqui por duas ordens de magnitude — a decisão cara de arquitetura.</w:t>
       </w:r>
     </w:p>
-    <w:bookmarkEnd w:id="29"/>
-    <w:bookmarkStart w:id="33" w:name="Xc02d3e2a94b1aced003c08d48f37645f0313521"/>
+    <w:bookmarkEnd w:id="47"/>
+    <w:bookmarkStart w:id="51" w:name="Xc02d3e2a94b1aced003c08d48f37645f0313521"/>
     <w:p>
       <w:pPr>
         <w:pStyle w:val="Heading3"/>
@@ -1280,18 +1292,18 @@
           <wp:inline>
             <wp:extent cx="5029200" cy="3291840"/>
             <wp:effectExtent b="0" l="0" r="0" t="0"/>
-            <wp:docPr descr="" title="" id="31" name="Picture"/>
+            <wp:docPr descr="" title="" id="49" name="Picture"/>
             <a:graphic>
               <a:graphicData uri="http://schemas.openxmlformats.org/drawingml/2006/picture">
                 <pic:pic>
                   <pic:nvPicPr>
-                    <pic:cNvPr descr="../../output/figures/fig7_bootstrap_delta.png" id="32" name="Picture"/>
+                    <pic:cNvPr descr="../../output/figures/fig7_bootstrap_delta.png" id="50" name="Picture"/>
                     <pic:cNvPicPr>
                       <a:picLocks noChangeArrowheads="1" noChangeAspect="1"/>
                     </pic:cNvPicPr>
                   </pic:nvPicPr>
                   <pic:blipFill>
-                    <a:blip r:embed="rId30"/>
+                    <a:blip r:embed="rId48"/>
                     <a:stretch>
                       <a:fillRect/>
                     </a:stretch>
@@ -1620,8 +1632,8 @@
         <w:t xml:space="preserve">. Um limite arbitrário de varredura, herdado sem exame, fabrica uma conclusão de arquitetura com aparência de rigor estatístico. Este é o resultado instrutivo central do estudo — um modo de falha previsível em retrospecto, porém rotineiramente herdado sem exame, dado que grades truncadas como [0,01; 0,99] são idiomáticas em tutoriais e códigos de referência: nem vazamento clássico nem acaso, mas uma micro-decisão de protocolo, basta para inverter a conclusão qualitativa de uma comparação de modelos.</w:t>
       </w:r>
     </w:p>
-    <w:bookmarkEnd w:id="33"/>
-    <w:bookmarkStart w:id="34" w:name="Xa10fb5b5c7ba9c13deb9641099c35782d746fc9"/>
+    <w:bookmarkEnd w:id="51"/>
+    <w:bookmarkStart w:id="52" w:name="Xa10fb5b5c7ba9c13deb9641099c35782d746fc9"/>
     <w:p>
       <w:pPr>
         <w:pStyle w:val="Heading3"/>
@@ -1638,8 +1650,8 @@
         <w:t xml:space="preserve">Vinte re-treinos do MLP (sementes 1–20; partição, padronização e protocolo fixos; limiar re-selecionado em validação por semente) produzem F1 de teste com média 0,814, desvio-padrão 0,016 e amplitude 0,7879–0,8429. A Regressão Logística, determinística, marca 0,8182 — dentro de meio desvio-padrão da média do MLP. O gap por semente varia de −0,030 a +0,025, e o MLP supera a LR em apenas 8 das 20 sementes. Ceteris paribus, re-treinar o mesmo modelo desloca o resultado mais do que trocá-lo pelo baseline linear — quantificação local do fenômeno que Bouthillier et al. (2021) documentaram em escala: fontes de variância ignoradas excedem os deltas publicados entre métodos. Registre-se ainda a observação inter-plataforma (n=2, ilustrativa): a mesma configuração com semente 42 produziu F1 de 0,747 no ambiente original (Colab, x86, multi-thread) e 0,789 na re-execução determinística local (ARM, thread única) — diferença de 0,042, novamente maior que o gap entre arquiteturas.</w:t>
       </w:r>
     </w:p>
-    <w:bookmarkEnd w:id="34"/>
-    <w:bookmarkStart w:id="35" w:name="detectores-não-supervisionados"/>
+    <w:bookmarkEnd w:id="52"/>
+    <w:bookmarkStart w:id="53" w:name="detectores-não-supervisionados"/>
     <w:p>
       <w:pPr>
         <w:pStyle w:val="Heading3"/>
@@ -1656,8 +1668,8 @@
         <w:t xml:space="preserve">Autoencoder e Isolation Forest ficam substancialmente abaixo dos supervisionados (F1 de 0,531 e 0,179 contra ~0,81), confirmando que, com rótulos disponíveis, o aprendizado supervisionado com reponderação domina a detecção por desvio estrutural (Liu et al., 2008; Pang et al., 2021). O Autoencoder exibe ainda instabilidade qualitativa entre execuções do mesmo protocolo: na execução original alcançou F1 de 0,215 com 300 falsos positivos (precisão 0,130); nesta, 0,531 com 9 falsos positivos (precisão 0,769) — modos de falha opostos, produzidos pela sensibilidade do corte percentil sobre a cauda do erro de reconstrução. Observação com n=2, reportada como alerta prático: limiares percentílicos sobre pontuações de reconstrução são frágeis por construção.</w:t>
       </w:r>
     </w:p>
-    <w:bookmarkEnd w:id="35"/>
-    <w:bookmarkStart w:id="39" w:name="Xbbed02c4ed0d82cc91bda2e82b51b383cf1a8a3"/>
+    <w:bookmarkEnd w:id="53"/>
+    <w:bookmarkStart w:id="57" w:name="Xbbed02c4ed0d82cc91bda2e82b51b383cf1a8a3"/>
     <w:p>
       <w:pPr>
         <w:pStyle w:val="Heading3"/>
@@ -1752,18 +1764,18 @@
           <wp:inline>
             <wp:extent cx="5029200" cy="3291840"/>
             <wp:effectExtent b="0" l="0" r="0" t="0"/>
-            <wp:docPr descr="" title="" id="37" name="Picture"/>
+            <wp:docPr descr="" title="" id="55" name="Picture"/>
             <a:graphic>
               <a:graphicData uri="http://schemas.openxmlformats.org/drawingml/2006/picture">
                 <pic:pic>
                   <pic:nvPicPr>
-                    <pic:cNvPr descr="../../output/figures/fig5_prior_shift.png" id="38" name="Picture"/>
+                    <pic:cNvPr descr="../../output/figures/fig5_prior_shift.png" id="56" name="Picture"/>
                     <pic:cNvPicPr>
                       <a:picLocks noChangeArrowheads="1" noChangeAspect="1"/>
                     </pic:cNvPicPr>
                   </pic:nvPicPr>
                   <pic:blipFill>
-                    <a:blip r:embed="rId36"/>
+                    <a:blip r:embed="rId54"/>
                     <a:stretch>
                       <a:fillRect/>
                     </a:stretch>
@@ -1790,8 +1802,8 @@
         </w:drawing>
       </w:r>
     </w:p>
-    <w:bookmarkEnd w:id="39"/>
-    <w:bookmarkStart w:id="43" w:name="importância-por-permutação"/>
+    <w:bookmarkEnd w:id="57"/>
+    <w:bookmarkStart w:id="61" w:name="importância-por-permutação"/>
     <w:p>
       <w:pPr>
         <w:pStyle w:val="Heading3"/>
@@ -1841,18 +1853,18 @@
           <wp:inline>
             <wp:extent cx="5029200" cy="4114800"/>
             <wp:effectExtent b="0" l="0" r="0" t="0"/>
-            <wp:docPr descr="" title="" id="41" name="Picture"/>
+            <wp:docPr descr="" title="" id="59" name="Picture"/>
             <a:graphic>
               <a:graphicData uri="http://schemas.openxmlformats.org/drawingml/2006/picture">
                 <pic:pic>
                   <pic:nvPicPr>
-                    <pic:cNvPr descr="../../output/figures/fig6_permutation_importance.png" id="42" name="Picture"/>
+                    <pic:cNvPr descr="../../output/figures/fig6_permutation_importance.png" id="60" name="Picture"/>
                     <pic:cNvPicPr>
                       <a:picLocks noChangeArrowheads="1" noChangeAspect="1"/>
                     </pic:cNvPicPr>
                   </pic:nvPicPr>
                   <pic:blipFill>
-                    <a:blip r:embed="rId40"/>
+                    <a:blip r:embed="rId58"/>
                     <a:stretch>
                       <a:fillRect/>
                     </a:stretch>
@@ -1879,9 +1891,9 @@
         </w:drawing>
       </w:r>
     </w:p>
-    <w:bookmarkEnd w:id="43"/>
-    <w:bookmarkEnd w:id="44"/>
-    <w:bookmarkStart w:id="45" w:name="discussão"/>
+    <w:bookmarkEnd w:id="61"/>
+    <w:bookmarkEnd w:id="62"/>
+    <w:bookmarkStart w:id="63" w:name="discussão"/>
     <w:p>
       <w:pPr>
         <w:pStyle w:val="Heading2"/>
@@ -1979,8 +1991,8 @@
         <w:t xml:space="preserve">após a remoção da censura de grade — não é um defeito narrativo: é a demonstração, em corpus próprio, de quão pouco protocolo basta para fabricar uma conclusão de arquitetura. A disciplina que desfez as conclusões espúrias não foi um modelo melhor, mas um protocolo melhor: testes de invariantes, hashes, determinismo verificado e validação adversarial da análise antes da redação.</w:t>
       </w:r>
     </w:p>
-    <w:bookmarkEnd w:id="45"/>
-    <w:bookmarkStart w:id="46" w:name="ameaças-à-validade-e-reprodutibilidade"/>
+    <w:bookmarkEnd w:id="63"/>
+    <w:bookmarkStart w:id="64" w:name="ameaças-à-validade-e-reprodutibilidade"/>
     <w:p>
       <w:pPr>
         <w:pStyle w:val="Heading2"/>
@@ -2017,8 +2029,8 @@
         <w:t xml:space="preserve">Sobre a reprodutibilidade: o pacote de replicação contém código, configuração declarativa, testes automatizados dos invariantes de protocolo (partições exatas, padronização só-treino, razão de reponderação, ausência de reamostragem sintética), resultados consolidados, tabelas, figuras em formato vetorial e manifesto de execução com SHA-256 de cada artefato e do conjunto de dados. Duas execuções completas independentes produziram todos os blocos de resultados bit-idênticos na mesma plataforma. O escopo da alegação é preciso: reprodutibilidade determinística de código→dados→resultados na plataforma documentada — não identidade numérica entre plataformas, cuja variação é, ela própria, um dos resultados (Seção 6.3).</w:t>
       </w:r>
     </w:p>
-    <w:bookmarkEnd w:id="46"/>
-    <w:bookmarkStart w:id="47" w:name="considerações-finais"/>
+    <w:bookmarkEnd w:id="64"/>
+    <w:bookmarkStart w:id="65" w:name="considerações-finais"/>
     <w:p>
       <w:pPr>
         <w:pStyle w:val="Heading2"/>
@@ -2043,8 +2055,13 @@
         <w:t xml:space="preserve">Direções futuras: (a) replicar a decomposição efeito-limiar × efeito-arquitetura em benchmark com partição temporal e maior cardinalidade positiva (IEEE-CIS), quantificando também a variância de seleção de limiar; (b) acoplar calibração pós-reponderação (temperature scaling sobre a perda ponderada) à derivação de limiar por custo esperado explícito, fechando o elo calibração-decisão-governança; (c) elevar o reporte de variância de treino (multi-semente) e a publicação de manifesto com hashes à condição de prática mínima em comparações de arquitetura na literatura de fraude.</w:t>
       </w:r>
     </w:p>
-    <w:bookmarkEnd w:id="47"/>
-    <w:bookmarkStart w:id="48" w:name="referências"/>
+    <w:p>
+      <w:r>
+        <w:br w:type="page"/>
+      </w:r>
+    </w:p>
+    <w:bookmarkEnd w:id="65"/>
+    <w:bookmarkStart w:id="66" w:name="referências"/>
     <w:p>
       <w:pPr>
         <w:pStyle w:val="Heading2"/>
@@ -2055,11 +2072,7 @@
     </w:p>
     <w:p>
       <w:pPr>
-        <w:pStyle w:val="Compact"/>
-        <w:numPr>
-          <w:ilvl w:val="0"/>
-          <w:numId w:val="1001"/>
-        </w:numPr>
+        <w:pStyle w:val="Bibliography"/>
       </w:pPr>
       <w:r>
         <w:t xml:space="preserve">Abdelhamid, M., &amp; Desai, A. (2024).</w:t>
@@ -2080,11 +2093,7 @@
     </w:p>
     <w:p>
       <w:pPr>
-        <w:pStyle w:val="Compact"/>
-        <w:numPr>
-          <w:ilvl w:val="0"/>
-          <w:numId w:val="1001"/>
-        </w:numPr>
+        <w:pStyle w:val="Bibliography"/>
       </w:pPr>
       <w:r>
         <w:t xml:space="preserve">Bishop, C. M. (2006).</w:t>
@@ -2105,11 +2114,7 @@
     </w:p>
     <w:p>
       <w:pPr>
-        <w:pStyle w:val="Compact"/>
-        <w:numPr>
-          <w:ilvl w:val="0"/>
-          <w:numId w:val="1001"/>
-        </w:numPr>
+        <w:pStyle w:val="Bibliography"/>
       </w:pPr>
       <w:r>
         <w:t xml:space="preserve">Boulesteix, A.-L., &amp; Strobl, C. (2009). Optimal classifier selection and negative bias in error rate estimation: An empirical study on high-dimensional prediction.</w:t>
@@ -2130,11 +2135,7 @@
     </w:p>
     <w:p>
       <w:pPr>
-        <w:pStyle w:val="Compact"/>
-        <w:numPr>
-          <w:ilvl w:val="0"/>
-          <w:numId w:val="1001"/>
-        </w:numPr>
+        <w:pStyle w:val="Bibliography"/>
       </w:pPr>
       <w:r>
         <w:t xml:space="preserve">Bouthillier, X., Delaunay, P., Bronzi, M., Trofimov, A., Nichyporuk, B., Szeto, J., Mohammadi Sepahvand, N., Raff, E., Madan, K., Voleti, V., Ebrahimi Kahou, S., Michalski, V., Arbel, T., Pal, C., Varoquaux, G., &amp; Vincent, P. (2021). Accounting for variance in machine learning benchmarks.</w:t>
@@ -2155,11 +2156,7 @@
     </w:p>
     <w:p>
       <w:pPr>
-        <w:pStyle w:val="Compact"/>
-        <w:numPr>
-          <w:ilvl w:val="0"/>
-          <w:numId w:val="1001"/>
-        </w:numPr>
+        <w:pStyle w:val="Bibliography"/>
       </w:pPr>
       <w:r>
         <w:t xml:space="preserve">Chawla, N. V., Bowyer, K. W., Hall, L. O., &amp; Kegelmeyer, W. P. (2002). SMOTE: Synthetic minority over-sampling technique.</w:t>
@@ -2180,11 +2177,7 @@
     </w:p>
     <w:p>
       <w:pPr>
-        <w:pStyle w:val="Compact"/>
-        <w:numPr>
-          <w:ilvl w:val="0"/>
-          <w:numId w:val="1001"/>
-        </w:numPr>
+        <w:pStyle w:val="Bibliography"/>
       </w:pPr>
       <w:r>
         <w:t xml:space="preserve">Chen, W., Yang, K., Yu, Z., Shi, Y., &amp; Chen, C. L. P. (2024). A survey on imbalanced learning: Latest research, applications and future directions.</w:t>
@@ -2205,11 +2198,7 @@
     </w:p>
     <w:p>
       <w:pPr>
-        <w:pStyle w:val="Compact"/>
-        <w:numPr>
-          <w:ilvl w:val="0"/>
-          <w:numId w:val="1001"/>
-        </w:numPr>
+        <w:pStyle w:val="Bibliography"/>
       </w:pPr>
       <w:r>
         <w:t xml:space="preserve">Cherif, A., Badhib, A., Ammar, H., Alshehri, S., Kalkatawi, M., &amp; Imine, A. (2023). Credit card fraud detection in the era of disruptive technologies: A systematic review.</w:t>
@@ -2230,11 +2219,7 @@
     </w:p>
     <w:p>
       <w:pPr>
-        <w:pStyle w:val="Compact"/>
-        <w:numPr>
-          <w:ilvl w:val="0"/>
-          <w:numId w:val="1001"/>
-        </w:numPr>
+        <w:pStyle w:val="Bibliography"/>
       </w:pPr>
       <w:r>
         <w:t xml:space="preserve">Dal Pozzolo, A. (2015).</w:t>
@@ -2258,11 +2243,7 @@
     </w:p>
     <w:p>
       <w:pPr>
-        <w:pStyle w:val="Compact"/>
-        <w:numPr>
-          <w:ilvl w:val="0"/>
-          <w:numId w:val="1001"/>
-        </w:numPr>
+        <w:pStyle w:val="Bibliography"/>
       </w:pPr>
       <w:r>
         <w:t xml:space="preserve">Dal Pozzolo, A., Boracchi, G., Caelen, O., Alippi, C., &amp; Bontempi, G. (2018). Credit card fraud detection: A realistic modeling and a novel learning strategy.</w:t>
@@ -2283,11 +2264,7 @@
     </w:p>
     <w:p>
       <w:pPr>
-        <w:pStyle w:val="Compact"/>
-        <w:numPr>
-          <w:ilvl w:val="0"/>
-          <w:numId w:val="1001"/>
-        </w:numPr>
+        <w:pStyle w:val="Bibliography"/>
       </w:pPr>
       <w:r>
         <w:t xml:space="preserve">Dal Pozzolo, A., Caelen, O., Johnson, R. A., &amp; Bontempi, G. (2015). Calibrating probability with undersampling for unbalanced classification.</w:t>
@@ -2311,11 +2288,7 @@
     </w:p>
     <w:p>
       <w:pPr>
-        <w:pStyle w:val="Compact"/>
-        <w:numPr>
-          <w:ilvl w:val="0"/>
-          <w:numId w:val="1001"/>
-        </w:numPr>
+        <w:pStyle w:val="Bibliography"/>
       </w:pPr>
       <w:r>
         <w:t xml:space="preserve">Davis, J., &amp; Goadrich, M. (2006). The relationship between precision-recall and ROC curves.</w:t>
@@ -2339,11 +2312,7 @@
     </w:p>
     <w:p>
       <w:pPr>
-        <w:pStyle w:val="Compact"/>
-        <w:numPr>
-          <w:ilvl w:val="0"/>
-          <w:numId w:val="1001"/>
-        </w:numPr>
+        <w:pStyle w:val="Bibliography"/>
       </w:pPr>
       <w:r>
         <w:t xml:space="preserve">Elor, Y., &amp; Averbuch-Elor, H. (2022).</w:t>
@@ -2367,11 +2336,7 @@
     </w:p>
     <w:p>
       <w:pPr>
-        <w:pStyle w:val="Compact"/>
-        <w:numPr>
-          <w:ilvl w:val="0"/>
-          <w:numId w:val="1001"/>
-        </w:numPr>
+        <w:pStyle w:val="Bibliography"/>
       </w:pPr>
       <w:r>
         <w:t xml:space="preserve">European Parliament and Council. (2024). Regulation (EU) 2024/1689 (Artificial Intelligence Act), Anexo III, ponto 5(b), e Recital 58.</w:t>
@@ -2392,11 +2357,7 @@
     </w:p>
     <w:p>
       <w:pPr>
-        <w:pStyle w:val="Compact"/>
-        <w:numPr>
-          <w:ilvl w:val="0"/>
-          <w:numId w:val="1001"/>
-        </w:numPr>
+        <w:pStyle w:val="Bibliography"/>
       </w:pPr>
       <w:r>
         <w:t xml:space="preserve">Fawcett, T. (2006). An introduction to ROC analysis.</w:t>
@@ -2417,11 +2378,7 @@
     </w:p>
     <w:p>
       <w:pPr>
-        <w:pStyle w:val="Compact"/>
-        <w:numPr>
-          <w:ilvl w:val="0"/>
-          <w:numId w:val="1001"/>
-        </w:numPr>
+        <w:pStyle w:val="Bibliography"/>
       </w:pPr>
       <w:r>
         <w:t xml:space="preserve">Flores, C. U. (2025).</w:t>
@@ -2445,11 +2402,7 @@
     </w:p>
     <w:p>
       <w:pPr>
-        <w:pStyle w:val="Compact"/>
-        <w:numPr>
-          <w:ilvl w:val="0"/>
-          <w:numId w:val="1001"/>
-        </w:numPr>
+        <w:pStyle w:val="Bibliography"/>
       </w:pPr>
       <w:r>
         <w:t xml:space="preserve">Goodfellow, I., Bengio, Y., &amp; Courville, A. (2016).</w:t>
@@ -2470,11 +2423,7 @@
     </w:p>
     <w:p>
       <w:pPr>
-        <w:pStyle w:val="Compact"/>
-        <w:numPr>
-          <w:ilvl w:val="0"/>
-          <w:numId w:val="1001"/>
-        </w:numPr>
+        <w:pStyle w:val="Bibliography"/>
       </w:pPr>
       <w:r>
         <w:t xml:space="preserve">Grinsztajn, L., Oyallon, E., &amp; Varoquaux, G. (2022). Why do tree-based models still outperform deep learning on typical tabular data?</w:t>
@@ -2495,11 +2444,7 @@
     </w:p>
     <w:p>
       <w:pPr>
-        <w:pStyle w:val="Compact"/>
-        <w:numPr>
-          <w:ilvl w:val="0"/>
-          <w:numId w:val="1001"/>
-        </w:numPr>
+        <w:pStyle w:val="Bibliography"/>
       </w:pPr>
       <w:r>
         <w:t xml:space="preserve">Guo, C., Pleiss, G., Sun, Y., &amp; Weinberger, K. Q. (2017). On calibration of modern neural networks.</w:t>
@@ -2520,11 +2465,7 @@
     </w:p>
     <w:p>
       <w:pPr>
-        <w:pStyle w:val="Compact"/>
-        <w:numPr>
-          <w:ilvl w:val="0"/>
-          <w:numId w:val="1001"/>
-        </w:numPr>
+        <w:pStyle w:val="Bibliography"/>
       </w:pPr>
       <w:r>
         <w:t xml:space="preserve">Han, X., &amp; Wu, C. (2026).</w:t>
@@ -2545,11 +2486,7 @@
     </w:p>
     <w:p>
       <w:pPr>
-        <w:pStyle w:val="Compact"/>
-        <w:numPr>
-          <w:ilvl w:val="0"/>
-          <w:numId w:val="1001"/>
-        </w:numPr>
+        <w:pStyle w:val="Bibliography"/>
       </w:pPr>
       <w:r>
         <w:t xml:space="preserve">Hand, D. J. (2006). Classifier technology and the illusion of progress.</w:t>
@@ -2570,11 +2507,7 @@
     </w:p>
     <w:p>
       <w:pPr>
-        <w:pStyle w:val="Compact"/>
-        <w:numPr>
-          <w:ilvl w:val="0"/>
-          <w:numId w:val="1001"/>
-        </w:numPr>
+        <w:pStyle w:val="Bibliography"/>
       </w:pPr>
       <w:r>
         <w:t xml:space="preserve">Hastie, T., Tibshirani, R., &amp; Friedman, J. (2009).</w:t>
@@ -2598,11 +2531,7 @@
     </w:p>
     <w:p>
       <w:pPr>
-        <w:pStyle w:val="Compact"/>
-        <w:numPr>
-          <w:ilvl w:val="0"/>
-          <w:numId w:val="1001"/>
-        </w:numPr>
+        <w:pStyle w:val="Bibliography"/>
       </w:pPr>
       <w:r>
         <w:t xml:space="preserve">Hayat, K., &amp; Magnier, B. (2025). Data leakage and deceptive performance: A critical examination of credit card fraud detection methodologies.</w:t>
@@ -2623,11 +2552,7 @@
     </w:p>
     <w:p>
       <w:pPr>
-        <w:pStyle w:val="Compact"/>
-        <w:numPr>
-          <w:ilvl w:val="0"/>
-          <w:numId w:val="1001"/>
-        </w:numPr>
+        <w:pStyle w:val="Bibliography"/>
       </w:pPr>
       <w:r>
         <w:t xml:space="preserve">Hernandez Aros, L., Bustamante Molano, L. X., Gutierrez-Portela, F., Moreno Hernandez, J. J., &amp; Rodríguez Barrero, M. S. (2024). Financial fraud detection through the application of machine learning techniques: A literature review.</w:t>
@@ -2648,11 +2573,7 @@
     </w:p>
     <w:p>
       <w:pPr>
-        <w:pStyle w:val="Compact"/>
-        <w:numPr>
-          <w:ilvl w:val="0"/>
-          <w:numId w:val="1001"/>
-        </w:numPr>
+        <w:pStyle w:val="Bibliography"/>
       </w:pPr>
       <w:r>
         <w:t xml:space="preserve">Kabane, S. (2024).</w:t>
@@ -2673,11 +2594,7 @@
     </w:p>
     <w:p>
       <w:pPr>
-        <w:pStyle w:val="Compact"/>
-        <w:numPr>
-          <w:ilvl w:val="0"/>
-          <w:numId w:val="1001"/>
-        </w:numPr>
+        <w:pStyle w:val="Bibliography"/>
       </w:pPr>
       <w:r>
         <w:t xml:space="preserve">Kapoor, S., &amp; Narayanan, A. (2023). Leakage and the reproducibility crisis in machine-learning-based science.</w:t>
@@ -2698,11 +2615,7 @@
     </w:p>
     <w:p>
       <w:pPr>
-        <w:pStyle w:val="Compact"/>
-        <w:numPr>
-          <w:ilvl w:val="0"/>
-          <w:numId w:val="1001"/>
-        </w:numPr>
+        <w:pStyle w:val="Bibliography"/>
       </w:pPr>
       <w:r>
         <w:t xml:space="preserve">King, G., &amp; Zeng, L. (2001). Logistic regression in rare events data.</w:t>
@@ -2723,11 +2636,7 @@
     </w:p>
     <w:p>
       <w:pPr>
-        <w:pStyle w:val="Compact"/>
-        <w:numPr>
-          <w:ilvl w:val="0"/>
-          <w:numId w:val="1001"/>
-        </w:numPr>
+        <w:pStyle w:val="Bibliography"/>
       </w:pPr>
       <w:r>
         <w:t xml:space="preserve">Leevy, J. L., Johnson, J. M., Hancock, J., &amp; Khoshgoftaar, T. M. (2023). Threshold optimization and random undersampling for imbalanced credit card data.</w:t>
@@ -2748,11 +2657,7 @@
     </w:p>
     <w:p>
       <w:pPr>
-        <w:pStyle w:val="Compact"/>
-        <w:numPr>
-          <w:ilvl w:val="0"/>
-          <w:numId w:val="1001"/>
-        </w:numPr>
+        <w:pStyle w:val="Bibliography"/>
       </w:pPr>
       <w:r>
         <w:t xml:space="preserve">Lipton, Z. C., Elkan, C., &amp; Narayanaswamy, B. (2014). Optimal thresholding of classifiers to maximize F1 measure.</w:t>
@@ -2773,11 +2678,7 @@
     </w:p>
     <w:p>
       <w:pPr>
-        <w:pStyle w:val="Compact"/>
-        <w:numPr>
-          <w:ilvl w:val="0"/>
-          <w:numId w:val="1001"/>
-        </w:numPr>
+        <w:pStyle w:val="Bibliography"/>
       </w:pPr>
       <w:r>
         <w:t xml:space="preserve">Liu, F. T., Ting, K. M., &amp; Zhou, Z.-H. (2008). Isolation Forest.</w:t>
@@ -2801,11 +2702,7 @@
     </w:p>
     <w:p>
       <w:pPr>
-        <w:pStyle w:val="Compact"/>
-        <w:numPr>
-          <w:ilvl w:val="0"/>
-          <w:numId w:val="1001"/>
-        </w:numPr>
+        <w:pStyle w:val="Bibliography"/>
       </w:pPr>
       <w:r>
         <w:t xml:space="preserve">McElfresh, D., Khandagale, S., Valverde, J., Prasad C, V., Feuer, B., Hegde, C., Ramakrishnan, G., Goldblum, M., &amp; White, C. (2023). When do neural nets outperform boosted trees on tabular data?</w:t>
@@ -2826,11 +2723,7 @@
     </w:p>
     <w:p>
       <w:pPr>
-        <w:pStyle w:val="Compact"/>
-        <w:numPr>
-          <w:ilvl w:val="0"/>
-          <w:numId w:val="1001"/>
-        </w:numPr>
+        <w:pStyle w:val="Bibliography"/>
       </w:pPr>
       <w:r>
         <w:t xml:space="preserve">Ngoc Thanh Sang, V. (2026). Enhancing credit card fraud detection under severe class imbalance using cost-sensitive learning and threshold optimization.</w:t>
@@ -2851,11 +2744,7 @@
     </w:p>
     <w:p>
       <w:pPr>
-        <w:pStyle w:val="Compact"/>
-        <w:numPr>
-          <w:ilvl w:val="0"/>
-          <w:numId w:val="1001"/>
-        </w:numPr>
+        <w:pStyle w:val="Bibliography"/>
       </w:pPr>
       <w:r>
         <w:t xml:space="preserve">Niculescu-Mizil, A., &amp; Caruana, R. (2005). Predicting good probabilities with supervised learning.</w:t>
@@ -2879,11 +2768,7 @@
     </w:p>
     <w:p>
       <w:pPr>
-        <w:pStyle w:val="Compact"/>
-        <w:numPr>
-          <w:ilvl w:val="0"/>
-          <w:numId w:val="1001"/>
-        </w:numPr>
+        <w:pStyle w:val="Bibliography"/>
       </w:pPr>
       <w:r>
         <w:t xml:space="preserve">Pang, G., Shen, C., Cao, L., &amp; van den Hengel, A. (2021). Deep learning for anomaly detection: A review.</w:t>
@@ -2904,11 +2789,7 @@
     </w:p>
     <w:p>
       <w:pPr>
-        <w:pStyle w:val="Compact"/>
-        <w:numPr>
-          <w:ilvl w:val="0"/>
-          <w:numId w:val="1001"/>
-        </w:numPr>
+        <w:pStyle w:val="Bibliography"/>
       </w:pPr>
       <w:r>
         <w:t xml:space="preserve">Pedregosa, F., Varoquaux, G., Gramfort, A., Michel, V., Thirion, B., Grisel, O., Blondel, M., Prettenhofer, P., Weiss, R., Dubourg, V., Vanderplas, J., Passos, A., Cournapeau, D., Brucher, M., Perrot, M., &amp; Duchesnay, É. (2011). Scikit-learn: Machine learning in Python.</w:t>
@@ -2929,11 +2810,7 @@
     </w:p>
     <w:p>
       <w:pPr>
-        <w:pStyle w:val="Compact"/>
-        <w:numPr>
-          <w:ilvl w:val="0"/>
-          <w:numId w:val="1001"/>
-        </w:numPr>
+        <w:pStyle w:val="Bibliography"/>
       </w:pPr>
       <w:r>
         <w:t xml:space="preserve">Saito, T., &amp; Rehmsmeier, M. (2015). The precision-recall plot is more informative than the ROC plot when evaluating binary classifiers on imbalanced datasets.</w:t>
@@ -2954,11 +2831,7 @@
     </w:p>
     <w:p>
       <w:pPr>
-        <w:pStyle w:val="Compact"/>
-        <w:numPr>
-          <w:ilvl w:val="0"/>
-          <w:numId w:val="1001"/>
-        </w:numPr>
+        <w:pStyle w:val="Bibliography"/>
       </w:pPr>
       <w:r>
         <w:t xml:space="preserve">Strobl, C., Boulesteix, A.-L., Kneib, T., Augustin, T., &amp; Zeileis, A. (2008). Conditional variable importance for random forests.</w:t>
@@ -2979,11 +2852,7 @@
     </w:p>
     <w:p>
       <w:pPr>
-        <w:pStyle w:val="Compact"/>
-        <w:numPr>
-          <w:ilvl w:val="0"/>
-          <w:numId w:val="1001"/>
-        </w:numPr>
+        <w:pStyle w:val="Bibliography"/>
       </w:pPr>
       <w:r>
         <w:t xml:space="preserve">Tembine, H. (2026).</w:t>
@@ -3004,11 +2873,7 @@
     </w:p>
     <w:p>
       <w:pPr>
-        <w:pStyle w:val="Compact"/>
-        <w:numPr>
-          <w:ilvl w:val="0"/>
-          <w:numId w:val="1001"/>
-        </w:numPr>
+        <w:pStyle w:val="Bibliography"/>
       </w:pPr>
       <w:r>
         <w:t xml:space="preserve">ULB/Worldline — Machine Learning Group, Université Libre de Bruxelles. (2013).</w:t>
@@ -3032,11 +2897,7 @@
     </w:p>
     <w:p>
       <w:pPr>
-        <w:pStyle w:val="Compact"/>
-        <w:numPr>
-          <w:ilvl w:val="0"/>
-          <w:numId w:val="1001"/>
-        </w:numPr>
+        <w:pStyle w:val="Bibliography"/>
       </w:pPr>
       <w:r>
         <w:t xml:space="preserve">van den Goorbergh, R., van Smeden, M., Timmerman, D., &amp; Van Calster, B. (2022). The harm of class imbalance corrections for risk prediction models: Illustration and simulation using logistic regression.</w:t>
@@ -3055,12 +2916,22 @@
         <w:t xml:space="preserve">(9), 1525–1534. https://doi.org/10.1093/jamia/ocac093</w:t>
       </w:r>
     </w:p>
-    <w:bookmarkEnd w:id="48"/>
-    <w:bookmarkEnd w:id="49"/>
+    <w:bookmarkEnd w:id="66"/>
     <w:sectPr>
+      <w:headerReference r:id="rId14" w:type="even"/>
+      <w:headerReference r:id="rId15" w:type="default"/>
+      <w:footerReference r:id="rId16" w:type="even"/>
+      <w:footerReference r:id="rId17" w:type="default"/>
+      <w:headerReference r:id="rId18" w:type="first"/>
+      <w:footerReference r:id="rId19" w:type="first"/>
       <w:footnotePr>
         <w:numRestart w:val="eachSect"/>
       </w:footnotePr>
+      <w:pgSz w:h="15840" w:w="12240"/>
+      <w:pgMar w:bottom="1440" w:footer="720" w:gutter="0" w:header="720" w:left="1440" w:right="1440" w:top="1440"/>
+      <w:cols w:space="720"/>
+      <w:titlePg/>
+      <w:docGrid w:linePitch="326"/>
     </w:sectPr>
   </w:body>
 </w:document>
@@ -3070,6 +2941,36 @@
 <w:comments xmlns:w="http://schemas.openxmlformats.org/wordprocessingml/2006/main" xmlns:m="http://schemas.openxmlformats.org/officeDocument/2006/math" xmlns:r="http://schemas.openxmlformats.org/officeDocument/2006/relationships" xmlns:o="urn:schemas-microsoft-com:office:office" xmlns:v="urn:schemas-microsoft-com:vml" xmlns:w10="urn:schemas-microsoft-com:office:word" xmlns:a="http://schemas.openxmlformats.org/drawingml/2006/main" xmlns:pic="http://schemas.openxmlformats.org/drawingml/2006/picture" xmlns:wp="http://schemas.openxmlformats.org/drawingml/2006/wordprocessingDrawing"/>
 </file>
 
+<file path=word/footer1.xml><?xml version="1.0" encoding="utf-8"?>
+<w:ftr xmlns:wpc="http://schemas.microsoft.com/office/word/2010/wordprocessingCanvas" xmlns:cx="http://schemas.microsoft.com/office/drawing/2014/chartex" xmlns:cx1="http://schemas.microsoft.com/office/drawing/2015/9/8/chartex" xmlns:cx2="http://schemas.microsoft.com/office/drawing/2015/10/21/chartex" xmlns:cx3="http://schemas.microsoft.com/office/drawing/2016/5/9/chartex" xmlns:cx4="http://schemas.microsoft.com/office/drawing/2016/5/10/chartex" xmlns:cx5="http://schemas.microsoft.com/office/drawing/2016/5/11/chartex" xmlns:cx6="http://schemas.microsoft.com/office/drawing/2016/5/12/chartex" xmlns:cx7="http://schemas.microsoft.com/office/drawing/2016/5/13/chartex" xmlns:cx8="http://schemas.microsoft.com/office/drawing/2016/5/14/chartex" xmlns:mc="http://schemas.openxmlformats.org/markup-compatibility/2006" xmlns:m="http://schemas.openxmlformats.org/officeDocument/2006/math" xmlns:aink="http://schemas.microsoft.com/office/drawing/2016/ink" xmlns:am3d="http://schemas.microsoft.com/office/drawing/2017/model3d" xmlns:oel="http://schemas.microsoft.com/office/2019/extlst" xmlns:r="http://schemas.openxmlformats.org/officeDocument/2006/relationships" xmlns:wp14="http://schemas.microsoft.com/office/word/2010/wordprocessingDrawing" xmlns:wp="http://schemas.openxmlformats.org/drawingml/2006/wordprocessingDrawing" xmlns:wpg="http://schemas.microsoft.com/office/word/2010/wordprocessingGroup" xmlns:wpi="http://schemas.microsoft.com/office/word/2010/wordprocessingInk" xmlns:wps="http://schemas.microsoft.com/office/word/2010/wordprocessingShape" xmlns:o="urn:schemas-microsoft-com:office:office" xmlns:v="urn:schemas-microsoft-com:vml" xmlns:w10="urn:schemas-microsoft-com:office:word" xmlns:w="http://schemas.openxmlformats.org/wordprocessingml/2006/main" xmlns:w14="http://schemas.microsoft.com/office/word/2010/wordml" xmlns:w15="http://schemas.microsoft.com/office/word/2012/wordml" xmlns:w16cex="http://schemas.microsoft.com/office/word/2018/wordml/cex" xmlns:w16cid="http://schemas.microsoft.com/office/word/2016/wordml/cid" xmlns:w16="http://schemas.microsoft.com/office/word/2018/wordml" xmlns:w16sdtdh="http://schemas.microsoft.com/office/word/2020/wordml/sdtdatahash" xmlns:w16sdtfl="http://schemas.microsoft.com/office/word/2024/wordml/sdtformatlock" xmlns:w16se="http://schemas.microsoft.com/office/word/2015/wordml/symex" xmlns:w16du="http://schemas.microsoft.com/office/word/2023/wordml/word16du" xmlns:wne="http://schemas.microsoft.com/office/word/2006/wordml" mc:Ignorable="w14 w15 w16se w16cid w16 w16cex w16sdtdh w16sdtfl w16du wp14">
+  <w:p>
+    <w:pPr>
+      <w:pStyle w:val="Footer"/>
+    </w:pPr>
+  </w:p>
+</w:ftr>
+</file>
+
+<file path=word/footer2.xml><?xml version="1.0" encoding="utf-8"?>
+<w:ftr xmlns:wpc="http://schemas.microsoft.com/office/word/2010/wordprocessingCanvas" xmlns:cx="http://schemas.microsoft.com/office/drawing/2014/chartex" xmlns:cx1="http://schemas.microsoft.com/office/drawing/2015/9/8/chartex" xmlns:cx2="http://schemas.microsoft.com/office/drawing/2015/10/21/chartex" xmlns:cx3="http://schemas.microsoft.com/office/drawing/2016/5/9/chartex" xmlns:cx4="http://schemas.microsoft.com/office/drawing/2016/5/10/chartex" xmlns:cx5="http://schemas.microsoft.com/office/drawing/2016/5/11/chartex" xmlns:cx6="http://schemas.microsoft.com/office/drawing/2016/5/12/chartex" xmlns:cx7="http://schemas.microsoft.com/office/drawing/2016/5/13/chartex" xmlns:cx8="http://schemas.microsoft.com/office/drawing/2016/5/14/chartex" xmlns:mc="http://schemas.openxmlformats.org/markup-compatibility/2006" xmlns:m="http://schemas.openxmlformats.org/officeDocument/2006/math" xmlns:aink="http://schemas.microsoft.com/office/drawing/2016/ink" xmlns:am3d="http://schemas.microsoft.com/office/drawing/2017/model3d" xmlns:oel="http://schemas.microsoft.com/office/2019/extlst" xmlns:r="http://schemas.openxmlformats.org/officeDocument/2006/relationships" xmlns:wp14="http://schemas.microsoft.com/office/word/2010/wordprocessingDrawing" xmlns:wp="http://schemas.openxmlformats.org/drawingml/2006/wordprocessingDrawing" xmlns:wpg="http://schemas.microsoft.com/office/word/2010/wordprocessingGroup" xmlns:wpi="http://schemas.microsoft.com/office/word/2010/wordprocessingInk" xmlns:wps="http://schemas.microsoft.com/office/word/2010/wordprocessingShape" xmlns:o="urn:schemas-microsoft-com:office:office" xmlns:v="urn:schemas-microsoft-com:vml" xmlns:w10="urn:schemas-microsoft-com:office:word" xmlns:w="http://schemas.openxmlformats.org/wordprocessingml/2006/main" xmlns:w14="http://schemas.microsoft.com/office/word/2010/wordml" xmlns:w15="http://schemas.microsoft.com/office/word/2012/wordml" xmlns:w16cex="http://schemas.microsoft.com/office/word/2018/wordml/cex" xmlns:w16cid="http://schemas.microsoft.com/office/word/2016/wordml/cid" xmlns:w16="http://schemas.microsoft.com/office/word/2018/wordml" xmlns:w16sdtdh="http://schemas.microsoft.com/office/word/2020/wordml/sdtdatahash" xmlns:w16sdtfl="http://schemas.microsoft.com/office/word/2024/wordml/sdtformatlock" xmlns:w16se="http://schemas.microsoft.com/office/word/2015/wordml/symex" xmlns:w16du="http://schemas.microsoft.com/office/word/2023/wordml/word16du" xmlns:wne="http://schemas.microsoft.com/office/word/2006/wordml" mc:Ignorable="w14 w15 w16se w16cid w16 w16cex w16sdtdh w16sdtfl w16du wp14">
+  <w:p>
+    <w:pPr>
+      <w:pStyle w:val="Footer"/>
+    </w:pPr>
+  </w:p>
+</w:ftr>
+</file>
+
+<file path=word/footer3.xml><?xml version="1.0" encoding="utf-8"?>
+<w:ftr xmlns:wpc="http://schemas.microsoft.com/office/word/2010/wordprocessingCanvas" xmlns:cx="http://schemas.microsoft.com/office/drawing/2014/chartex" xmlns:cx1="http://schemas.microsoft.com/office/drawing/2015/9/8/chartex" xmlns:cx2="http://schemas.microsoft.com/office/drawing/2015/10/21/chartex" xmlns:cx3="http://schemas.microsoft.com/office/drawing/2016/5/9/chartex" xmlns:cx4="http://schemas.microsoft.com/office/drawing/2016/5/10/chartex" xmlns:cx5="http://schemas.microsoft.com/office/drawing/2016/5/11/chartex" xmlns:cx6="http://schemas.microsoft.com/office/drawing/2016/5/12/chartex" xmlns:cx7="http://schemas.microsoft.com/office/drawing/2016/5/13/chartex" xmlns:cx8="http://schemas.microsoft.com/office/drawing/2016/5/14/chartex" xmlns:mc="http://schemas.openxmlformats.org/markup-compatibility/2006" xmlns:m="http://schemas.openxmlformats.org/officeDocument/2006/math" xmlns:aink="http://schemas.microsoft.com/office/drawing/2016/ink" xmlns:am3d="http://schemas.microsoft.com/office/drawing/2017/model3d" xmlns:oel="http://schemas.microsoft.com/office/2019/extlst" xmlns:r="http://schemas.openxmlformats.org/officeDocument/2006/relationships" xmlns:wp14="http://schemas.microsoft.com/office/word/2010/wordprocessingDrawing" xmlns:wp="http://schemas.openxmlformats.org/drawingml/2006/wordprocessingDrawing" xmlns:wpg="http://schemas.microsoft.com/office/word/2010/wordprocessingGroup" xmlns:wpi="http://schemas.microsoft.com/office/word/2010/wordprocessingInk" xmlns:wps="http://schemas.microsoft.com/office/word/2010/wordprocessingShape" xmlns:o="urn:schemas-microsoft-com:office:office" xmlns:v="urn:schemas-microsoft-com:vml" xmlns:w10="urn:schemas-microsoft-com:office:word" xmlns:w="http://schemas.openxmlformats.org/wordprocessingml/2006/main" xmlns:w14="http://schemas.microsoft.com/office/word/2010/wordml" xmlns:w15="http://schemas.microsoft.com/office/word/2012/wordml" xmlns:w16cex="http://schemas.microsoft.com/office/word/2018/wordml/cex" xmlns:w16cid="http://schemas.microsoft.com/office/word/2016/wordml/cid" xmlns:w16="http://schemas.microsoft.com/office/word/2018/wordml" xmlns:w16sdtdh="http://schemas.microsoft.com/office/word/2020/wordml/sdtdatahash" xmlns:w16sdtfl="http://schemas.microsoft.com/office/word/2024/wordml/sdtformatlock" xmlns:w16se="http://schemas.microsoft.com/office/word/2015/wordml/symex" xmlns:w16du="http://schemas.microsoft.com/office/word/2023/wordml/word16du" xmlns:wne="http://schemas.microsoft.com/office/word/2006/wordml" mc:Ignorable="w14 w15 w16se w16cid w16 w16cex w16sdtdh w16sdtfl w16du wp14">
+  <w:p>
+    <w:pPr>
+      <w:pStyle w:val="Footer"/>
+    </w:pPr>
+  </w:p>
+</w:ftr>
+</file>
+
 <file path=word/footnotes.xml><?xml version="1.0" encoding="utf-8"?>
 <w:footnotes xmlns:w="http://schemas.openxmlformats.org/wordprocessingml/2006/main" xmlns:m="http://schemas.openxmlformats.org/officeDocument/2006/math" xmlns:r="http://schemas.openxmlformats.org/officeDocument/2006/relationships" xmlns:o="urn:schemas-microsoft-com:office:office" xmlns:v="urn:schemas-microsoft-com:vml" xmlns:w10="urn:schemas-microsoft-com:office:word" xmlns:a="http://schemas.openxmlformats.org/drawingml/2006/main" xmlns:pic="http://schemas.openxmlformats.org/drawingml/2006/picture" xmlns:wp="http://schemas.openxmlformats.org/drawingml/2006/wordprocessingDrawing">
   <w:footnote w:type="continuationSeparator" w:id="0">
@@ -3089,8 +2990,133 @@
 </w:footnotes>
 </file>
 
+<file path=word/header1.xml><?xml version="1.0" encoding="utf-8"?>
+<w:hdr xmlns:wpc="http://schemas.microsoft.com/office/word/2010/wordprocessingCanvas" xmlns:cx="http://schemas.microsoft.com/office/drawing/2014/chartex" xmlns:cx1="http://schemas.microsoft.com/office/drawing/2015/9/8/chartex" xmlns:cx2="http://schemas.microsoft.com/office/drawing/2015/10/21/chartex" xmlns:cx3="http://schemas.microsoft.com/office/drawing/2016/5/9/chartex" xmlns:cx4="http://schemas.microsoft.com/office/drawing/2016/5/10/chartex" xmlns:cx5="http://schemas.microsoft.com/office/drawing/2016/5/11/chartex" xmlns:cx6="http://schemas.microsoft.com/office/drawing/2016/5/12/chartex" xmlns:cx7="http://schemas.microsoft.com/office/drawing/2016/5/13/chartex" xmlns:cx8="http://schemas.microsoft.com/office/drawing/2016/5/14/chartex" xmlns:mc="http://schemas.openxmlformats.org/markup-compatibility/2006" xmlns:m="http://schemas.openxmlformats.org/officeDocument/2006/math" xmlns:aink="http://schemas.microsoft.com/office/drawing/2016/ink" xmlns:am3d="http://schemas.microsoft.com/office/drawing/2017/model3d" xmlns:oel="http://schemas.microsoft.com/office/2019/extlst" xmlns:r="http://schemas.openxmlformats.org/officeDocument/2006/relationships" xmlns:wp14="http://schemas.microsoft.com/office/word/2010/wordprocessingDrawing" xmlns:wp="http://schemas.openxmlformats.org/drawingml/2006/wordprocessingDrawing" xmlns:wpg="http://schemas.microsoft.com/office/word/2010/wordprocessingGroup" xmlns:wpi="http://schemas.microsoft.com/office/word/2010/wordprocessingInk" xmlns:wps="http://schemas.microsoft.com/office/word/2010/wordprocessingShape" xmlns:o="urn:schemas-microsoft-com:office:office" xmlns:v="urn:schemas-microsoft-com:vml" xmlns:w10="urn:schemas-microsoft-com:office:word" xmlns:w="http://schemas.openxmlformats.org/wordprocessingml/2006/main" xmlns:w14="http://schemas.microsoft.com/office/word/2010/wordml" xmlns:w15="http://schemas.microsoft.com/office/word/2012/wordml" xmlns:w16cex="http://schemas.microsoft.com/office/word/2018/wordml/cex" xmlns:w16cid="http://schemas.microsoft.com/office/word/2016/wordml/cid" xmlns:w16="http://schemas.microsoft.com/office/word/2018/wordml" xmlns:w16sdtdh="http://schemas.microsoft.com/office/word/2020/wordml/sdtdatahash" xmlns:w16sdtfl="http://schemas.microsoft.com/office/word/2024/wordml/sdtformatlock" xmlns:w16se="http://schemas.microsoft.com/office/word/2015/wordml/symex" xmlns:w16du="http://schemas.microsoft.com/office/word/2023/wordml/word16du" xmlns:wne="http://schemas.microsoft.com/office/word/2006/wordml" mc:Ignorable="w14 w15 w16se w16cid w16 w16cex w16sdtdh w16sdtfl w16du wp14">
+  <w:p>
+    <w:pPr>
+      <w:pStyle w:val="Header"/>
+    </w:pPr>
+  </w:p>
+</w:hdr>
+</file>
+
+<file path=word/header2.xml><?xml version="1.0" encoding="utf-8"?>
+<w:hdr xmlns:wpc="http://schemas.microsoft.com/office/word/2010/wordprocessingCanvas" xmlns:cx="http://schemas.microsoft.com/office/drawing/2014/chartex" xmlns:cx1="http://schemas.microsoft.com/office/drawing/2015/9/8/chartex" xmlns:cx2="http://schemas.microsoft.com/office/drawing/2015/10/21/chartex" xmlns:cx3="http://schemas.microsoft.com/office/drawing/2016/5/9/chartex" xmlns:cx4="http://schemas.microsoft.com/office/drawing/2016/5/10/chartex" xmlns:cx5="http://schemas.microsoft.com/office/drawing/2016/5/11/chartex" xmlns:cx6="http://schemas.microsoft.com/office/drawing/2016/5/12/chartex" xmlns:cx7="http://schemas.microsoft.com/office/drawing/2016/5/13/chartex" xmlns:cx8="http://schemas.microsoft.com/office/drawing/2016/5/14/chartex" xmlns:mc="http://schemas.openxmlformats.org/markup-compatibility/2006" xmlns:m="http://schemas.openxmlformats.org/officeDocument/2006/math" xmlns:aink="http://schemas.microsoft.com/office/drawing/2016/ink" xmlns:am3d="http://schemas.microsoft.com/office/drawing/2017/model3d" xmlns:oel="http://schemas.microsoft.com/office/2019/extlst" xmlns:r="http://schemas.openxmlformats.org/officeDocument/2006/relationships" xmlns:wp14="http://schemas.microsoft.com/office/word/2010/wordprocessingDrawing" xmlns:wp="http://schemas.openxmlformats.org/drawingml/2006/wordprocessingDrawing" xmlns:wpg="http://schemas.microsoft.com/office/word/2010/wordprocessingGroup" xmlns:wpi="http://schemas.microsoft.com/office/word/2010/wordprocessingInk" xmlns:wps="http://schemas.microsoft.com/office/word/2010/wordprocessingShape" xmlns:o="urn:schemas-microsoft-com:office:office" xmlns:v="urn:schemas-microsoft-com:vml" xmlns:w10="urn:schemas-microsoft-com:office:word" xmlns:w="http://schemas.openxmlformats.org/wordprocessingml/2006/main" xmlns:w14="http://schemas.microsoft.com/office/word/2010/wordml" xmlns:w15="http://schemas.microsoft.com/office/word/2012/wordml" xmlns:w16cex="http://schemas.microsoft.com/office/word/2018/wordml/cex" xmlns:w16cid="http://schemas.microsoft.com/office/word/2016/wordml/cid" xmlns:w16="http://schemas.microsoft.com/office/word/2018/wordml" xmlns:w16sdtdh="http://schemas.microsoft.com/office/word/2020/wordml/sdtdatahash" xmlns:w16sdtfl="http://schemas.microsoft.com/office/word/2024/wordml/sdtformatlock" xmlns:w16se="http://schemas.microsoft.com/office/word/2015/wordml/symex" xmlns:w16du="http://schemas.microsoft.com/office/word/2023/wordml/word16du" xmlns:wne="http://schemas.microsoft.com/office/word/2006/wordml" mc:Ignorable="w14 w15 w16se w16cid w16 w16cex w16sdtdh w16sdtfl w16du wp14">
+  <w:p>
+    <w:pPr>
+      <w:jc w:val="right"/>
+    </w:pPr>
+    <w:r>
+      <w:fldChar w:fldCharType="begin"/>
+    </w:r>
+    <w:r>
+      <w:instrText>PAGE</w:instrText>
+    </w:r>
+    <w:r>
+      <w:fldChar w:fldCharType="separate"/>
+    </w:r>
+    <w:r>
+      <w:rPr>
+        <w:noProof/>
+      </w:rPr>
+      <w:t>1</w:t>
+    </w:r>
+    <w:r>
+      <w:fldChar w:fldCharType="end"/>
+    </w:r>
+  </w:p>
+</w:hdr>
+</file>
+
+<file path=word/header3.xml><?xml version="1.0" encoding="utf-8"?>
+<w:hdr xmlns:wpc="http://schemas.microsoft.com/office/word/2010/wordprocessingCanvas" xmlns:cx="http://schemas.microsoft.com/office/drawing/2014/chartex" xmlns:cx1="http://schemas.microsoft.com/office/drawing/2015/9/8/chartex" xmlns:cx2="http://schemas.microsoft.com/office/drawing/2015/10/21/chartex" xmlns:cx3="http://schemas.microsoft.com/office/drawing/2016/5/9/chartex" xmlns:cx4="http://schemas.microsoft.com/office/drawing/2016/5/10/chartex" xmlns:cx5="http://schemas.microsoft.com/office/drawing/2016/5/11/chartex" xmlns:cx6="http://schemas.microsoft.com/office/drawing/2016/5/12/chartex" xmlns:cx7="http://schemas.microsoft.com/office/drawing/2016/5/13/chartex" xmlns:cx8="http://schemas.microsoft.com/office/drawing/2016/5/14/chartex" xmlns:mc="http://schemas.openxmlformats.org/markup-compatibility/2006" xmlns:m="http://schemas.openxmlformats.org/officeDocument/2006/math" xmlns:aink="http://schemas.microsoft.com/office/drawing/2016/ink" xmlns:am3d="http://schemas.microsoft.com/office/drawing/2017/model3d" xmlns:oel="http://schemas.microsoft.com/office/2019/extlst" xmlns:r="http://schemas.openxmlformats.org/officeDocument/2006/relationships" xmlns:wp14="http://schemas.microsoft.com/office/word/2010/wordprocessingDrawing" xmlns:wp="http://schemas.openxmlformats.org/drawingml/2006/wordprocessingDrawing" xmlns:wpg="http://schemas.microsoft.com/office/word/2010/wordprocessingGroup" xmlns:wpi="http://schemas.microsoft.com/office/word/2010/wordprocessingInk" xmlns:wps="http://schemas.microsoft.com/office/word/2010/wordprocessingShape" xmlns:o="urn:schemas-microsoft-com:office:office" xmlns:v="urn:schemas-microsoft-com:vml" xmlns:w10="urn:schemas-microsoft-com:office:word" xmlns:w="http://schemas.openxmlformats.org/wordprocessingml/2006/main" xmlns:w14="http://schemas.microsoft.com/office/word/2010/wordml" xmlns:w15="http://schemas.microsoft.com/office/word/2012/wordml" xmlns:w16cex="http://schemas.microsoft.com/office/word/2018/wordml/cex" xmlns:w16cid="http://schemas.microsoft.com/office/word/2016/wordml/cid" xmlns:w16="http://schemas.microsoft.com/office/word/2018/wordml" xmlns:w16sdtdh="http://schemas.microsoft.com/office/word/2020/wordml/sdtdatahash" xmlns:w16sdtfl="http://schemas.microsoft.com/office/word/2024/wordml/sdtformatlock" xmlns:w16se="http://schemas.microsoft.com/office/word/2015/wordml/symex" xmlns:w16du="http://schemas.microsoft.com/office/word/2023/wordml/word16du" xmlns:wne="http://schemas.microsoft.com/office/word/2006/wordml" mc:Ignorable="w14 w15 w16se w16cid w16 w16cex w16sdtdh w16sdtfl w16du wp14">
+  <w:p>
+    <w:pPr>
+      <w:pStyle w:val="Header"/>
+    </w:pPr>
+  </w:p>
+</w:hdr>
+</file>
+
 <file path=word/numbering.xml><?xml version="1.0" encoding="utf-8"?>
-<w:numbering xmlns:w="http://schemas.openxmlformats.org/wordprocessingml/2006/main">
+<w:numbering xmlns:aink="http://schemas.microsoft.com/office/drawing/2016/ink" xmlns:am3d="http://schemas.microsoft.com/office/drawing/2017/model3d" xmlns:cx="http://schemas.microsoft.com/office/drawing/2014/chartex" xmlns:cx1="http://schemas.microsoft.com/office/drawing/2015/9/8/chartex" xmlns:cx2="http://schemas.microsoft.com/office/drawing/2015/10/21/chartex" xmlns:cx3="http://schemas.microsoft.com/office/drawing/2016/5/9/chartex" xmlns:cx4="http://schemas.microsoft.com/office/drawing/2016/5/10/chartex" xmlns:cx5="http://schemas.microsoft.com/office/drawing/2016/5/11/chartex" xmlns:cx6="http://schemas.microsoft.com/office/drawing/2016/5/12/chartex" xmlns:cx7="http://schemas.microsoft.com/office/drawing/2016/5/13/chartex" xmlns:cx8="http://schemas.microsoft.com/office/drawing/2016/5/14/chartex" xmlns:m="http://schemas.openxmlformats.org/officeDocument/2006/math" xmlns:mc="http://schemas.openxmlformats.org/markup-compatibility/2006" xmlns:o="urn:schemas-microsoft-com:office:office" xmlns:oel="http://schemas.microsoft.com/office/2019/extlst" xmlns:r="http://schemas.openxmlformats.org/officeDocument/2006/relationships" xmlns:v="urn:schemas-microsoft-com:vml" xmlns:w="http://schemas.openxmlformats.org/wordprocessingml/2006/main" xmlns:w10="urn:schemas-microsoft-com:office:word" xmlns:w14="http://schemas.microsoft.com/office/word/2010/wordml" xmlns:w15="http://schemas.microsoft.com/office/word/2012/wordml" xmlns:w16="http://schemas.microsoft.com/office/word/2018/wordml" xmlns:w16cex="http://schemas.microsoft.com/office/word/2018/wordml/cex" xmlns:w16cid="http://schemas.microsoft.com/office/word/2016/wordml/cid" xmlns:w16du="http://schemas.microsoft.com/office/word/2023/wordml/word16du" xmlns:w16sdtdh="http://schemas.microsoft.com/office/word/2020/wordml/sdtdatahash" xmlns:w16sdtfl="http://schemas.microsoft.com/office/word/2024/wordml/sdtformatlock" xmlns:w16se="http://schemas.microsoft.com/office/word/2015/wordml/symex" xmlns:wne="http://schemas.microsoft.com/office/word/2006/wordml" xmlns:wp="http://schemas.openxmlformats.org/drawingml/2006/wordprocessingDrawing" xmlns:wp14="http://schemas.microsoft.com/office/word/2010/wordprocessingDrawing" xmlns:wpc="http://schemas.microsoft.com/office/word/2010/wordprocessingCanvas" xmlns:wpg="http://schemas.microsoft.com/office/word/2010/wordprocessingGroup" xmlns:wpi="http://schemas.microsoft.com/office/word/2010/wordprocessingInk" xmlns:wps="http://schemas.microsoft.com/office/word/2010/wordprocessingShape" mc:Ignorable="w14 w15 w16se w16cid w16 w16cex w16sdtdh w16sdtfl w16du wp14">
+  <w:abstractNum w15:restartNumberingAfterBreak="0" w:abstractNumId="0">
+    <w:nsid w:val="0000A990"/>
+    <w:multiLevelType w:val="multilevel"/>
+    <w:tmpl w:val="0816B33C"/>
+    <w:lvl w:ilvl="0">
+      <w:numFmt w:val="bullet"/>
+      <w:lvlText w:val=" "/>
+      <w:lvlJc w:val="left"/>
+      <w:pPr>
+        <w:ind w:hanging="360" w:left="720"/>
+      </w:pPr>
+    </w:lvl>
+    <w:lvl w:ilvl="1">
+      <w:numFmt w:val="bullet"/>
+      <w:lvlText w:val=" "/>
+      <w:lvlJc w:val="left"/>
+      <w:pPr>
+        <w:ind w:hanging="360" w:left="1440"/>
+      </w:pPr>
+    </w:lvl>
+    <w:lvl w:ilvl="2">
+      <w:numFmt w:val="bullet"/>
+      <w:lvlText w:val=" "/>
+      <w:lvlJc w:val="left"/>
+      <w:pPr>
+        <w:ind w:hanging="360" w:left="2160"/>
+      </w:pPr>
+    </w:lvl>
+    <w:lvl w:ilvl="3">
+      <w:numFmt w:val="bullet"/>
+      <w:lvlText w:val=" "/>
+      <w:lvlJc w:val="left"/>
+      <w:pPr>
+        <w:ind w:hanging="360" w:left="2880"/>
+      </w:pPr>
+    </w:lvl>
+    <w:lvl w:ilvl="4">
+      <w:numFmt w:val="bullet"/>
+      <w:lvlText w:val=" "/>
+      <w:lvlJc w:val="left"/>
+      <w:pPr>
+        <w:ind w:hanging="360" w:left="3600"/>
+      </w:pPr>
+    </w:lvl>
+    <w:lvl w:ilvl="5">
+      <w:numFmt w:val="bullet"/>
+      <w:lvlText w:val=" "/>
+      <w:lvlJc w:val="left"/>
+      <w:pPr>
+        <w:ind w:hanging="360" w:left="4320"/>
+      </w:pPr>
+    </w:lvl>
+    <w:lvl w:ilvl="6">
+      <w:numFmt w:val="bullet"/>
+      <w:lvlText w:val=" "/>
+      <w:lvlJc w:val="left"/>
+      <w:pPr>
+        <w:ind w:hanging="360" w:left="5040"/>
+      </w:pPr>
+    </w:lvl>
+    <w:lvl w:ilvl="7">
+      <w:numFmt w:val="bullet"/>
+      <w:lvlText w:val=" "/>
+      <w:lvlJc w:val="left"/>
+      <w:pPr>
+        <w:ind w:hanging="360" w:left="5760"/>
+      </w:pPr>
+    </w:lvl>
+    <w:lvl w:ilvl="8">
+      <w:numFmt w:val="bullet"/>
+      <w:lvlText w:val=" "/>
+      <w:lvlJc w:val="left"/>
+      <w:pPr>
+        <w:ind w:hanging="360" w:left="6480"/>
+      </w:pPr>
+    </w:lvl>
+  </w:abstractNum>
   <w:abstractNum w:abstractNumId="990">
     <w:nsid w:val="0000A990"/>
     <w:multiLevelType w:val="multilevel"/>
@@ -3167,120 +3193,17 @@
       </w:pPr>
     </w:lvl>
   </w:abstractNum>
-  <w:abstractNum w:abstractNumId="991">
-    <w:nsid w:val="0000A991"/>
-    <w:multiLevelType w:val="multilevel"/>
-    <w:lvl w:ilvl="0">
-      <w:numFmt w:val="bullet"/>
-      <w:lvlText w:val=""/>
-      <w:lvlJc w:val="left"/>
-      <w:pPr>
-        <w:ind w:left="720" w:hanging="360"/>
-      </w:pPr>
-      <w:rPr>
-        <w:rFonts w:ascii="Symbol" w:hAnsi="Symbol" w:cs="Symbol" w:hint="default"/>
-      </w:rPr>
-    </w:lvl>
-    <w:lvl w:ilvl="1">
-      <w:numFmt w:val="bullet"/>
-      <w:lvlText w:val="o"/>
-      <w:lvlJc w:val="left"/>
-      <w:pPr>
-        <w:ind w:left="1440" w:hanging="360"/>
-      </w:pPr>
-      <w:rPr>
-        <w:rFonts w:ascii="Courier New" w:hAnsi="Courier New" w:cs="Courier New" w:hint="default"/>
-      </w:rPr>
-    </w:lvl>
-    <w:lvl w:ilvl="2">
-      <w:numFmt w:val="bullet"/>
-      <w:lvlText w:val=""/>
-      <w:lvlJc w:val="left"/>
-      <w:pPr>
-        <w:ind w:left="2160" w:hanging="360"/>
-      </w:pPr>
-      <w:rPr>
-        <w:rFonts w:ascii="Wingdings" w:hAnsi="Wingdings" w:cs="Wingdings" w:hint="default"/>
-      </w:rPr>
-    </w:lvl>
-    <w:lvl w:ilvl="3">
-      <w:numFmt w:val="bullet"/>
-      <w:lvlText w:val=""/>
-      <w:lvlJc w:val="left"/>
-      <w:pPr>
-        <w:ind w:left="2880" w:hanging="360"/>
-      </w:pPr>
-      <w:rPr>
-        <w:rFonts w:ascii="Symbol" w:hAnsi="Symbol" w:cs="Symbol" w:hint="default"/>
-      </w:rPr>
-    </w:lvl>
-    <w:lvl w:ilvl="4">
-      <w:numFmt w:val="bullet"/>
-      <w:lvlText w:val="o"/>
-      <w:lvlJc w:val="left"/>
-      <w:pPr>
-        <w:ind w:left="3600" w:hanging="360"/>
-      </w:pPr>
-      <w:rPr>
-        <w:rFonts w:ascii="Courier New" w:hAnsi="Courier New" w:cs="Courier New" w:hint="default"/>
-      </w:rPr>
-    </w:lvl>
-    <w:lvl w:ilvl="5">
-      <w:numFmt w:val="bullet"/>
-      <w:lvlText w:val=""/>
-      <w:lvlJc w:val="left"/>
-      <w:pPr>
-        <w:ind w:left="4320" w:hanging="360"/>
-      </w:pPr>
-      <w:rPr>
-        <w:rFonts w:ascii="Wingdings" w:hAnsi="Wingdings" w:cs="Wingdings" w:hint="default"/>
-      </w:rPr>
-    </w:lvl>
-    <w:lvl w:ilvl="6">
-      <w:numFmt w:val="bullet"/>
-      <w:lvlText w:val=""/>
-      <w:lvlJc w:val="left"/>
-      <w:pPr>
-        <w:ind w:left="5040" w:hanging="360"/>
-      </w:pPr>
-      <w:rPr>
-        <w:rFonts w:ascii="Symbol" w:hAnsi="Symbol" w:cs="Symbol" w:hint="default"/>
-      </w:rPr>
-    </w:lvl>
-    <w:lvl w:ilvl="7">
-      <w:numFmt w:val="bullet"/>
-      <w:lvlText w:val="o"/>
-      <w:lvlJc w:val="left"/>
-      <w:pPr>
-        <w:ind w:left="5760" w:hanging="360"/>
-      </w:pPr>
-      <w:rPr>
-        <w:rFonts w:ascii="Courier New" w:hAnsi="Courier New" w:cs="Courier New" w:hint="default"/>
-      </w:rPr>
-    </w:lvl>
-    <w:lvl w:ilvl="8">
-      <w:numFmt w:val="bullet"/>
-      <w:lvlText w:val=""/>
-      <w:lvlJc w:val="left"/>
-      <w:pPr>
-        <w:ind w:left="6480" w:hanging="360"/>
-      </w:pPr>
-      <w:rPr>
-        <w:rFonts w:ascii="Wingdings" w:hAnsi="Wingdings" w:cs="Wingdings" w:hint="default"/>
-      </w:rPr>
-    </w:lvl>
-  </w:abstractNum>
+  <w:num w16cid:durableId="915625300" w:numId="1">
+    <w:abstractNumId w:val="0"/>
+  </w:num>
   <w:num w:numId="1000">
     <w:abstractNumId w:val="990"/>
-  </w:num>
-  <w:num w:numId="1001">
-    <w:abstractNumId w:val="991"/>
   </w:num>
 </w:numbering>
 </file>
 
 <file path=word/styles.xml><?xml version="1.0" encoding="utf-8"?>
-<w:styles xmlns:r="http://schemas.openxmlformats.org/officeDocument/2006/relationships" xmlns:w="http://schemas.openxmlformats.org/wordprocessingml/2006/main">
+<w:styles xmlns:mc="http://schemas.openxmlformats.org/markup-compatibility/2006" xmlns:r="http://schemas.openxmlformats.org/officeDocument/2006/relationships" xmlns:w="http://schemas.openxmlformats.org/wordprocessingml/2006/main" xmlns:w14="http://schemas.microsoft.com/office/word/2010/wordml" xmlns:w15="http://schemas.microsoft.com/office/word/2012/wordml" xmlns:w16="http://schemas.microsoft.com/office/word/2018/wordml" xmlns:w16cex="http://schemas.microsoft.com/office/word/2018/wordml/cex" xmlns:w16cid="http://schemas.microsoft.com/office/word/2016/wordml/cid" xmlns:w16du="http://schemas.microsoft.com/office/word/2023/wordml/word16du" xmlns:w16sdtdh="http://schemas.microsoft.com/office/word/2020/wordml/sdtdatahash" xmlns:w16sdtfl="http://schemas.microsoft.com/office/word/2024/wordml/sdtformatlock" xmlns:w16se="http://schemas.microsoft.com/office/word/2015/wordml/symex" mc:Ignorable="w14 w15 w16se w16cid w16 w16cex w16sdtdh w16sdtfl w16du">
   <w:docDefaults>
     <w:rPrDefault>
       <w:rPr>
@@ -3296,255 +3219,339 @@
       </w:pPr>
     </w:pPrDefault>
   </w:docDefaults>
-  <w:latentStyles w:count="276" w:defLockedState="0" w:defQFormat="0" w:defSemiHidden="0" w:defUIPriority="0" w:defUnhideWhenUsed="0"/>
+  <w:latentStyles w:count="376" w:defLockedState="0" w:defQFormat="0" w:defSemiHidden="0" w:defUIPriority="0" w:defUnhideWhenUsed="0">
+    <w:lsdException w:name="Normal Table" w:semiHidden="1" w:unhideWhenUsed="1"/>
+    <w:lsdException w:name="Table Simple 1" w:semiHidden="1" w:unhideWhenUsed="1"/>
+    <w:lsdException w:name="Table Simple 2" w:semiHidden="1" w:unhideWhenUsed="1"/>
+    <w:lsdException w:name="Table Simple 3" w:semiHidden="1" w:unhideWhenUsed="1"/>
+    <w:lsdException w:name="Table Classic 1" w:semiHidden="1" w:unhideWhenUsed="1"/>
+    <w:lsdException w:name="Table Classic 2" w:semiHidden="1" w:unhideWhenUsed="1"/>
+    <w:lsdException w:name="Table Classic 3" w:semiHidden="1" w:unhideWhenUsed="1"/>
+    <w:lsdException w:name="Table Classic 4" w:semiHidden="1" w:unhideWhenUsed="1"/>
+    <w:lsdException w:name="Table Colorful 1" w:semiHidden="1" w:unhideWhenUsed="1"/>
+    <w:lsdException w:name="Table Colorful 2" w:semiHidden="1" w:unhideWhenUsed="1"/>
+    <w:lsdException w:name="Table Colorful 3" w:semiHidden="1" w:unhideWhenUsed="1"/>
+    <w:lsdException w:name="Table Columns 1" w:semiHidden="1" w:unhideWhenUsed="1"/>
+    <w:lsdException w:name="Table Columns 2" w:semiHidden="1" w:unhideWhenUsed="1"/>
+    <w:lsdException w:name="Table Columns 3" w:semiHidden="1" w:unhideWhenUsed="1"/>
+    <w:lsdException w:name="Table Columns 4" w:semiHidden="1" w:unhideWhenUsed="1"/>
+    <w:lsdException w:name="Table Columns 5" w:semiHidden="1" w:unhideWhenUsed="1"/>
+    <w:lsdException w:name="Table Grid 1" w:semiHidden="1" w:unhideWhenUsed="1"/>
+    <w:lsdException w:name="Table Grid 2" w:semiHidden="1" w:unhideWhenUsed="1"/>
+    <w:lsdException w:name="Table Grid 3" w:semiHidden="1" w:unhideWhenUsed="1"/>
+    <w:lsdException w:name="Table Grid 4" w:semiHidden="1" w:unhideWhenUsed="1"/>
+    <w:lsdException w:name="Table Grid 5" w:semiHidden="1" w:unhideWhenUsed="1"/>
+    <w:lsdException w:name="Table Grid 6" w:semiHidden="1" w:unhideWhenUsed="1"/>
+    <w:lsdException w:name="Table Grid 7" w:semiHidden="1" w:unhideWhenUsed="1"/>
+    <w:lsdException w:name="Table Grid 8" w:semiHidden="1" w:unhideWhenUsed="1"/>
+    <w:lsdException w:name="Table List 1" w:semiHidden="1" w:unhideWhenUsed="1"/>
+    <w:lsdException w:name="Table List 2" w:semiHidden="1" w:unhideWhenUsed="1"/>
+    <w:lsdException w:name="Table List 3" w:semiHidden="1" w:unhideWhenUsed="1"/>
+    <w:lsdException w:name="Table List 4" w:semiHidden="1" w:unhideWhenUsed="1"/>
+    <w:lsdException w:name="Table List 5" w:semiHidden="1" w:unhideWhenUsed="1"/>
+    <w:lsdException w:name="Table List 6" w:semiHidden="1" w:unhideWhenUsed="1"/>
+    <w:lsdException w:name="Table List 7" w:semiHidden="1" w:unhideWhenUsed="1"/>
+    <w:lsdException w:name="Table List 8" w:semiHidden="1" w:unhideWhenUsed="1"/>
+    <w:lsdException w:name="Table 3D effects 1" w:semiHidden="1" w:unhideWhenUsed="1"/>
+    <w:lsdException w:name="Table 3D effects 2" w:semiHidden="1" w:unhideWhenUsed="1"/>
+    <w:lsdException w:name="Table 3D effects 3" w:semiHidden="1" w:unhideWhenUsed="1"/>
+    <w:lsdException w:name="Table Contemporary" w:semiHidden="1" w:unhideWhenUsed="1"/>
+    <w:lsdException w:name="Table Elegant" w:semiHidden="1" w:unhideWhenUsed="1"/>
+    <w:lsdException w:name="Table Professional" w:semiHidden="1" w:unhideWhenUsed="1"/>
+    <w:lsdException w:name="Table Subtle 1" w:semiHidden="1" w:unhideWhenUsed="1"/>
+    <w:lsdException w:name="Table Subtle 2" w:semiHidden="1" w:unhideWhenUsed="1"/>
+    <w:lsdException w:name="Table Web 1" w:semiHidden="1" w:unhideWhenUsed="1"/>
+    <w:lsdException w:name="Table Web 2" w:semiHidden="1" w:unhideWhenUsed="1"/>
+    <w:lsdException w:name="Table Web 3" w:semiHidden="1" w:unhideWhenUsed="1"/>
+    <w:lsdException w:name="Table Theme" w:semiHidden="1" w:unhideWhenUsed="1"/>
+    <w:lsdException w:name="Light Shading"/>
+    <w:lsdException w:name="Light List"/>
+    <w:lsdException w:name="Light Grid"/>
+    <w:lsdException w:name="Medium Shading 1"/>
+    <w:lsdException w:name="Medium Shading 2"/>
+    <w:lsdException w:name="Medium List 1"/>
+    <w:lsdException w:name="Medium List 2"/>
+    <w:lsdException w:name="Medium Grid 1"/>
+    <w:lsdException w:name="Medium Grid 2"/>
+    <w:lsdException w:name="Medium Grid 3"/>
+    <w:lsdException w:name="Dark List"/>
+    <w:lsdException w:name="Colorful Shading"/>
+    <w:lsdException w:name="Colorful List"/>
+    <w:lsdException w:name="Colorful Grid"/>
+    <w:lsdException w:name="Light Shading Accent 1"/>
+    <w:lsdException w:name="Light List Accent 1"/>
+    <w:lsdException w:name="Light Grid Accent 1"/>
+    <w:lsdException w:name="Medium Shading 1 Accent 1"/>
+    <w:lsdException w:name="Medium Shading 2 Accent 1"/>
+    <w:lsdException w:name="Medium List 1 Accent 1"/>
+    <w:lsdException w:name="Medium List 2 Accent 1"/>
+    <w:lsdException w:name="Medium Grid 1 Accent 1"/>
+    <w:lsdException w:name="Medium Grid 2 Accent 1"/>
+    <w:lsdException w:name="Medium Grid 3 Accent 1"/>
+    <w:lsdException w:name="Dark List Accent 1"/>
+    <w:lsdException w:name="Colorful Shading Accent 1"/>
+    <w:lsdException w:name="Colorful List Accent 1"/>
+    <w:lsdException w:name="Colorful Grid Accent 1"/>
+    <w:lsdException w:name="Light Shading Accent 2"/>
+    <w:lsdException w:name="Light List Accent 2"/>
+    <w:lsdException w:name="Light Grid Accent 2"/>
+    <w:lsdException w:name="Medium Shading 1 Accent 2"/>
+    <w:lsdException w:name="Medium Shading 2 Accent 2"/>
+    <w:lsdException w:name="Medium List 1 Accent 2"/>
+    <w:lsdException w:name="Medium List 2 Accent 2"/>
+    <w:lsdException w:name="Medium Grid 1 Accent 2"/>
+    <w:lsdException w:name="Medium Grid 2 Accent 2"/>
+    <w:lsdException w:name="Medium Grid 3 Accent 2"/>
+    <w:lsdException w:name="Dark List Accent 2"/>
+    <w:lsdException w:name="Colorful Shading Accent 2"/>
+    <w:lsdException w:name="Colorful List Accent 2"/>
+    <w:lsdException w:name="Colorful Grid Accent 2"/>
+    <w:lsdException w:name="Light Shading Accent 3"/>
+    <w:lsdException w:name="Light List Accent 3"/>
+    <w:lsdException w:name="Light Grid Accent 3"/>
+    <w:lsdException w:name="Medium Shading 1 Accent 3"/>
+    <w:lsdException w:name="Medium Shading 2 Accent 3"/>
+    <w:lsdException w:name="Medium List 1 Accent 3"/>
+    <w:lsdException w:name="Medium List 2 Accent 3"/>
+    <w:lsdException w:name="Medium Grid 1 Accent 3"/>
+    <w:lsdException w:name="Medium Grid 2 Accent 3"/>
+    <w:lsdException w:name="Medium Grid 3 Accent 3"/>
+    <w:lsdException w:name="Dark List Accent 3"/>
+    <w:lsdException w:name="Colorful Shading Accent 3"/>
+    <w:lsdException w:name="Colorful List Accent 3"/>
+    <w:lsdException w:name="Colorful Grid Accent 3"/>
+    <w:lsdException w:name="Light Shading Accent 4"/>
+    <w:lsdException w:name="Light List Accent 4"/>
+    <w:lsdException w:name="Light Grid Accent 4"/>
+    <w:lsdException w:name="Medium Shading 1 Accent 4"/>
+    <w:lsdException w:name="Medium Shading 2 Accent 4"/>
+    <w:lsdException w:name="Medium List 1 Accent 4"/>
+    <w:lsdException w:name="Medium List 2 Accent 4"/>
+    <w:lsdException w:name="Medium Grid 1 Accent 4"/>
+    <w:lsdException w:name="Medium Grid 2 Accent 4"/>
+    <w:lsdException w:name="Medium Grid 3 Accent 4"/>
+    <w:lsdException w:name="Dark List Accent 4"/>
+    <w:lsdException w:name="Colorful Shading Accent 4"/>
+    <w:lsdException w:name="Colorful List Accent 4"/>
+    <w:lsdException w:name="Colorful Grid Accent 4"/>
+    <w:lsdException w:name="Light Shading Accent 5"/>
+    <w:lsdException w:name="Light List Accent 5"/>
+    <w:lsdException w:name="Light Grid Accent 5"/>
+    <w:lsdException w:name="Medium Shading 1 Accent 5"/>
+    <w:lsdException w:name="Medium Shading 2 Accent 5"/>
+    <w:lsdException w:name="Medium List 1 Accent 5"/>
+    <w:lsdException w:name="Medium List 2 Accent 5"/>
+    <w:lsdException w:name="Medium Grid 1 Accent 5"/>
+    <w:lsdException w:name="Medium Grid 2 Accent 5"/>
+    <w:lsdException w:name="Medium Grid 3 Accent 5"/>
+    <w:lsdException w:name="Dark List Accent 5"/>
+    <w:lsdException w:name="Colorful Shading Accent 5"/>
+    <w:lsdException w:name="Colorful List Accent 5"/>
+    <w:lsdException w:name="Colorful Grid Accent 5"/>
+    <w:lsdException w:name="Light Shading Accent 6"/>
+    <w:lsdException w:name="Light List Accent 6"/>
+    <w:lsdException w:name="Light Grid Accent 6"/>
+    <w:lsdException w:name="Medium Shading 1 Accent 6"/>
+    <w:lsdException w:name="Medium Shading 2 Accent 6"/>
+    <w:lsdException w:name="Medium List 1 Accent 6"/>
+    <w:lsdException w:name="Medium List 2 Accent 6"/>
+    <w:lsdException w:name="Medium Grid 1 Accent 6"/>
+    <w:lsdException w:name="Medium Grid 2 Accent 6"/>
+    <w:lsdException w:name="Medium Grid 3 Accent 6"/>
+    <w:lsdException w:name="Dark List Accent 6"/>
+    <w:lsdException w:name="Colorful Shading Accent 6"/>
+    <w:lsdException w:name="Colorful List Accent 6"/>
+    <w:lsdException w:name="Colorful Grid Accent 6"/>
+    <w:lsdException w:name="Grid Table 4" w:uiPriority="49"/>
+    <w:lsdException w:name="Grid Table 5 Dark" w:uiPriority="50"/>
+    <w:lsdException w:name="Grid Table 6 Colorful" w:uiPriority="51"/>
+    <w:lsdException w:name="Grid Table 7 Colorful" w:uiPriority="52"/>
+    <w:lsdException w:name="Grid Table 1 Light Accent 1" w:uiPriority="46"/>
+    <w:lsdException w:name="Grid Table 2 Accent 1" w:uiPriority="47"/>
+    <w:lsdException w:name="Grid Table 3 Accent 1" w:uiPriority="48"/>
+    <w:lsdException w:name="Grid Table 4 Accent 1" w:uiPriority="49"/>
+    <w:lsdException w:name="Grid Table 5 Dark Accent 1" w:uiPriority="50"/>
+    <w:lsdException w:name="Grid Table 6 Colorful Accent 1" w:uiPriority="51"/>
+    <w:lsdException w:name="Grid Table 7 Colorful Accent 1" w:uiPriority="52"/>
+    <w:lsdException w:name="Grid Table 1 Light Accent 2" w:uiPriority="46"/>
+    <w:lsdException w:name="Grid Table 2 Accent 2" w:uiPriority="47"/>
+    <w:lsdException w:name="Grid Table 3 Accent 2" w:uiPriority="48"/>
+    <w:lsdException w:name="Grid Table 4 Accent 2" w:uiPriority="49"/>
+    <w:lsdException w:name="Grid Table 5 Dark Accent 2" w:uiPriority="50"/>
+    <w:lsdException w:name="Grid Table 6 Colorful Accent 2" w:uiPriority="51"/>
+    <w:lsdException w:name="Grid Table 7 Colorful Accent 2" w:uiPriority="52"/>
+    <w:lsdException w:name="Grid Table 1 Light Accent 3" w:uiPriority="46"/>
+    <w:lsdException w:name="Grid Table 2 Accent 3" w:uiPriority="47"/>
+    <w:lsdException w:name="Grid Table 3 Accent 3" w:uiPriority="48"/>
+    <w:lsdException w:name="Grid Table 4 Accent 3" w:uiPriority="49"/>
+    <w:lsdException w:name="Grid Table 5 Dark Accent 3" w:uiPriority="50"/>
+    <w:lsdException w:name="Grid Table 6 Colorful Accent 3" w:uiPriority="51"/>
+    <w:lsdException w:name="Grid Table 7 Colorful Accent 3" w:uiPriority="52"/>
+    <w:lsdException w:name="Grid Table 1 Light Accent 4" w:uiPriority="46"/>
+    <w:lsdException w:name="Grid Table 2 Accent 4" w:uiPriority="47"/>
+    <w:lsdException w:name="Grid Table 3 Accent 4" w:uiPriority="48"/>
+    <w:lsdException w:name="Grid Table 4 Accent 4" w:uiPriority="49"/>
+    <w:lsdException w:name="Grid Table 5 Dark Accent 4" w:uiPriority="50"/>
+    <w:lsdException w:name="Grid Table 6 Colorful Accent 4" w:uiPriority="51"/>
+    <w:lsdException w:name="Grid Table 7 Colorful Accent 4" w:uiPriority="52"/>
+    <w:lsdException w:name="Grid Table 1 Light Accent 5" w:uiPriority="46"/>
+    <w:lsdException w:name="Grid Table 2 Accent 5" w:uiPriority="47"/>
+    <w:lsdException w:name="Grid Table 3 Accent 5" w:uiPriority="48"/>
+    <w:lsdException w:name="Grid Table 4 Accent 5" w:uiPriority="49"/>
+    <w:lsdException w:name="Grid Table 5 Dark Accent 5" w:uiPriority="50"/>
+    <w:lsdException w:name="Grid Table 6 Colorful Accent 5" w:uiPriority="51"/>
+    <w:lsdException w:name="Grid Table 7 Colorful Accent 5" w:uiPriority="52"/>
+    <w:lsdException w:name="Grid Table 1 Light Accent 6" w:uiPriority="46"/>
+    <w:lsdException w:name="Grid Table 2 Accent 6" w:uiPriority="47"/>
+    <w:lsdException w:name="Grid Table 3 Accent 6" w:uiPriority="48"/>
+    <w:lsdException w:name="Grid Table 4 Accent 6" w:uiPriority="49"/>
+    <w:lsdException w:name="Grid Table 5 Dark Accent 6" w:uiPriority="50"/>
+    <w:lsdException w:name="Grid Table 6 Colorful Accent 6" w:uiPriority="51"/>
+    <w:lsdException w:name="Grid Table 7 Colorful Accent 6" w:uiPriority="52"/>
+    <w:lsdException w:name="List Table 1 Light" w:uiPriority="46"/>
+    <w:lsdException w:name="List Table 2" w:uiPriority="47"/>
+    <w:lsdException w:name="List Table 3" w:uiPriority="48"/>
+    <w:lsdException w:name="List Table 4" w:uiPriority="49"/>
+    <w:lsdException w:name="List Table 5 Dark" w:uiPriority="50"/>
+    <w:lsdException w:name="List Table 6 Colorful" w:uiPriority="51"/>
+    <w:lsdException w:name="List Table 7 Colorful" w:uiPriority="52"/>
+    <w:lsdException w:name="List Table 1 Light Accent 1" w:uiPriority="46"/>
+    <w:lsdException w:name="List Table 2 Accent 1" w:uiPriority="47"/>
+    <w:lsdException w:name="List Table 3 Accent 1" w:uiPriority="48"/>
+    <w:lsdException w:name="List Table 4 Accent 1" w:uiPriority="49"/>
+    <w:lsdException w:name="List Table 5 Dark Accent 1" w:uiPriority="50"/>
+    <w:lsdException w:name="List Table 6 Colorful Accent 1" w:uiPriority="51"/>
+    <w:lsdException w:name="List Table 7 Colorful Accent 1" w:uiPriority="52"/>
+    <w:lsdException w:name="List Table 1 Light Accent 2" w:uiPriority="46"/>
+    <w:lsdException w:name="List Table 2 Accent 2" w:uiPriority="47"/>
+    <w:lsdException w:name="List Table 3 Accent 2" w:uiPriority="48"/>
+    <w:lsdException w:name="List Table 4 Accent 2" w:uiPriority="49"/>
+    <w:lsdException w:name="List Table 5 Dark Accent 2" w:uiPriority="50"/>
+    <w:lsdException w:name="List Table 6 Colorful Accent 2" w:uiPriority="51"/>
+    <w:lsdException w:name="List Table 7 Colorful Accent 2" w:uiPriority="52"/>
+    <w:lsdException w:name="List Table 1 Light Accent 3" w:uiPriority="46"/>
+    <w:lsdException w:name="List Table 2 Accent 3" w:uiPriority="47"/>
+    <w:lsdException w:name="List Table 3 Accent 3" w:uiPriority="48"/>
+    <w:lsdException w:name="List Table 4 Accent 3" w:uiPriority="49"/>
+    <w:lsdException w:name="List Table 5 Dark Accent 3" w:uiPriority="50"/>
+    <w:lsdException w:name="List Table 6 Colorful Accent 3" w:uiPriority="51"/>
+    <w:lsdException w:name="List Table 7 Colorful Accent 3" w:uiPriority="52"/>
+    <w:lsdException w:name="List Table 1 Light Accent 4" w:uiPriority="46"/>
+    <w:lsdException w:name="List Table 2 Accent 4" w:uiPriority="47"/>
+    <w:lsdException w:name="List Table 3 Accent 4" w:uiPriority="48"/>
+    <w:lsdException w:name="List Table 4 Accent 4" w:uiPriority="49"/>
+    <w:lsdException w:name="List Table 5 Dark Accent 4" w:uiPriority="50"/>
+    <w:lsdException w:name="List Table 6 Colorful Accent 4" w:uiPriority="51"/>
+    <w:lsdException w:name="List Table 7 Colorful Accent 4" w:uiPriority="52"/>
+    <w:lsdException w:name="List Table 1 Light Accent 5" w:uiPriority="46"/>
+    <w:lsdException w:name="List Table 2 Accent 5" w:uiPriority="47"/>
+    <w:lsdException w:name="List Table 3 Accent 5" w:uiPriority="48"/>
+    <w:lsdException w:name="List Table 4 Accent 5" w:uiPriority="49"/>
+    <w:lsdException w:name="List Table 5 Dark Accent 5" w:uiPriority="50"/>
+    <w:lsdException w:name="List Table 6 Colorful Accent 5" w:uiPriority="51"/>
+    <w:lsdException w:name="List Table 7 Colorful Accent 5" w:uiPriority="52"/>
+    <w:lsdException w:name="List Table 1 Light Accent 6" w:uiPriority="46"/>
+    <w:lsdException w:name="List Table 2 Accent 6" w:uiPriority="47"/>
+    <w:lsdException w:name="List Table 3 Accent 6" w:uiPriority="48"/>
+    <w:lsdException w:name="List Table 4 Accent 6" w:uiPriority="49"/>
+    <w:lsdException w:name="List Table 5 Dark Accent 6" w:uiPriority="50"/>
+    <w:lsdException w:name="List Table 6 Colorful Accent 6" w:uiPriority="51"/>
+    <w:lsdException w:name="List Table 7 Colorful Accent 6" w:uiPriority="52"/>
+    <w:lsdException w:name="Mention" w:semiHidden="1" w:uiPriority="99" w:unhideWhenUsed="1"/>
+    <w:lsdException w:name="Smart Hyperlink" w:semiHidden="1" w:uiPriority="99" w:unhideWhenUsed="1"/>
+    <w:lsdException w:name="Hashtag" w:semiHidden="1" w:uiPriority="99" w:unhideWhenUsed="1"/>
+    <w:lsdException w:name="Unresolved Mention" w:semiHidden="1" w:uiPriority="99" w:unhideWhenUsed="1"/>
+    <w:lsdException w:name="Smart Link" w:semiHidden="1" w:uiPriority="99" w:unhideWhenUsed="1"/>
+  </w:latentStyles>
   <w:style w:default="1" w:styleId="Normal" w:type="paragraph">
     <w:name w:val="Normal"/>
     <w:qFormat/>
-  </w:style>
-  <w:style w:styleId="BodyText" w:type="paragraph">
-    <w:name w:val="Body Text"/>
+    <w:pPr>
+      <w:spacing w:after="120" w:line="480" w:lineRule="auto"/>
+      <w:jc w:val="both"/>
+    </w:pPr>
+    <w:rPr>
+      <w:rFonts w:ascii="Times New Roman" w:cs="Times New Roman" w:hAnsi="Times New Roman"/>
+    </w:rPr>
+  </w:style>
+  <w:style w:styleId="Heading1" w:type="paragraph">
+    <w:name w:val="heading 1"/>
     <w:basedOn w:val="Normal"/>
-    <w:link w:val="BodyTextChar"/>
-    <w:qFormat/>
-    <w:pPr>
-      <w:spacing w:after="180" w:before="180"/>
-    </w:pPr>
-  </w:style>
-  <w:style w:customStyle="1" w:styleId="FirstParagraph" w:type="paragraph">
-    <w:name w:val="First Paragraph"/>
-    <w:basedOn w:val="BodyText"/>
-    <w:next w:val="BodyText"/>
-    <w:qFormat/>
-  </w:style>
-  <w:style w:customStyle="1" w:styleId="Compact" w:type="paragraph">
-    <w:name w:val="Compact"/>
-    <w:basedOn w:val="BodyText"/>
-    <w:qFormat/>
-    <w:pPr>
-      <w:spacing w:after="36" w:before="36"/>
-    </w:pPr>
-  </w:style>
-  <w:style w:styleId="Title" w:type="paragraph">
-    <w:name w:val="Title"/>
-    <w:basedOn w:val="Normal"/>
-    <w:next w:val="BodyText"/>
-    <w:link w:val="TitleChar"/>
-    <w:uiPriority w:val="10"/>
-    <w:qFormat/>
-    <w:rsid w:val="00A10FD9"/>
-    <w:pPr>
-      <w:spacing w:after="80" w:line="240" w:lineRule="auto"/>
-      <w:contextualSpacing/>
-      <w:jc w:val="center"/>
-    </w:pPr>
-    <w:rPr>
-      <w:rFonts w:asciiTheme="majorHAnsi" w:cstheme="majorBidi" w:eastAsiaTheme="majorEastAsia" w:hAnsiTheme="majorHAnsi"/>
-      <w:sz w:val="56"/>
-      <w:szCs w:val="56"/>
-    </w:rPr>
-  </w:style>
-  <w:style w:customStyle="1" w:styleId="TitleChar" w:type="character">
-    <w:name w:val="Title Char"/>
-    <w:basedOn w:val="DefaultParagraphFont"/>
-    <w:link w:val="Title"/>
-    <w:uiPriority w:val="10"/>
-    <w:rsid w:val="00A10FD9"/>
-    <w:rPr>
-      <w:rFonts w:asciiTheme="majorHAnsi" w:cstheme="majorBidi" w:eastAsiaTheme="majorEastAsia" w:hAnsiTheme="majorHAnsi"/>
-      <w:sz w:val="56"/>
-      <w:szCs w:val="56"/>
-    </w:rPr>
-  </w:style>
-  <w:style w:styleId="Subtitle" w:type="paragraph">
-    <w:name w:val="Subtitle"/>
-    <w:basedOn w:val="Title"/>
-    <w:next w:val="BodyText"/>
-    <w:link w:val="SubtitleChar"/>
-    <w:uiPriority w:val="11"/>
-    <w:qFormat/>
-    <w:rsid w:val="00A10FD9"/>
-    <w:pPr>
-      <w:numPr>
-        <w:ilvl w:val="1"/>
-      </w:numPr>
-    </w:pPr>
-    <w:rPr>
-      <w:rFonts w:cstheme="majorBidi" w:eastAsiaTheme="majorEastAsia"/>
-      <w:spacing w:val="15"/>
-      <w:sz w:val="28"/>
-      <w:szCs w:val="28"/>
-    </w:rPr>
-  </w:style>
-  <w:style w:customStyle="1" w:styleId="SubtitleChar" w:type="character">
-    <w:name w:val="Subtitle Char"/>
-    <w:basedOn w:val="DefaultParagraphFont"/>
-    <w:link w:val="Subtitle"/>
-    <w:uiPriority w:val="11"/>
-    <w:rsid w:val="00A10FD9"/>
-    <w:rPr>
-      <w:rFonts w:cstheme="majorBidi" w:eastAsiaTheme="majorEastAsia"/>
-      <w:color w:themeColor="text1" w:themeTint="A6" w:val="595959"/>
-      <w:spacing w:val="15"/>
-      <w:sz w:val="28"/>
-      <w:szCs w:val="28"/>
-    </w:rPr>
-  </w:style>
-  <w:style w:customStyle="1" w:styleId="Author" w:type="paragraph">
-    <w:name w:val="Author"/>
-    <w:basedOn w:val="Title"/>
-    <w:next w:val="BodyText"/>
+    <w:next w:val="Normal"/>
     <w:qFormat/>
     <w:pPr>
       <w:keepNext/>
       <w:keepLines/>
+      <w:spacing w:after="120" w:before="240" w:line="480" w:lineRule="auto"/>
+      <w:outlineLvl w:val="0"/>
+      <w:jc w:val="left"/>
     </w:pPr>
     <w:rPr>
+      <w:rFonts w:ascii="Times New Roman" w:cs="Times New Roman" w:hAnsi="Times New Roman"/>
+      <w:b/>
+      <w:color w:val="000000"/>
       <w:sz w:val="24"/>
       <w:szCs w:val="24"/>
     </w:rPr>
   </w:style>
-  <w:style w:styleId="Date" w:type="paragraph">
-    <w:name w:val="Date"/>
-    <w:basedOn w:val="Title"/>
-    <w:next w:val="BodyText"/>
+  <w:style w:styleId="Heading2" w:type="paragraph">
+    <w:name w:val="heading 2"/>
+    <w:basedOn w:val="Normal"/>
+    <w:next w:val="Normal"/>
     <w:qFormat/>
     <w:pPr>
       <w:keepNext/>
       <w:keepLines/>
+      <w:spacing w:after="120" w:before="240" w:line="480" w:lineRule="auto"/>
+      <w:outlineLvl w:val="1"/>
+      <w:jc w:val="left"/>
     </w:pPr>
     <w:rPr>
+      <w:rFonts w:ascii="Times New Roman" w:cs="Times New Roman" w:hAnsi="Times New Roman"/>
+      <w:b/>
+      <w:color w:val="000000"/>
       <w:sz w:val="24"/>
       <w:szCs w:val="24"/>
     </w:rPr>
   </w:style>
-  <w:style w:customStyle="1" w:styleId="AbstractTitle" w:type="paragraph">
-    <w:name w:val="Abstract Title"/>
+  <w:style w:styleId="Heading3" w:type="paragraph">
+    <w:name w:val="heading 3"/>
     <w:basedOn w:val="Normal"/>
-    <w:next w:val="Abstract"/>
+    <w:next w:val="Normal"/>
     <w:qFormat/>
     <w:pPr>
       <w:keepNext/>
       <w:keepLines/>
-      <w:spacing w:after="0" w:before="300"/>
-      <w:jc w:val="center"/>
+      <w:spacing w:after="120" w:before="240" w:line="480" w:lineRule="auto"/>
+      <w:outlineLvl w:val="2"/>
+      <w:jc w:val="left"/>
     </w:pPr>
     <w:rPr>
+      <w:rFonts w:ascii="Times New Roman" w:cs="Times New Roman" w:hAnsi="Times New Roman"/>
       <w:b/>
-      <w:sz w:val="20"/>
-      <w:szCs w:val="20"/>
-    </w:rPr>
-  </w:style>
-  <w:style w:customStyle="1" w:styleId="Abstract" w:type="paragraph">
-    <w:name w:val="Abstract"/>
+      <w:color w:val="000000"/>
+      <w:sz w:val="24"/>
+      <w:szCs w:val="24"/>
+    </w:rPr>
+  </w:style>
+  <w:style w:styleId="Heading4" w:type="paragraph">
+    <w:name w:val="heading 4"/>
     <w:basedOn w:val="Normal"/>
-    <w:next w:val="BodyText"/>
+    <w:next w:val="Normal"/>
     <w:qFormat/>
     <w:pPr>
       <w:keepNext/>
       <w:keepLines/>
-      <w:spacing w:after="300" w:before="100"/>
+      <w:spacing w:after="120" w:before="240" w:line="480" w:lineRule="auto"/>
+      <w:outlineLvl w:val="3"/>
+      <w:jc w:val="left"/>
     </w:pPr>
     <w:rPr>
-      <w:sz w:val="20"/>
-      <w:szCs w:val="20"/>
-    </w:rPr>
-  </w:style>
-  <w:style w:styleId="Bibliography" w:type="paragraph">
-    <w:name w:val="Bibliography"/>
-    <w:basedOn w:val="Normal"/>
-    <w:next w:val="Bibliography"/>
-    <w:qFormat/>
-    <w:pPr/>
-    <w:rPr/>
-  </w:style>
-  <w:style w:styleId="Heading1" w:type="paragraph">
-    <w:name w:val="heading 1"/>
-    <w:basedOn w:val="Normal"/>
-    <w:next w:val="BodyText"/>
-    <w:link w:val="Heading1Char"/>
-    <w:uiPriority w:val="9"/>
-    <w:qFormat/>
-    <w:rsid w:val="00A10FD9"/>
-    <w:pPr>
-      <w:keepNext/>
-      <w:keepLines/>
-      <w:spacing w:after="80" w:before="360"/>
-      <w:outlineLvl w:val="0"/>
-    </w:pPr>
-    <w:rPr>
-      <w:rFonts w:asciiTheme="majorHAnsi" w:cstheme="majorBidi" w:eastAsiaTheme="majorEastAsia" w:hAnsiTheme="majorHAnsi"/>
-      <w:color w:themeColor="accent1" w:themeShade="BF" w:val="0F4761"/>
-      <w:sz w:val="40"/>
-      <w:szCs w:val="40"/>
-    </w:rPr>
-  </w:style>
-  <w:style w:styleId="Heading2" w:type="paragraph">
-    <w:name w:val="heading 2"/>
-    <w:basedOn w:val="Normal"/>
-    <w:next w:val="BodyText"/>
-    <w:link w:val="Heading2Char"/>
-    <w:uiPriority w:val="9"/>
-    <w:semiHidden/>
-    <w:unhideWhenUsed/>
-    <w:qFormat/>
-    <w:rsid w:val="00A10FD9"/>
-    <w:pPr>
-      <w:keepNext/>
-      <w:keepLines/>
-      <w:spacing w:after="80" w:before="160"/>
-      <w:outlineLvl w:val="1"/>
-    </w:pPr>
-    <w:rPr>
-      <w:rFonts w:asciiTheme="majorHAnsi" w:cstheme="majorBidi" w:eastAsiaTheme="majorEastAsia" w:hAnsiTheme="majorHAnsi"/>
-      <w:color w:themeColor="accent1" w:themeShade="BF" w:val="0F4761"/>
-      <w:sz w:val="32"/>
-      <w:szCs w:val="32"/>
-    </w:rPr>
-  </w:style>
-  <w:style w:styleId="Heading3" w:type="paragraph">
-    <w:name w:val="heading 3"/>
-    <w:basedOn w:val="Normal"/>
-    <w:next w:val="BodyText"/>
-    <w:link w:val="Heading3Char"/>
-    <w:uiPriority w:val="9"/>
-    <w:semiHidden/>
-    <w:unhideWhenUsed/>
-    <w:qFormat/>
-    <w:rsid w:val="00A10FD9"/>
-    <w:pPr>
-      <w:keepNext/>
-      <w:keepLines/>
-      <w:spacing w:after="80" w:before="160"/>
-      <w:outlineLvl w:val="2"/>
-    </w:pPr>
-    <w:rPr>
-      <w:rFonts w:cstheme="majorBidi" w:eastAsiaTheme="majorEastAsia"/>
-      <w:color w:themeColor="accent1" w:themeShade="BF" w:val="0F4761"/>
-      <w:sz w:val="28"/>
-      <w:szCs w:val="28"/>
-    </w:rPr>
-  </w:style>
-  <w:style w:styleId="Heading4" w:type="paragraph">
-    <w:name w:val="heading 4"/>
-    <w:basedOn w:val="Normal"/>
-    <w:next w:val="BodyText"/>
-    <w:link w:val="Heading4Char"/>
-    <w:uiPriority w:val="9"/>
-    <w:semiHidden/>
-    <w:unhideWhenUsed/>
-    <w:qFormat/>
-    <w:rsid w:val="00A10FD9"/>
-    <w:pPr>
-      <w:keepNext/>
-      <w:keepLines/>
-      <w:spacing w:after="40" w:before="80"/>
-      <w:outlineLvl w:val="3"/>
-    </w:pPr>
-    <w:rPr>
-      <w:rFonts w:cstheme="majorBidi" w:eastAsiaTheme="majorEastAsia"/>
-      <w:i/>
-      <w:iCs/>
-      <w:color w:themeColor="accent1" w:themeShade="BF" w:val="0F4761"/>
+      <w:rFonts w:ascii="Times New Roman" w:cs="Times New Roman" w:hAnsi="Times New Roman"/>
+      <w:b/>
+      <w:color w:val="000000"/>
+      <w:sz w:val="24"/>
+      <w:szCs w:val="24"/>
     </w:rPr>
   </w:style>
   <w:style w:styleId="Heading5" w:type="paragraph">
@@ -3656,6 +3663,189 @@
       <w:color w:themeColor="text1" w:themeTint="D8" w:val="272727"/>
     </w:rPr>
   </w:style>
+  <w:style w:default="1" w:styleId="DefaultParagraphFont" w:type="character">
+    <w:name w:val="Default Paragraph Font"/>
+    <w:uiPriority w:val="1"/>
+    <w:semiHidden/>
+    <w:unhideWhenUsed/>
+  </w:style>
+  <w:style w:default="1" w:styleId="TableNormal" w:type="table">
+    <w:name w:val="Normal Table"/>
+    <w:uiPriority w:val="99"/>
+    <w:semiHidden/>
+    <w:unhideWhenUsed/>
+    <w:tblPr>
+      <w:tblInd w:type="dxa" w:w="0"/>
+      <w:tblCellMar>
+        <w:top w:type="dxa" w:w="0"/>
+        <w:left w:type="dxa" w:w="108"/>
+        <w:bottom w:type="dxa" w:w="0"/>
+        <w:right w:type="dxa" w:w="108"/>
+      </w:tblCellMar>
+    </w:tblPr>
+  </w:style>
+  <w:style w:default="1" w:styleId="NoList" w:type="numbering">
+    <w:name w:val="No List"/>
+    <w:uiPriority w:val="99"/>
+    <w:semiHidden/>
+    <w:unhideWhenUsed/>
+  </w:style>
+  <w:style w:styleId="BodyText" w:type="paragraph">
+    <w:name w:val="Body Text"/>
+    <w:basedOn w:val="Normal"/>
+    <w:qFormat/>
+    <w:pPr>
+      <w:spacing w:after="180" w:before="180"/>
+    </w:pPr>
+  </w:style>
+  <w:style w:customStyle="1" w:styleId="FirstParagraph" w:type="paragraph">
+    <w:name w:val="First Paragraph"/>
+    <w:basedOn w:val="BodyText"/>
+    <w:next w:val="BodyText"/>
+    <w:qFormat/>
+  </w:style>
+  <w:style w:styleId="Compact" w:type="paragraph">
+    <w:name w:val="Compact"/>
+    <w:basedOn w:val="Normal"/>
+    <w:qFormat/>
+    <w:pPr>
+      <w:spacing w:after="20" w:before="20" w:line="240" w:lineRule="auto"/>
+      <w:jc w:val="left"/>
+    </w:pPr>
+    <w:rPr>
+      <w:sz w:val="22"/>
+      <w:szCs w:val="22"/>
+    </w:rPr>
+  </w:style>
+  <w:style w:styleId="Title" w:type="paragraph">
+    <w:name w:val="Title"/>
+    <w:basedOn w:val="Normal"/>
+    <w:next w:val="BodyText"/>
+    <w:link w:val="TitleChar"/>
+    <w:uiPriority w:val="10"/>
+    <w:qFormat/>
+    <w:rsid w:val="00A10FD9"/>
+    <w:pPr>
+      <w:spacing w:after="80" w:line="240" w:lineRule="auto"/>
+      <w:contextualSpacing/>
+      <w:jc w:val="center"/>
+    </w:pPr>
+    <w:rPr>
+      <w:rFonts w:asciiTheme="majorHAnsi" w:cstheme="majorBidi" w:eastAsiaTheme="majorEastAsia" w:hAnsiTheme="majorHAnsi"/>
+      <w:sz w:val="56"/>
+      <w:szCs w:val="56"/>
+    </w:rPr>
+  </w:style>
+  <w:style w:customStyle="1" w:styleId="TitleChar" w:type="character">
+    <w:name w:val="Title Char"/>
+    <w:basedOn w:val="DefaultParagraphFont"/>
+    <w:link w:val="Title"/>
+    <w:uiPriority w:val="10"/>
+    <w:rsid w:val="00A10FD9"/>
+    <w:rPr>
+      <w:rFonts w:asciiTheme="majorHAnsi" w:cstheme="majorBidi" w:eastAsiaTheme="majorEastAsia" w:hAnsiTheme="majorHAnsi"/>
+      <w:sz w:val="56"/>
+      <w:szCs w:val="56"/>
+    </w:rPr>
+  </w:style>
+  <w:style w:styleId="Subtitle" w:type="paragraph">
+    <w:name w:val="Subtitle"/>
+    <w:basedOn w:val="Title"/>
+    <w:next w:val="BodyText"/>
+    <w:link w:val="SubtitleChar"/>
+    <w:uiPriority w:val="11"/>
+    <w:qFormat/>
+    <w:rsid w:val="00A10FD9"/>
+    <w:pPr>
+      <w:numPr>
+        <w:ilvl w:val="1"/>
+      </w:numPr>
+    </w:pPr>
+    <w:rPr>
+      <w:spacing w:val="15"/>
+      <w:sz w:val="28"/>
+      <w:szCs w:val="28"/>
+    </w:rPr>
+  </w:style>
+  <w:style w:customStyle="1" w:styleId="SubtitleChar" w:type="character">
+    <w:name w:val="Subtitle Char"/>
+    <w:basedOn w:val="DefaultParagraphFont"/>
+    <w:link w:val="Subtitle"/>
+    <w:uiPriority w:val="11"/>
+    <w:rsid w:val="00A10FD9"/>
+    <w:rPr>
+      <w:rFonts w:cstheme="majorBidi" w:eastAsiaTheme="majorEastAsia"/>
+      <w:color w:themeColor="text1" w:themeTint="A6" w:val="595959"/>
+      <w:spacing w:val="15"/>
+      <w:sz w:val="28"/>
+      <w:szCs w:val="28"/>
+    </w:rPr>
+  </w:style>
+  <w:style w:customStyle="1" w:styleId="Author" w:type="paragraph">
+    <w:name w:val="Author"/>
+    <w:basedOn w:val="Title"/>
+    <w:next w:val="BodyText"/>
+    <w:qFormat/>
+    <w:pPr>
+      <w:keepNext/>
+      <w:keepLines/>
+    </w:pPr>
+    <w:rPr>
+      <w:sz w:val="24"/>
+      <w:szCs w:val="24"/>
+    </w:rPr>
+  </w:style>
+  <w:style w:styleId="Date" w:type="paragraph">
+    <w:name w:val="Date"/>
+    <w:basedOn w:val="Title"/>
+    <w:next w:val="BodyText"/>
+    <w:qFormat/>
+    <w:pPr>
+      <w:keepNext/>
+      <w:keepLines/>
+    </w:pPr>
+    <w:rPr>
+      <w:sz w:val="24"/>
+      <w:szCs w:val="24"/>
+    </w:rPr>
+  </w:style>
+  <w:style w:customStyle="1" w:styleId="AbstractTitle" w:type="paragraph">
+    <w:name w:val="Abstract Title"/>
+    <w:basedOn w:val="Normal"/>
+    <w:next w:val="Abstract"/>
+    <w:qFormat/>
+    <w:pPr>
+      <w:keepNext/>
+      <w:keepLines/>
+      <w:spacing w:after="0" w:before="300"/>
+      <w:jc w:val="center"/>
+    </w:pPr>
+    <w:rPr>
+      <w:b/>
+      <w:sz w:val="20"/>
+      <w:szCs w:val="20"/>
+    </w:rPr>
+  </w:style>
+  <w:style w:customStyle="1" w:styleId="Abstract" w:type="paragraph">
+    <w:name w:val="Abstract"/>
+    <w:basedOn w:val="Normal"/>
+    <w:next w:val="BodyText"/>
+    <w:qFormat/>
+    <w:pPr>
+      <w:keepNext/>
+      <w:keepLines/>
+      <w:spacing w:after="300" w:before="100"/>
+    </w:pPr>
+    <w:rPr>
+      <w:sz w:val="20"/>
+      <w:szCs w:val="20"/>
+    </w:rPr>
+  </w:style>
+  <w:style w:styleId="Bibliography" w:type="paragraph">
+    <w:name w:val="Bibliography"/>
+    <w:basedOn w:val="Normal"/>
+    <w:qFormat/>
+  </w:style>
   <w:style w:customStyle="1" w:styleId="Heading1Char" w:type="character">
     <w:name w:val="Heading 1 Char"/>
     <w:basedOn w:val="DefaultParagraphFont"/>
@@ -3674,7 +3864,6 @@
     <w:basedOn w:val="DefaultParagraphFont"/>
     <w:link w:val="Heading2"/>
     <w:uiPriority w:val="9"/>
-    <w:semiHidden/>
     <w:rsid w:val="00A10FD9"/>
     <w:rPr>
       <w:rFonts w:asciiTheme="majorHAnsi" w:cstheme="majorBidi" w:eastAsiaTheme="majorEastAsia" w:hAnsiTheme="majorHAnsi"/>
@@ -3688,7 +3877,6 @@
     <w:basedOn w:val="DefaultParagraphFont"/>
     <w:link w:val="Heading3"/>
     <w:uiPriority w:val="9"/>
-    <w:semiHidden/>
     <w:rsid w:val="00A10FD9"/>
     <w:rPr>
       <w:rFonts w:cstheme="majorBidi" w:eastAsiaTheme="majorEastAsia"/>
@@ -3784,18 +3972,17 @@
     <w:qFormat/>
     <w:pPr>
       <w:spacing w:after="100" w:before="100"/>
-      <w:ind w:firstLine="0" w:left="480" w:right="480"/>
+      <w:ind w:left="480" w:right="480"/>
     </w:pPr>
   </w:style>
   <w:style w:styleId="FootnoteText" w:type="paragraph">
-    <w:name w:val="Footnote Text"/>
+    <w:name w:val="footnote text"/>
     <w:basedOn w:val="Normal"/>
-    <w:next w:val="FootnoteText"/>
     <w:uiPriority w:val="9"/>
     <w:unhideWhenUsed/>
     <w:qFormat/>
   </w:style>
-  <w:style w:styleId="FootnoteBlockText" w:type="paragraph">
+  <w:style w:customStyle="1" w:styleId="FootnoteBlockText" w:type="paragraph">
     <w:name w:val="Footnote Block Text"/>
     <w:basedOn w:val="FootnoteText"/>
     <w:next w:val="FootnoteText"/>
@@ -3804,17 +3991,11 @@
     <w:qFormat/>
     <w:pPr>
       <w:spacing w:after="100" w:before="100"/>
-      <w:ind w:firstLine="0" w:left="480" w:right="480"/>
+      <w:ind w:left="480" w:right="480"/>
     </w:pPr>
   </w:style>
-  <w:style w:default="1" w:styleId="DefaultParagraphFont" w:type="character">
-    <w:name w:val="Default Paragraph Font"/>
-    <w:semiHidden/>
-    <w:unhideWhenUsed/>
-  </w:style>
-  <w:style w:default="1" w:styleId="Table" w:type="table">
+  <w:style w:customStyle="1" w:styleId="Table" w:type="table">
     <w:name w:val="Table"/>
-    <w:basedOn w:val="TableNormal"/>
     <w:semiHidden/>
     <w:unhideWhenUsed/>
     <w:qFormat/>
@@ -3828,9 +4009,10 @@
       </w:tblCellMar>
     </w:tblPr>
     <w:tblStylePr w:type="firstRow">
+      <w:tblPr/>
       <w:tcPr>
         <w:tcBorders>
-          <w:bottom w:val="single"/>
+          <w:bottom w:color="auto" w:space="0" w:sz="0" w:val="single"/>
         </w:tcBorders>
         <w:vAlign w:val="bottom"/>
       </w:tcPr>
@@ -3854,12 +4036,9 @@
     <w:basedOn w:val="Normal"/>
   </w:style>
   <w:style w:styleId="Caption" w:type="paragraph">
-    <w:name w:val="Caption"/>
+    <w:name w:val="caption"/>
     <w:basedOn w:val="Normal"/>
-    <w:link w:val="BodyTextChar"/>
-    <w:pPr>
-      <w:spacing w:after="120" w:before="0"/>
-    </w:pPr>
+    <w:link w:val="CaptionChar"/>
     <w:rPr>
       <w:i/>
     </w:rPr>
@@ -3886,14 +4065,15 @@
       <w:keepNext/>
     </w:pPr>
   </w:style>
-  <w:style w:customStyle="1" w:styleId="BodyTextChar" w:type="character">
-    <w:name w:val="Body Text Char"/>
+  <w:style w:customStyle="1" w:styleId="CaptionChar" w:type="character">
+    <w:name w:val="Caption Char"/>
     <w:basedOn w:val="DefaultParagraphFont"/>
-    <w:link w:val="BodyText"/>
+    <w:link w:val="Caption"/>
   </w:style>
   <w:style w:customStyle="1" w:styleId="VerbatimChar" w:type="character">
     <w:name w:val="Verbatim Char"/>
-    <w:basedOn w:val="BodyTextChar"/>
+    <w:basedOn w:val="CaptionChar"/>
+    <w:link w:val="SourceCode"/>
     <w:rPr>
       <w:rFonts w:ascii="Consolas" w:hAnsi="Consolas"/>
       <w:sz w:val="22"/>
@@ -3901,20 +4081,20 @@
   </w:style>
   <w:style w:customStyle="1" w:styleId="SectionNumber" w:type="character">
     <w:name w:val="Section Number"/>
-    <w:basedOn w:val="BodyTextChar"/>
+    <w:basedOn w:val="CaptionChar"/>
   </w:style>
   <w:style w:styleId="FootnoteReference" w:type="character">
-    <w:name w:val="Footnote Reference"/>
-    <w:basedOn w:val="BodyTextChar"/>
+    <w:name w:val="footnote reference"/>
+    <w:basedOn w:val="CaptionChar"/>
     <w:rPr>
       <w:vertAlign w:val="superscript"/>
     </w:rPr>
   </w:style>
   <w:style w:styleId="Hyperlink" w:type="character">
     <w:name w:val="Hyperlink"/>
-    <w:basedOn w:val="BodyTextChar"/>
-    <w:rPr>
-      <w:color w:themeColor="accent1" w:val="4F81BD"/>
+    <w:basedOn w:val="CaptionChar"/>
+    <w:rPr>
+      <w:color w:themeColor="accent1" w:val="156082"/>
     </w:rPr>
   </w:style>
   <w:style w:styleId="TOCHeading" w:type="paragraph">
@@ -3929,245 +4109,421 @@
       <w:outlineLvl w:val="9"/>
     </w:pPr>
     <w:rPr>
-      <w:rFonts w:asciiTheme="majorHAnsi" w:cstheme="majorBidi" w:eastAsiaTheme="majorEastAsia" w:hAnsiTheme="majorHAnsi"/>
       <w:b w:val="0"/>
-      <w:bCs w:val="0"/>
-      <w:color w:themeColor="accent1" w:themeShade="BF" w:val="365F91"/>
-    </w:rPr>
-  </w:style>
-  <w:style w:type="paragraph" w:customStyle="1" w:styleId="SourceCode">
+      <w:color w:themeColor="accent1" w:themeShade="BF" w:val="0F4761"/>
+    </w:rPr>
+  </w:style>
+  <w:style w:customStyle="1" w:styleId="SourceCode" w:type="paragraph">
     <w:name w:val="Source Code"/>
     <w:basedOn w:val="Normal"/>
     <w:link w:val="VerbatimChar"/>
     <w:pPr>
-      <w:wordWrap w:val="off"/>
+      <w:wordWrap w:val="0"/>
     </w:pPr>
   </w:style>
-  <w:style w:type="character" w:customStyle="1" w:styleId="KeywordTok">
+  <w:style w:customStyle="1" w:styleId="KeywordTok" w:type="character">
     <w:name w:val="KeywordTok"/>
     <w:basedOn w:val="VerbatimChar"/>
     <w:rPr>
+      <w:rFonts w:ascii="Consolas" w:hAnsi="Consolas"/>
       <w:b/>
       <w:color w:val="007020"/>
-    </w:rPr>
-  </w:style>
-  <w:style w:type="character" w:customStyle="1" w:styleId="DataTypeTok">
+      <w:sz w:val="22"/>
+    </w:rPr>
+  </w:style>
+  <w:style w:customStyle="1" w:styleId="DataTypeTok" w:type="character">
     <w:name w:val="DataTypeTok"/>
     <w:basedOn w:val="VerbatimChar"/>
     <w:rPr>
+      <w:rFonts w:ascii="Consolas" w:hAnsi="Consolas"/>
       <w:color w:val="902000"/>
-    </w:rPr>
-  </w:style>
-  <w:style w:type="character" w:customStyle="1" w:styleId="DecValTok">
+      <w:sz w:val="22"/>
+    </w:rPr>
+  </w:style>
+  <w:style w:customStyle="1" w:styleId="DecValTok" w:type="character">
     <w:name w:val="DecValTok"/>
     <w:basedOn w:val="VerbatimChar"/>
     <w:rPr>
-      <w:color w:val="40a070"/>
-    </w:rPr>
-  </w:style>
-  <w:style w:type="character" w:customStyle="1" w:styleId="BaseNTok">
+      <w:rFonts w:ascii="Consolas" w:hAnsi="Consolas"/>
+      <w:color w:val="40A070"/>
+      <w:sz w:val="22"/>
+    </w:rPr>
+  </w:style>
+  <w:style w:customStyle="1" w:styleId="BaseNTok" w:type="character">
     <w:name w:val="BaseNTok"/>
     <w:basedOn w:val="VerbatimChar"/>
     <w:rPr>
-      <w:color w:val="40a070"/>
-    </w:rPr>
-  </w:style>
-  <w:style w:type="character" w:customStyle="1" w:styleId="FloatTok">
+      <w:rFonts w:ascii="Consolas" w:hAnsi="Consolas"/>
+      <w:color w:val="40A070"/>
+      <w:sz w:val="22"/>
+    </w:rPr>
+  </w:style>
+  <w:style w:customStyle="1" w:styleId="FloatTok" w:type="character">
     <w:name w:val="FloatTok"/>
     <w:basedOn w:val="VerbatimChar"/>
     <w:rPr>
-      <w:color w:val="40a070"/>
-    </w:rPr>
-  </w:style>
-  <w:style w:type="character" w:customStyle="1" w:styleId="ConstantTok">
+      <w:rFonts w:ascii="Consolas" w:hAnsi="Consolas"/>
+      <w:color w:val="40A070"/>
+      <w:sz w:val="22"/>
+    </w:rPr>
+  </w:style>
+  <w:style w:customStyle="1" w:styleId="ConstantTok" w:type="character">
     <w:name w:val="ConstantTok"/>
     <w:basedOn w:val="VerbatimChar"/>
     <w:rPr>
+      <w:rFonts w:ascii="Consolas" w:hAnsi="Consolas"/>
       <w:color w:val="880000"/>
-    </w:rPr>
-  </w:style>
-  <w:style w:type="character" w:customStyle="1" w:styleId="CharTok">
+      <w:sz w:val="22"/>
+    </w:rPr>
+  </w:style>
+  <w:style w:customStyle="1" w:styleId="CharTok" w:type="character">
     <w:name w:val="CharTok"/>
     <w:basedOn w:val="VerbatimChar"/>
     <w:rPr>
-      <w:color w:val="4070a0"/>
-    </w:rPr>
-  </w:style>
-  <w:style w:type="character" w:customStyle="1" w:styleId="SpecialCharTok">
+      <w:rFonts w:ascii="Consolas" w:hAnsi="Consolas"/>
+      <w:color w:val="4070A0"/>
+      <w:sz w:val="22"/>
+    </w:rPr>
+  </w:style>
+  <w:style w:customStyle="1" w:styleId="SpecialCharTok" w:type="character">
     <w:name w:val="SpecialCharTok"/>
     <w:basedOn w:val="VerbatimChar"/>
     <w:rPr>
-      <w:color w:val="4070a0"/>
-    </w:rPr>
-  </w:style>
-  <w:style w:type="character" w:customStyle="1" w:styleId="StringTok">
+      <w:rFonts w:ascii="Consolas" w:hAnsi="Consolas"/>
+      <w:color w:val="4070A0"/>
+      <w:sz w:val="22"/>
+    </w:rPr>
+  </w:style>
+  <w:style w:customStyle="1" w:styleId="StringTok" w:type="character">
     <w:name w:val="StringTok"/>
     <w:basedOn w:val="VerbatimChar"/>
     <w:rPr>
-      <w:color w:val="4070a0"/>
-    </w:rPr>
-  </w:style>
-  <w:style w:type="character" w:customStyle="1" w:styleId="VerbatimStringTok">
+      <w:rFonts w:ascii="Consolas" w:hAnsi="Consolas"/>
+      <w:color w:val="4070A0"/>
+      <w:sz w:val="22"/>
+    </w:rPr>
+  </w:style>
+  <w:style w:customStyle="1" w:styleId="VerbatimStringTok" w:type="character">
     <w:name w:val="VerbatimStringTok"/>
     <w:basedOn w:val="VerbatimChar"/>
     <w:rPr>
-      <w:color w:val="4070a0"/>
-    </w:rPr>
-  </w:style>
-  <w:style w:type="character" w:customStyle="1" w:styleId="SpecialStringTok">
+      <w:rFonts w:ascii="Consolas" w:hAnsi="Consolas"/>
+      <w:color w:val="4070A0"/>
+      <w:sz w:val="22"/>
+    </w:rPr>
+  </w:style>
+  <w:style w:customStyle="1" w:styleId="SpecialStringTok" w:type="character">
     <w:name w:val="SpecialStringTok"/>
     <w:basedOn w:val="VerbatimChar"/>
     <w:rPr>
-      <w:color w:val="bb6688"/>
-    </w:rPr>
-  </w:style>
-  <w:style w:type="character" w:customStyle="1" w:styleId="ImportTok">
+      <w:rFonts w:ascii="Consolas" w:hAnsi="Consolas"/>
+      <w:color w:val="BB6688"/>
+      <w:sz w:val="22"/>
+    </w:rPr>
+  </w:style>
+  <w:style w:customStyle="1" w:styleId="ImportTok" w:type="character">
     <w:name w:val="ImportTok"/>
     <w:basedOn w:val="VerbatimChar"/>
     <w:rPr>
+      <w:rFonts w:ascii="Consolas" w:hAnsi="Consolas"/>
       <w:b/>
       <w:color w:val="008000"/>
-    </w:rPr>
-  </w:style>
-  <w:style w:type="character" w:customStyle="1" w:styleId="CommentTok">
+      <w:sz w:val="22"/>
+    </w:rPr>
+  </w:style>
+  <w:style w:customStyle="1" w:styleId="CommentTok" w:type="character">
     <w:name w:val="CommentTok"/>
     <w:basedOn w:val="VerbatimChar"/>
     <w:rPr>
+      <w:rFonts w:ascii="Consolas" w:hAnsi="Consolas"/>
       <w:i/>
-      <w:color w:val="60a0b0"/>
-    </w:rPr>
-  </w:style>
-  <w:style w:type="character" w:customStyle="1" w:styleId="DocumentationTok">
+      <w:color w:val="60A0B0"/>
+      <w:sz w:val="22"/>
+    </w:rPr>
+  </w:style>
+  <w:style w:customStyle="1" w:styleId="DocumentationTok" w:type="character">
     <w:name w:val="DocumentationTok"/>
     <w:basedOn w:val="VerbatimChar"/>
     <w:rPr>
+      <w:rFonts w:ascii="Consolas" w:hAnsi="Consolas"/>
       <w:i/>
-      <w:color w:val="ba2121"/>
-    </w:rPr>
-  </w:style>
-  <w:style w:type="character" w:customStyle="1" w:styleId="AnnotationTok">
+      <w:color w:val="BA2121"/>
+      <w:sz w:val="22"/>
+    </w:rPr>
+  </w:style>
+  <w:style w:customStyle="1" w:styleId="AnnotationTok" w:type="character">
     <w:name w:val="AnnotationTok"/>
     <w:basedOn w:val="VerbatimChar"/>
     <w:rPr>
+      <w:rFonts w:ascii="Consolas" w:hAnsi="Consolas"/>
       <w:b/>
       <w:i/>
-      <w:color w:val="60a0b0"/>
-    </w:rPr>
-  </w:style>
-  <w:style w:type="character" w:customStyle="1" w:styleId="CommentVarTok">
+      <w:color w:val="60A0B0"/>
+      <w:sz w:val="22"/>
+    </w:rPr>
+  </w:style>
+  <w:style w:customStyle="1" w:styleId="CommentVarTok" w:type="character">
     <w:name w:val="CommentVarTok"/>
     <w:basedOn w:val="VerbatimChar"/>
     <w:rPr>
+      <w:rFonts w:ascii="Consolas" w:hAnsi="Consolas"/>
       <w:b/>
       <w:i/>
-      <w:color w:val="60a0b0"/>
-    </w:rPr>
-  </w:style>
-  <w:style w:type="character" w:customStyle="1" w:styleId="OtherTok">
+      <w:color w:val="60A0B0"/>
+      <w:sz w:val="22"/>
+    </w:rPr>
+  </w:style>
+  <w:style w:customStyle="1" w:styleId="OtherTok" w:type="character">
     <w:name w:val="OtherTok"/>
     <w:basedOn w:val="VerbatimChar"/>
     <w:rPr>
+      <w:rFonts w:ascii="Consolas" w:hAnsi="Consolas"/>
       <w:color w:val="007020"/>
-    </w:rPr>
-  </w:style>
-  <w:style w:type="character" w:customStyle="1" w:styleId="FunctionTok">
+      <w:sz w:val="22"/>
+    </w:rPr>
+  </w:style>
+  <w:style w:customStyle="1" w:styleId="FunctionTok" w:type="character">
     <w:name w:val="FunctionTok"/>
     <w:basedOn w:val="VerbatimChar"/>
     <w:rPr>
-      <w:color w:val="06287e"/>
-    </w:rPr>
-  </w:style>
-  <w:style w:type="character" w:customStyle="1" w:styleId="VariableTok">
+      <w:rFonts w:ascii="Consolas" w:hAnsi="Consolas"/>
+      <w:color w:val="06287E"/>
+      <w:sz w:val="22"/>
+    </w:rPr>
+  </w:style>
+  <w:style w:customStyle="1" w:styleId="VariableTok" w:type="character">
     <w:name w:val="VariableTok"/>
     <w:basedOn w:val="VerbatimChar"/>
     <w:rPr>
-      <w:color w:val="19177c"/>
-    </w:rPr>
-  </w:style>
-  <w:style w:type="character" w:customStyle="1" w:styleId="ControlFlowTok">
+      <w:rFonts w:ascii="Consolas" w:hAnsi="Consolas"/>
+      <w:color w:val="19177C"/>
+      <w:sz w:val="22"/>
+    </w:rPr>
+  </w:style>
+  <w:style w:customStyle="1" w:styleId="ControlFlowTok" w:type="character">
     <w:name w:val="ControlFlowTok"/>
     <w:basedOn w:val="VerbatimChar"/>
     <w:rPr>
+      <w:rFonts w:ascii="Consolas" w:hAnsi="Consolas"/>
       <w:b/>
       <w:color w:val="007020"/>
-    </w:rPr>
-  </w:style>
-  <w:style w:type="character" w:customStyle="1" w:styleId="OperatorTok">
+      <w:sz w:val="22"/>
+    </w:rPr>
+  </w:style>
+  <w:style w:customStyle="1" w:styleId="OperatorTok" w:type="character">
     <w:name w:val="OperatorTok"/>
     <w:basedOn w:val="VerbatimChar"/>
     <w:rPr>
+      <w:rFonts w:ascii="Consolas" w:hAnsi="Consolas"/>
       <w:color w:val="666666"/>
-    </w:rPr>
-  </w:style>
-  <w:style w:type="character" w:customStyle="1" w:styleId="BuiltInTok">
+      <w:sz w:val="22"/>
+    </w:rPr>
+  </w:style>
+  <w:style w:customStyle="1" w:styleId="BuiltInTok" w:type="character">
     <w:name w:val="BuiltInTok"/>
     <w:basedOn w:val="VerbatimChar"/>
     <w:rPr>
+      <w:rFonts w:ascii="Consolas" w:hAnsi="Consolas"/>
       <w:color w:val="008000"/>
-    </w:rPr>
-  </w:style>
-  <w:style w:type="character" w:customStyle="1" w:styleId="ExtensionTok">
+      <w:sz w:val="22"/>
+    </w:rPr>
+  </w:style>
+  <w:style w:customStyle="1" w:styleId="ExtensionTok" w:type="character">
     <w:name w:val="ExtensionTok"/>
     <w:basedOn w:val="VerbatimChar"/>
-    <w:rPr/>
-  </w:style>
-  <w:style w:type="character" w:customStyle="1" w:styleId="PreprocessorTok">
+    <w:rPr>
+      <w:rFonts w:ascii="Consolas" w:hAnsi="Consolas"/>
+      <w:sz w:val="22"/>
+    </w:rPr>
+  </w:style>
+  <w:style w:customStyle="1" w:styleId="PreprocessorTok" w:type="character">
     <w:name w:val="PreprocessorTok"/>
     <w:basedOn w:val="VerbatimChar"/>
     <w:rPr>
-      <w:color w:val="bc7a00"/>
-    </w:rPr>
-  </w:style>
-  <w:style w:type="character" w:customStyle="1" w:styleId="AttributeTok">
+      <w:rFonts w:ascii="Consolas" w:hAnsi="Consolas"/>
+      <w:color w:val="BC7A00"/>
+      <w:sz w:val="22"/>
+    </w:rPr>
+  </w:style>
+  <w:style w:customStyle="1" w:styleId="AttributeTok" w:type="character">
     <w:name w:val="AttributeTok"/>
     <w:basedOn w:val="VerbatimChar"/>
     <w:rPr>
-      <w:color w:val="7d9029"/>
-    </w:rPr>
-  </w:style>
-  <w:style w:type="character" w:customStyle="1" w:styleId="RegionMarkerTok">
+      <w:rFonts w:ascii="Consolas" w:hAnsi="Consolas"/>
+      <w:color w:val="7D9029"/>
+      <w:sz w:val="22"/>
+    </w:rPr>
+  </w:style>
+  <w:style w:customStyle="1" w:styleId="RegionMarkerTok" w:type="character">
     <w:name w:val="RegionMarkerTok"/>
     <w:basedOn w:val="VerbatimChar"/>
-    <w:rPr/>
-  </w:style>
-  <w:style w:type="character" w:customStyle="1" w:styleId="InformationTok">
+    <w:rPr>
+      <w:rFonts w:ascii="Consolas" w:hAnsi="Consolas"/>
+      <w:sz w:val="22"/>
+    </w:rPr>
+  </w:style>
+  <w:style w:customStyle="1" w:styleId="InformationTok" w:type="character">
     <w:name w:val="InformationTok"/>
     <w:basedOn w:val="VerbatimChar"/>
     <w:rPr>
+      <w:rFonts w:ascii="Consolas" w:hAnsi="Consolas"/>
       <w:b/>
       <w:i/>
-      <w:color w:val="60a0b0"/>
-    </w:rPr>
-  </w:style>
-  <w:style w:type="character" w:customStyle="1" w:styleId="WarningTok">
+      <w:color w:val="60A0B0"/>
+      <w:sz w:val="22"/>
+    </w:rPr>
+  </w:style>
+  <w:style w:customStyle="1" w:styleId="WarningTok" w:type="character">
     <w:name w:val="WarningTok"/>
     <w:basedOn w:val="VerbatimChar"/>
     <w:rPr>
+      <w:rFonts w:ascii="Consolas" w:hAnsi="Consolas"/>
       <w:b/>
       <w:i/>
-      <w:color w:val="60a0b0"/>
-    </w:rPr>
-  </w:style>
-  <w:style w:type="character" w:customStyle="1" w:styleId="AlertTok">
+      <w:color w:val="60A0B0"/>
+      <w:sz w:val="22"/>
+    </w:rPr>
+  </w:style>
+  <w:style w:customStyle="1" w:styleId="AlertTok" w:type="character">
     <w:name w:val="AlertTok"/>
     <w:basedOn w:val="VerbatimChar"/>
     <w:rPr>
+      <w:rFonts w:ascii="Consolas" w:hAnsi="Consolas"/>
       <w:b/>
-      <w:color w:val="ff0000"/>
-    </w:rPr>
-  </w:style>
-  <w:style w:type="character" w:customStyle="1" w:styleId="ErrorTok">
+      <w:color w:val="FF0000"/>
+      <w:sz w:val="22"/>
+    </w:rPr>
+  </w:style>
+  <w:style w:customStyle="1" w:styleId="ErrorTok" w:type="character">
     <w:name w:val="ErrorTok"/>
     <w:basedOn w:val="VerbatimChar"/>
     <w:rPr>
+      <w:rFonts w:ascii="Consolas" w:hAnsi="Consolas"/>
       <w:b/>
-      <w:color w:val="ff0000"/>
-    </w:rPr>
-  </w:style>
-  <w:style w:type="character" w:customStyle="1" w:styleId="NormalTok">
+      <w:color w:val="FF0000"/>
+      <w:sz w:val="22"/>
+    </w:rPr>
+  </w:style>
+  <w:style w:customStyle="1" w:styleId="NormalTok" w:type="character">
     <w:name w:val="NormalTok"/>
     <w:basedOn w:val="VerbatimChar"/>
-    <w:rPr/>
+    <w:rPr>
+      <w:rFonts w:ascii="Consolas" w:hAnsi="Consolas"/>
+      <w:sz w:val="22"/>
+    </w:rPr>
+  </w:style>
+  <w:style w:styleId="Header" w:type="paragraph">
+    <w:name w:val="header"/>
+    <w:basedOn w:val="Normal"/>
+    <w:link w:val="HeaderChar"/>
+    <w:rsid w:val="007B2E58"/>
+    <w:pPr>
+      <w:tabs>
+        <w:tab w:pos="4680" w:val="center"/>
+        <w:tab w:pos="9360" w:val="right"/>
+      </w:tabs>
+      <w:spacing w:after="0" w:line="240" w:lineRule="auto"/>
+    </w:pPr>
+  </w:style>
+  <w:style w:customStyle="1" w:styleId="HeaderChar" w:type="character">
+    <w:name w:val="Header Char"/>
+    <w:basedOn w:val="DefaultParagraphFont"/>
+    <w:link w:val="Header"/>
+    <w:rsid w:val="007B2E58"/>
+    <w:rPr>
+      <w:rFonts w:ascii="Times New Roman" w:cs="Times New Roman" w:hAnsi="Times New Roman"/>
+    </w:rPr>
+  </w:style>
+  <w:style w:styleId="Footer" w:type="paragraph">
+    <w:name w:val="footer"/>
+    <w:basedOn w:val="Normal"/>
+    <w:link w:val="FooterChar"/>
+    <w:rsid w:val="007B2E58"/>
+    <w:pPr>
+      <w:tabs>
+        <w:tab w:pos="4680" w:val="center"/>
+        <w:tab w:pos="9360" w:val="right"/>
+      </w:tabs>
+      <w:spacing w:after="0" w:line="240" w:lineRule="auto"/>
+    </w:pPr>
+  </w:style>
+  <w:style w:customStyle="1" w:styleId="FooterChar" w:type="character">
+    <w:name w:val="Footer Char"/>
+    <w:basedOn w:val="DefaultParagraphFont"/>
+    <w:link w:val="Footer"/>
+    <w:rsid w:val="007B2E58"/>
+    <w:rPr>
+      <w:rFonts w:ascii="Times New Roman" w:cs="Times New Roman" w:hAnsi="Times New Roman"/>
+    </w:rPr>
+  </w:style>
+  <w:style w:styleId="Bibliography" w:type="paragraph">
+    <w:name w:val="Bibliography"/>
+    <w:basedOn w:val="Normal"/>
+    <w:qFormat/>
+    <w:pPr>
+      <w:spacing w:after="120" w:line="480" w:lineRule="auto"/>
+      <w:ind w:hanging="720" w:left="720"/>
+      <w:jc w:val="both"/>
+    </w:pPr>
+  </w:style>
+  <w:style w:styleId="CoverOrg" w:type="paragraph">
+    <w:name w:val="CoverOrg"/>
+    <w:basedOn w:val="Normal"/>
+    <w:qFormat/>
+    <w:pPr>
+      <w:spacing w:after="240" w:before="240" w:line="480" w:lineRule="auto"/>
+      <w:jc w:val="center"/>
+    </w:pPr>
+    <w:rPr>
+      <w:b/>
+      <w:sz w:val="28"/>
+      <w:szCs w:val="28"/>
+    </w:rPr>
+  </w:style>
+  <w:style w:styleId="CoverTitle" w:type="paragraph">
+    <w:name w:val="CoverTitle"/>
+    <w:basedOn w:val="Normal"/>
+    <w:qFormat/>
+    <w:pPr>
+      <w:spacing w:after="120" w:before="240" w:line="480" w:lineRule="auto"/>
+      <w:jc w:val="center"/>
+    </w:pPr>
+    <w:rPr>
+      <w:b/>
+      <w:sz w:val="28"/>
+      <w:szCs w:val="28"/>
+    </w:rPr>
+  </w:style>
+  <w:style w:styleId="CoverSubtitle" w:type="paragraph">
+    <w:name w:val="CoverSubtitle"/>
+    <w:basedOn w:val="Normal"/>
+    <w:qFormat/>
+    <w:pPr>
+      <w:spacing w:after="120" w:line="480" w:lineRule="auto"/>
+      <w:jc w:val="center"/>
+    </w:pPr>
+    <w:rPr>
+      <w:i/>
+      <w:sz w:val="24"/>
+    </w:rPr>
+  </w:style>
+  <w:style w:styleId="CoverInfo" w:type="paragraph">
+    <w:name w:val="CoverInfo"/>
+    <w:basedOn w:val="Normal"/>
+    <w:qFormat/>
+    <w:pPr>
+      <w:spacing w:after="120" w:line="480" w:lineRule="auto"/>
+      <w:jc w:val="center"/>
+    </w:pPr>
+  </w:style>
+  <w:style w:styleId="FigureImage" w:type="paragraph">
+    <w:name w:val="FigureImage"/>
+    <w:basedOn w:val="Normal"/>
+    <w:qFormat/>
+    <w:pPr>
+      <w:spacing w:after="120" w:before="120" w:line="240" w:lineRule="auto"/>
+      <w:jc w:val="center"/>
+    </w:pPr>
   </w:style>
 </w:styles>
 </file>

</xml_diff>

<commit_message>
Fixed-width table grids (wider label column)
</commit_message>
<xml_diff>
--- a/docs/paper/paper-final.docx
+++ b/docs/paper/paper-final.docx
@@ -552,17 +552,18 @@
     </w:p>
     <w:tbl>
       <w:tblPr>
+        <w:tblLayout w:type="fixed"/>
         <w:tblStyle w:val="Table"/>
         <w:tblW w:type="auto" w:w="0"/>
         <w:tblLook w:firstRow="1" w:lastRow="0" w:firstColumn="0" w:lastColumn="0" w:noHBand="0" w:noVBand="0" w:val="0020"/>
       </w:tblPr>
       <w:tblGrid>
-        <w:gridCol w:w="1320"/>
-        <w:gridCol w:w="1320"/>
-        <w:gridCol w:w="1320"/>
-        <w:gridCol w:w="1320"/>
-        <w:gridCol w:w="1320"/>
-        <w:gridCol w:w="1320"/>
+        <w:gridCol w:w="2674"/>
+        <w:gridCol w:w="1337"/>
+        <w:gridCol w:w="1337"/>
+        <w:gridCol w:w="1337"/>
+        <w:gridCol w:w="1337"/>
+        <w:gridCol w:w="1338"/>
       </w:tblGrid>
       <w:tr>
         <w:trPr>
@@ -1356,15 +1357,16 @@
     </w:p>
     <w:tbl>
       <w:tblPr>
+        <w:tblLayout w:type="fixed"/>
         <w:tblStyle w:val="Table"/>
         <w:tblW w:type="pct" w:w="5000"/>
         <w:tblLayout w:type="fixed"/>
         <w:tblLook w:firstRow="1" w:lastRow="0" w:firstColumn="0" w:lastColumn="0" w:noHBand="0" w:noVBand="0" w:val="0020"/>
       </w:tblPr>
       <w:tblGrid>
-        <w:gridCol w:w="2640"/>
-        <w:gridCol w:w="2640"/>
-        <w:gridCol w:w="2640"/>
+        <w:gridCol w:w="4680"/>
+        <w:gridCol w:w="2340"/>
+        <w:gridCol w:w="2340"/>
       </w:tblGrid>
       <w:tr>
         <w:trPr>

</xml_diff>

<commit_message>
House-standard layout: distributed title page, new impactful title, keep-together tables/figures, smaller captions
</commit_message>
<xml_diff>
--- a/docs/paper/paper-final.docx
+++ b/docs/paper/paper-final.docx
@@ -12,18 +12,15 @@
     </w:p>
     <w:p>
       <w:pPr>
-        <w:pStyle w:val="BodyText"/>
-      </w:pPr>
-      <w:r>
-        <w:t xml:space="preserve"> </w:t>
-      </w:r>
+        <w:spacing w:after="1700"/>
+      </w:pPr>
     </w:p>
     <w:p>
       <w:pPr>
         <w:pStyle w:val="CoverTitle"/>
       </w:pPr>
       <w:r>
-        <w:t xml:space="preserve">Ponto de operação, protocolo e a fragilidade do ranking de arquiteturas na detecção de fraude em cartões</w:t>
+        <w:t xml:space="preserve">O limiar importa mais que o modelo: dominância do ponto de operação na detecção de fraude em cartões</w:t>
       </w:r>
     </w:p>
     <w:p>
@@ -36,11 +33,8 @@
     </w:p>
     <w:p>
       <w:pPr>
-        <w:pStyle w:val="BodyText"/>
-      </w:pPr>
-      <w:r>
-        <w:t xml:space="preserve"> </w:t>
-      </w:r>
+        <w:spacing w:after="1100"/>
+      </w:pPr>
     </w:p>
     <w:p>
       <w:pPr>
@@ -59,7 +53,7 @@
         <w:pStyle w:val="CoverInfo"/>
       </w:pPr>
       <w:r>
-        <w:t xml:space="preserve">Codex Hash Research Laboratory, Codex Hash Ltda., Brazil</w:t>
+        <w:t xml:space="preserve">Mestrando em Inteligência Artificial</w:t>
       </w:r>
     </w:p>
     <w:p>
@@ -67,16 +61,21 @@
         <w:pStyle w:val="CoverInfo"/>
       </w:pPr>
       <w:r>
+        <w:t xml:space="preserve">Codex Hash — São Paulo, Brazil</w:t>
+      </w:r>
+    </w:p>
+    <w:p>
+      <w:pPr>
+        <w:pStyle w:val="CoverSmall"/>
+      </w:pPr>
+      <w:r>
         <w:t xml:space="preserve">ORCID: 0000-0002-6034-7765</w:t>
       </w:r>
     </w:p>
     <w:p>
       <w:pPr>
-        <w:pStyle w:val="BodyText"/>
-      </w:pPr>
-      <w:r>
-        <w:t xml:space="preserve"> </w:t>
-      </w:r>
+        <w:spacing w:after="1700"/>
+      </w:pPr>
     </w:p>
     <w:p>
       <w:pPr>
@@ -278,31 +277,23 @@
     </w:p>
     <w:p>
       <w:pPr>
-        <w:pStyle w:val="BodyText"/>
-      </w:pPr>
-      <w:r>
-        <w:rPr>
-          <w:b/>
-          <w:bCs/>
-        </w:rPr>
+        <w:pStyle w:val="CaptionLabel"/>
+      </w:pPr>
+      <w:r>
         <w:t xml:space="preserve">Figura 1</w:t>
       </w:r>
     </w:p>
     <w:p>
       <w:pPr>
-        <w:pStyle w:val="BodyText"/>
-      </w:pPr>
-      <w:r>
-        <w:rPr>
-          <w:i/>
-          <w:iCs/>
-        </w:rPr>
+        <w:pStyle w:val="CaptionText"/>
+      </w:pPr>
+      <w:r>
         <w:t xml:space="preserve">Distribuição de classes no conjunto de teste (escala logarítmica): 42.648 transações legítimas contra 74 fraudes (prevalência 0,173%)</w:t>
       </w:r>
     </w:p>
     <w:p>
       <w:pPr>
-        <w:pStyle w:val="BodyText"/>
+        <w:pStyle w:val="FigureImage"/>
       </w:pPr>
       <w:r>
         <w:drawing>
@@ -457,31 +448,23 @@
     </w:p>
     <w:p>
       <w:pPr>
-        <w:pStyle w:val="BodyText"/>
-      </w:pPr>
-      <w:r>
-        <w:rPr>
-          <w:b/>
-          <w:bCs/>
-        </w:rPr>
+        <w:pStyle w:val="CaptionLabel"/>
+      </w:pPr>
+      <w:r>
         <w:t xml:space="preserve">Figura 2</w:t>
       </w:r>
     </w:p>
     <w:p>
       <w:pPr>
-        <w:pStyle w:val="BodyText"/>
-      </w:pPr>
-      <w:r>
-        <w:rPr>
-          <w:i/>
-          <w:iCs/>
-        </w:rPr>
+        <w:pStyle w:val="CaptionText"/>
+      </w:pPr>
+      <w:r>
         <w:t xml:space="preserve">Curvas precisão-revocação no teste para as quatro famílias de modelos, com AUC-PR por modelo. Os supervisionados (MLP e LR) dominam os não supervisionados em todo o espaço de revocação</w:t>
       </w:r>
     </w:p>
     <w:p>
       <w:pPr>
-        <w:pStyle w:val="BodyText"/>
+        <w:pStyle w:val="FigureImage"/>
       </w:pPr>
       <w:r>
         <w:drawing>
@@ -528,25 +511,17 @@
     </w:p>
     <w:p>
       <w:pPr>
-        <w:pStyle w:val="BodyText"/>
-      </w:pPr>
-      <w:r>
-        <w:rPr>
-          <w:b/>
-          <w:bCs/>
-        </w:rPr>
+        <w:pStyle w:val="CaptionLabel"/>
+      </w:pPr>
+      <w:r>
         <w:t xml:space="preserve">Tabela 1</w:t>
       </w:r>
     </w:p>
     <w:p>
       <w:pPr>
-        <w:pStyle w:val="BodyText"/>
-      </w:pPr>
-      <w:r>
-        <w:rPr>
-          <w:i/>
-          <w:iCs/>
-        </w:rPr>
+        <w:pStyle w:val="CaptionText"/>
+      </w:pPr>
+      <w:r>
         <w:t xml:space="preserve">Desempenho no teste por modelo e ponto de operação</w:t>
       </w:r>
     </w:p>
@@ -573,6 +548,7 @@
           <w:tcPr/>
           <w:p>
             <w:pPr>
+              <w:keepNext/>
               <w:pStyle w:val="Compact"/>
             </w:pPr>
             <w:r>
@@ -584,6 +560,7 @@
           <w:tcPr/>
           <w:p>
             <w:pPr>
+              <w:keepNext/>
               <w:pStyle w:val="Compact"/>
             </w:pPr>
             <w:r>
@@ -595,6 +572,7 @@
           <w:tcPr/>
           <w:p>
             <w:pPr>
+              <w:keepNext/>
               <w:pStyle w:val="Compact"/>
             </w:pPr>
             <w:r>
@@ -606,6 +584,7 @@
           <w:tcPr/>
           <w:p>
             <w:pPr>
+              <w:keepNext/>
               <w:pStyle w:val="Compact"/>
             </w:pPr>
             <w:r>
@@ -617,6 +596,7 @@
           <w:tcPr/>
           <w:p>
             <w:pPr>
+              <w:keepNext/>
               <w:pStyle w:val="Compact"/>
             </w:pPr>
             <w:r>
@@ -628,6 +608,7 @@
           <w:tcPr/>
           <w:p>
             <w:pPr>
+              <w:keepNext/>
               <w:pStyle w:val="Compact"/>
             </w:pPr>
             <w:r>
@@ -641,6 +622,7 @@
           <w:tcPr/>
           <w:p>
             <w:pPr>
+              <w:keepNext/>
               <w:pStyle w:val="Compact"/>
             </w:pPr>
             <w:r>
@@ -652,6 +634,7 @@
           <w:tcPr/>
           <w:p>
             <w:pPr>
+              <w:keepNext/>
               <w:pStyle w:val="Compact"/>
             </w:pPr>
             <w:r>
@@ -663,6 +646,7 @@
           <w:tcPr/>
           <w:p>
             <w:pPr>
+              <w:keepNext/>
               <w:pStyle w:val="Compact"/>
             </w:pPr>
             <w:r>
@@ -674,6 +658,7 @@
           <w:tcPr/>
           <w:p>
             <w:pPr>
+              <w:keepNext/>
               <w:pStyle w:val="Compact"/>
             </w:pPr>
             <w:r>
@@ -685,6 +670,7 @@
           <w:tcPr/>
           <w:p>
             <w:pPr>
+              <w:keepNext/>
               <w:pStyle w:val="Compact"/>
             </w:pPr>
             <w:r>
@@ -696,6 +682,7 @@
           <w:tcPr/>
           <w:p>
             <w:pPr>
+              <w:keepNext/>
               <w:pStyle w:val="Compact"/>
             </w:pPr>
             <w:r>
@@ -709,6 +696,7 @@
           <w:tcPr/>
           <w:p>
             <w:pPr>
+              <w:keepNext/>
               <w:pStyle w:val="Compact"/>
             </w:pPr>
             <w:r>
@@ -720,6 +708,7 @@
           <w:tcPr/>
           <w:p>
             <w:pPr>
+              <w:keepNext/>
               <w:pStyle w:val="Compact"/>
             </w:pPr>
             <w:r>
@@ -731,6 +720,7 @@
           <w:tcPr/>
           <w:p>
             <w:pPr>
+              <w:keepNext/>
               <w:pStyle w:val="Compact"/>
             </w:pPr>
             <w:r>
@@ -742,6 +732,7 @@
           <w:tcPr/>
           <w:p>
             <w:pPr>
+              <w:keepNext/>
               <w:pStyle w:val="Compact"/>
             </w:pPr>
             <w:r>
@@ -753,6 +744,7 @@
           <w:tcPr/>
           <w:p>
             <w:pPr>
+              <w:keepNext/>
               <w:pStyle w:val="Compact"/>
             </w:pPr>
             <w:r>
@@ -764,6 +756,7 @@
           <w:tcPr/>
           <w:p>
             <w:pPr>
+              <w:keepNext/>
               <w:pStyle w:val="Compact"/>
             </w:pPr>
             <w:r>
@@ -777,6 +770,7 @@
           <w:tcPr/>
           <w:p>
             <w:pPr>
+              <w:keepNext/>
               <w:pStyle w:val="Compact"/>
             </w:pPr>
             <w:r>
@@ -788,6 +782,7 @@
           <w:tcPr/>
           <w:p>
             <w:pPr>
+              <w:keepNext/>
               <w:pStyle w:val="Compact"/>
             </w:pPr>
             <w:r>
@@ -799,6 +794,7 @@
           <w:tcPr/>
           <w:p>
             <w:pPr>
+              <w:keepNext/>
               <w:pStyle w:val="Compact"/>
             </w:pPr>
             <w:r>
@@ -810,6 +806,7 @@
           <w:tcPr/>
           <w:p>
             <w:pPr>
+              <w:keepNext/>
               <w:pStyle w:val="Compact"/>
             </w:pPr>
             <w:r>
@@ -821,6 +818,7 @@
           <w:tcPr/>
           <w:p>
             <w:pPr>
+              <w:keepNext/>
               <w:pStyle w:val="Compact"/>
             </w:pPr>
             <w:r>
@@ -832,6 +830,7 @@
           <w:tcPr/>
           <w:p>
             <w:pPr>
+              <w:keepNext/>
               <w:pStyle w:val="Compact"/>
             </w:pPr>
             <w:r>
@@ -845,6 +844,7 @@
           <w:tcPr/>
           <w:p>
             <w:pPr>
+              <w:keepNext/>
               <w:pStyle w:val="Compact"/>
             </w:pPr>
             <w:r>
@@ -856,6 +856,7 @@
           <w:tcPr/>
           <w:p>
             <w:pPr>
+              <w:keepNext/>
               <w:pStyle w:val="Compact"/>
             </w:pPr>
             <w:r>
@@ -867,6 +868,7 @@
           <w:tcPr/>
           <w:p>
             <w:pPr>
+              <w:keepNext/>
               <w:pStyle w:val="Compact"/>
             </w:pPr>
             <w:r>
@@ -878,6 +880,7 @@
           <w:tcPr/>
           <w:p>
             <w:pPr>
+              <w:keepNext/>
               <w:pStyle w:val="Compact"/>
             </w:pPr>
             <w:r>
@@ -889,6 +892,7 @@
           <w:tcPr/>
           <w:p>
             <w:pPr>
+              <w:keepNext/>
               <w:pStyle w:val="Compact"/>
             </w:pPr>
             <w:r>
@@ -900,6 +904,7 @@
           <w:tcPr/>
           <w:p>
             <w:pPr>
+              <w:keepNext/>
               <w:pStyle w:val="Compact"/>
             </w:pPr>
             <w:r>
@@ -913,6 +918,7 @@
           <w:tcPr/>
           <w:p>
             <w:pPr>
+              <w:keepNext/>
               <w:pStyle w:val="Compact"/>
             </w:pPr>
             <w:r>
@@ -924,6 +930,7 @@
           <w:tcPr/>
           <w:p>
             <w:pPr>
+              <w:keepNext/>
               <w:pStyle w:val="Compact"/>
             </w:pPr>
             <w:r>
@@ -935,6 +942,7 @@
           <w:tcPr/>
           <w:p>
             <w:pPr>
+              <w:keepNext/>
               <w:pStyle w:val="Compact"/>
             </w:pPr>
             <w:r>
@@ -946,6 +954,7 @@
           <w:tcPr/>
           <w:p>
             <w:pPr>
+              <w:keepNext/>
               <w:pStyle w:val="Compact"/>
             </w:pPr>
             <w:r>
@@ -957,6 +966,7 @@
           <w:tcPr/>
           <w:p>
             <w:pPr>
+              <w:keepNext/>
               <w:pStyle w:val="Compact"/>
             </w:pPr>
             <w:r>
@@ -968,6 +978,7 @@
           <w:tcPr/>
           <w:p>
             <w:pPr>
+              <w:keepNext/>
               <w:pStyle w:val="Compact"/>
             </w:pPr>
             <w:r>
@@ -1047,7 +1058,7 @@
     </w:tbl>
     <w:p>
       <w:pPr>
-        <w:pStyle w:val="BodyText"/>
+        <w:pStyle w:val="TableNote"/>
       </w:pPr>
       <w:r>
         <w:rPr>
@@ -1082,31 +1093,23 @@
     </w:p>
     <w:p>
       <w:pPr>
-        <w:pStyle w:val="BodyText"/>
-      </w:pPr>
-      <w:r>
-        <w:rPr>
-          <w:b/>
-          <w:bCs/>
-        </w:rPr>
+        <w:pStyle w:val="CaptionLabel"/>
+      </w:pPr>
+      <w:r>
         <w:t xml:space="preserve">Figura 3</w:t>
       </w:r>
     </w:p>
     <w:p>
       <w:pPr>
-        <w:pStyle w:val="BodyText"/>
-      </w:pPr>
-      <w:r>
-        <w:rPr>
-          <w:i/>
-          <w:iCs/>
-        </w:rPr>
+        <w:pStyle w:val="CaptionText"/>
+      </w:pPr>
+      <w:r>
         <w:t xml:space="preserve">Varredura de limiar do MLP (validação e teste) sobre a grade 0,01–0,99, com o default 0,5, o teto da grade (0,99) e o ótimo não-censurado τ*=0,9994 (estrela) marcados. O deslocamento do ponto de operação move o F1 mais do que qualquer troca de arquitetura da Tabela 1</w:t>
       </w:r>
     </w:p>
     <w:p>
       <w:pPr>
-        <w:pStyle w:val="BodyText"/>
+        <w:pStyle w:val="FigureImage"/>
       </w:pPr>
       <w:r>
         <w:drawing>
@@ -1150,40 +1153,34 @@
           </wp:inline>
         </w:drawing>
       </w:r>
-      <w:r>
-        <w:t xml:space="preserve"> </w:t>
-      </w:r>
+    </w:p>
+    <w:p>
+      <w:pPr>
+        <w:pStyle w:val="BodyText"/>
+      </w:pPr>
       <w:r>
         <w:t xml:space="preserve">Em termos operacionais, os falsos positivos caem de 348 para 8 (−97,7%) ao custo de 9 verdadeiros positivos (65→56); a Figura 4 contrasta as matrizes de confusão nos dois pontos.</w:t>
       </w:r>
     </w:p>
     <w:p>
       <w:pPr>
-        <w:pStyle w:val="BodyText"/>
-      </w:pPr>
-      <w:r>
-        <w:rPr>
-          <w:b/>
-          <w:bCs/>
-        </w:rPr>
+        <w:pStyle w:val="CaptionLabel"/>
+      </w:pPr>
+      <w:r>
         <w:t xml:space="preserve">Figura 4</w:t>
       </w:r>
     </w:p>
     <w:p>
       <w:pPr>
-        <w:pStyle w:val="BodyText"/>
-      </w:pPr>
-      <w:r>
-        <w:rPr>
-          <w:i/>
-          <w:iCs/>
-        </w:rPr>
+        <w:pStyle w:val="CaptionText"/>
+      </w:pPr>
+      <w:r>
         <w:t xml:space="preserve">Matrizes de confusão do MLP no teste nos dois pontos de operação: no default 0,5, 348 falsos positivos e 9 falsos negativos; em τ*=0,9994, 8 falsos positivos e 18 falsos negativos. O mesmo modelo, dois comportamentos operacionais</w:t>
       </w:r>
     </w:p>
     <w:p>
       <w:pPr>
-        <w:pStyle w:val="BodyText"/>
+        <w:pStyle w:val="FigureImage"/>
       </w:pPr>
       <w:r>
         <w:drawing>
@@ -1227,9 +1224,11 @@
           </wp:inline>
         </w:drawing>
       </w:r>
-      <w:r>
-        <w:t xml:space="preserve"> </w:t>
-      </w:r>
+    </w:p>
+    <w:p>
+      <w:pPr>
+        <w:pStyle w:val="BodyText"/>
+      </w:pPr>
       <w:r>
         <w:t xml:space="preserve">O Fβ=2, que pesa revocação sobre precisão, atinge 0,779 no teste no limiar correspondente. A comparação entre o swing de limiar e o gap entre arquiteturas exige uma ressalva de comensurabilidade: o primeiro corrige uma má configuração (o default 0,5 é um ponto operacional catastrófico sob reponderação de custo), enquanto o segundo compara alternativas ambas otimizadas. É exatamente essa a mensagem de engenharia: a correção barata e auditável precede — e excede em efeito, aqui por duas ordens de magnitude — a decisão cara de arquitetura.</w:t>
       </w:r>
@@ -1262,31 +1261,23 @@
     </w:p>
     <w:p>
       <w:pPr>
-        <w:pStyle w:val="BodyText"/>
-      </w:pPr>
-      <w:r>
-        <w:rPr>
-          <w:b/>
-          <w:bCs/>
-        </w:rPr>
+        <w:pStyle w:val="CaptionLabel"/>
+      </w:pPr>
+      <w:r>
         <w:t xml:space="preserve">Figura 7</w:t>
       </w:r>
     </w:p>
     <w:p>
       <w:pPr>
-        <w:pStyle w:val="BodyText"/>
-      </w:pPr>
-      <w:r>
-        <w:rPr>
-          <w:i/>
-          <w:iCs/>
-        </w:rPr>
+        <w:pStyle w:val="CaptionText"/>
+      </w:pPr>
+      <w:r>
         <w:t xml:space="preserve">Distribuição bootstrap pareada (10.000 réplicas) de ΔF1 = F1(MLP) − F1(LR) no teste, regime não-censurado. O intervalo de 95% [−0,055; +0,042] contém zero</w:t>
       </w:r>
     </w:p>
     <w:p>
       <w:pPr>
-        <w:pStyle w:val="BodyText"/>
+        <w:pStyle w:val="FigureImage"/>
       </w:pPr>
       <w:r>
         <w:drawing>
@@ -1333,25 +1324,17 @@
     </w:p>
     <w:p>
       <w:pPr>
-        <w:pStyle w:val="BodyText"/>
-      </w:pPr>
-      <w:r>
-        <w:rPr>
-          <w:b/>
-          <w:bCs/>
-        </w:rPr>
+        <w:pStyle w:val="CaptionLabel"/>
+      </w:pPr>
+      <w:r>
         <w:t xml:space="preserve">Tabela 2</w:t>
       </w:r>
     </w:p>
     <w:p>
       <w:pPr>
-        <w:pStyle w:val="BodyText"/>
-      </w:pPr>
-      <w:r>
-        <w:rPr>
-          <w:i/>
-          <w:iCs/>
-        </w:rPr>
+        <w:pStyle w:val="CaptionText"/>
+      </w:pPr>
+      <w:r>
         <w:t xml:space="preserve">Bootstrap pareado MLP × Regressão Logística no teste (10.000 réplicas, IC 95% percentílico), por regime de seleção de limiar</w:t>
       </w:r>
     </w:p>
@@ -1376,6 +1359,7 @@
           <w:tcPr/>
           <w:p>
             <w:pPr>
+              <w:keepNext/>
               <w:pStyle w:val="Compact"/>
             </w:pPr>
             <w:r>
@@ -1387,6 +1371,7 @@
           <w:tcPr/>
           <w:p>
             <w:pPr>
+              <w:keepNext/>
               <w:pStyle w:val="Compact"/>
             </w:pPr>
             <w:r>
@@ -1398,6 +1383,7 @@
           <w:tcPr/>
           <w:p>
             <w:pPr>
+              <w:keepNext/>
               <w:pStyle w:val="Compact"/>
             </w:pPr>
             <w:r>
@@ -1411,6 +1397,7 @@
           <w:tcPr/>
           <w:p>
             <w:pPr>
+              <w:keepNext/>
               <w:pStyle w:val="Compact"/>
             </w:pPr>
             <w:r>
@@ -1422,6 +1409,7 @@
           <w:tcPr/>
           <w:p>
             <w:pPr>
+              <w:keepNext/>
               <w:pStyle w:val="Compact"/>
             </w:pPr>
             <w:r>
@@ -1433,6 +1421,7 @@
           <w:tcPr/>
           <w:p>
             <w:pPr>
+              <w:keepNext/>
               <w:pStyle w:val="Compact"/>
             </w:pPr>
             <w:r>
@@ -1446,6 +1435,7 @@
           <w:tcPr/>
           <w:p>
             <w:pPr>
+              <w:keepNext/>
               <w:pStyle w:val="Compact"/>
             </w:pPr>
             <w:r>
@@ -1457,6 +1447,7 @@
           <w:tcPr/>
           <w:p>
             <w:pPr>
+              <w:keepNext/>
               <w:pStyle w:val="Compact"/>
             </w:pPr>
             <w:r>
@@ -1468,6 +1459,7 @@
           <w:tcPr/>
           <w:p>
             <w:pPr>
+              <w:keepNext/>
               <w:pStyle w:val="Compact"/>
             </w:pPr>
             <w:r>
@@ -1481,6 +1473,7 @@
           <w:tcPr/>
           <w:p>
             <w:pPr>
+              <w:keepNext/>
               <w:pStyle w:val="Compact"/>
             </w:pPr>
             <w:r>
@@ -1492,6 +1485,7 @@
           <w:tcPr/>
           <w:p>
             <w:pPr>
+              <w:keepNext/>
               <w:pStyle w:val="Compact"/>
             </w:pPr>
             <w:r>
@@ -1503,6 +1497,7 @@
           <w:tcPr/>
           <w:p>
             <w:pPr>
+              <w:keepNext/>
               <w:pStyle w:val="Compact"/>
             </w:pPr>
             <w:r>
@@ -1516,6 +1511,7 @@
           <w:tcPr/>
           <w:p>
             <w:pPr>
+              <w:keepNext/>
               <w:pStyle w:val="Compact"/>
             </w:pPr>
             <w:r>
@@ -1527,6 +1523,7 @@
           <w:tcPr/>
           <w:p>
             <w:pPr>
+              <w:keepNext/>
               <w:pStyle w:val="Compact"/>
             </w:pPr>
             <w:r>
@@ -1538,6 +1535,7 @@
           <w:tcPr/>
           <w:p>
             <w:pPr>
+              <w:keepNext/>
               <w:pStyle w:val="Compact"/>
             </w:pPr>
             <w:r>
@@ -1551,6 +1549,7 @@
           <w:tcPr/>
           <w:p>
             <w:pPr>
+              <w:keepNext/>
               <w:pStyle w:val="Compact"/>
             </w:pPr>
             <w:r>
@@ -1562,6 +1561,7 @@
           <w:tcPr/>
           <w:p>
             <w:pPr>
+              <w:keepNext/>
               <w:pStyle w:val="Compact"/>
             </w:pPr>
             <w:r>
@@ -1573,6 +1573,7 @@
           <w:tcPr/>
           <w:p>
             <w:pPr>
+              <w:keepNext/>
               <w:pStyle w:val="Compact"/>
             </w:pPr>
             <w:r>
@@ -1735,31 +1736,23 @@
     </w:p>
     <w:p>
       <w:pPr>
-        <w:pStyle w:val="BodyText"/>
-      </w:pPr>
-      <w:r>
-        <w:rPr>
-          <w:b/>
-          <w:bCs/>
-        </w:rPr>
+        <w:pStyle w:val="CaptionLabel"/>
+      </w:pPr>
+      <w:r>
         <w:t xml:space="preserve">Figura 5</w:t>
       </w:r>
     </w:p>
     <w:p>
       <w:pPr>
-        <w:pStyle w:val="BodyText"/>
-      </w:pPr>
-      <w:r>
-        <w:rPr>
-          <w:i/>
-          <w:iCs/>
-        </w:rPr>
+        <w:pStyle w:val="CaptionText"/>
+      </w:pPr>
+      <w:r>
         <w:t xml:space="preserve">Sensibilidade mecânica do F1 à prevalência π com ponto de operação fixo (curvas em forma fechada; pontos = verificação Monte Carlo). O crescimento do F1 com π é propriedade da métrica, não melhoria do detector</w:t>
       </w:r>
     </w:p>
     <w:p>
       <w:pPr>
-        <w:pStyle w:val="BodyText"/>
+        <w:pStyle w:val="FigureImage"/>
       </w:pPr>
       <w:r>
         <w:drawing>
@@ -1824,31 +1817,23 @@
     </w:p>
     <w:p>
       <w:pPr>
-        <w:pStyle w:val="BodyText"/>
-      </w:pPr>
-      <w:r>
-        <w:rPr>
-          <w:b/>
-          <w:bCs/>
-        </w:rPr>
+        <w:pStyle w:val="CaptionLabel"/>
+      </w:pPr>
+      <w:r>
         <w:t xml:space="preserve">Figura 6</w:t>
       </w:r>
     </w:p>
     <w:p>
       <w:pPr>
-        <w:pStyle w:val="BodyText"/>
-      </w:pPr>
-      <w:r>
-        <w:rPr>
-          <w:i/>
-          <w:iCs/>
-        </w:rPr>
+        <w:pStyle w:val="CaptionText"/>
+      </w:pPr>
+      <w:r>
         <w:t xml:space="preserve">Importância por permutação do MLP na validação (top 20, queda média de F1 ao permutar). V14 domina com ≈3× a segunda variável; o ranking secundário não é estável entre re-execuções</w:t>
       </w:r>
     </w:p>
     <w:p>
       <w:pPr>
-        <w:pStyle w:val="BodyText"/>
+        <w:pStyle w:val="FigureImage"/>
       </w:pPr>
       <w:r>
         <w:drawing>
@@ -4523,9 +4508,68 @@
     <w:basedOn w:val="Normal"/>
     <w:qFormat/>
     <w:pPr>
-      <w:spacing w:after="120" w:before="120" w:line="240" w:lineRule="auto"/>
+      <w:keepLines/>
+      <w:spacing w:after="480" w:before="120" w:line="240" w:lineRule="auto"/>
       <w:jc w:val="center"/>
     </w:pPr>
+  </w:style>
+  <w:style w:styleId="CaptionLabel" w:type="paragraph">
+    <w:name w:val="CaptionLabel"/>
+    <w:basedOn w:val="Normal"/>
+    <w:qFormat/>
+    <w:pPr>
+      <w:keepNext/>
+      <w:keepLines/>
+      <w:spacing w:after="60" w:before="240" w:line="480" w:lineRule="auto"/>
+      <w:jc w:val="left"/>
+    </w:pPr>
+    <w:rPr>
+      <w:b/>
+      <w:sz w:val="24"/>
+      <w:szCs w:val="24"/>
+    </w:rPr>
+  </w:style>
+  <w:style w:styleId="CaptionText" w:type="paragraph">
+    <w:name w:val="CaptionText"/>
+    <w:basedOn w:val="Normal"/>
+    <w:qFormat/>
+    <w:pPr>
+      <w:keepNext/>
+      <w:keepLines/>
+      <w:spacing w:after="120" w:line="360" w:lineRule="auto"/>
+      <w:jc w:val="left"/>
+    </w:pPr>
+    <w:rPr>
+      <w:i/>
+      <w:sz w:val="22"/>
+      <w:szCs w:val="22"/>
+    </w:rPr>
+  </w:style>
+  <w:style w:styleId="TableNote" w:type="paragraph">
+    <w:name w:val="TableNote"/>
+    <w:basedOn w:val="Normal"/>
+    <w:qFormat/>
+    <w:pPr>
+      <w:spacing w:after="480" w:before="120" w:line="240" w:lineRule="auto"/>
+      <w:jc w:val="both"/>
+    </w:pPr>
+    <w:rPr>
+      <w:sz w:val="20"/>
+      <w:szCs w:val="20"/>
+    </w:rPr>
+  </w:style>
+  <w:style w:styleId="CoverSmall" w:type="paragraph">
+    <w:name w:val="CoverSmall"/>
+    <w:basedOn w:val="Normal"/>
+    <w:qFormat/>
+    <w:pPr>
+      <w:spacing w:after="60" w:line="360" w:lineRule="auto"/>
+      <w:jc w:val="center"/>
+    </w:pPr>
+    <w:rPr>
+      <w:sz w:val="22"/>
+      <w:szCs w:val="22"/>
+    </w:rPr>
   </w:style>
 </w:styles>
 </file>

</xml_diff>

<commit_message>
External-audit adjustments: mention-order figure numbering, AO90 orthography, hardened refs (Lipton registered version + arXiv DOIs), pip_freeze provenance fixed, export contract tests, metadata harmonized
</commit_message>
<xml_diff>
--- a/docs/paper/paper-final.docx
+++ b/docs/paper/paper-final.docx
@@ -4,15 +4,54 @@
   <w:body>
     <w:p>
       <w:pPr>
-        <w:pStyle w:val="CoverOrg"/>
-      </w:pPr>
-      <w:r>
-        <w:t xml:space="preserve">CODEX HASH RESEARCH LABORATORY</w:t>
-      </w:r>
-    </w:p>
-    <w:p>
-      <w:pPr>
-        <w:spacing w:after="1700"/>
+        <w:pStyle w:val="FigureImage"/>
+      </w:pPr>
+      <w:r>
+        <w:drawing>
+          <wp:inline>
+            <wp:extent cx="1871999" cy="1221088"/>
+            <wp:effectExtent b="0" l="0" r="0" t="0"/>
+            <wp:docPr descr="" title="" id="29" name="Picture"/>
+            <a:graphic>
+              <a:graphicData uri="http://schemas.openxmlformats.org/drawingml/2006/picture">
+                <pic:pic>
+                  <pic:nvPicPr>
+                    <pic:cNvPr descr="/Users/ulissesflores/Developer/research-lab/fabrica/artigos/2025-fraud-detection-mlp/docs/assets/codex-hash-lockup-stacked@2x.png" id="30" name="Picture"/>
+                    <pic:cNvPicPr>
+                      <a:picLocks noChangeArrowheads="1" noChangeAspect="1"/>
+                    </pic:cNvPicPr>
+                  </pic:nvPicPr>
+                  <pic:blipFill>
+                    <a:blip r:embed="rId28"/>
+                    <a:stretch>
+                      <a:fillRect/>
+                    </a:stretch>
+                  </pic:blipFill>
+                  <pic:spPr bwMode="auto">
+                    <a:xfrm>
+                      <a:off x="0" y="0"/>
+                      <a:ext cx="1871999" cy="1221088"/>
+                    </a:xfrm>
+                    <a:prstGeom prst="rect">
+                      <a:avLst/>
+                    </a:prstGeom>
+                    <a:noFill/>
+                    <a:ln w="9525">
+                      <a:noFill/>
+                      <a:headEnd/>
+                      <a:tailEnd/>
+                    </a:ln>
+                  </pic:spPr>
+                </pic:pic>
+              </a:graphicData>
+            </a:graphic>
+          </wp:inline>
+        </w:drawing>
+      </w:r>
+    </w:p>
+    <w:p>
+      <w:pPr>
+        <w:spacing w:after="1100"/>
       </w:pPr>
     </w:p>
     <w:p>
@@ -74,7 +113,7 @@
     </w:p>
     <w:p>
       <w:pPr>
-        <w:spacing w:after="1700"/>
+        <w:spacing w:after="1400"/>
       </w:pPr>
     </w:p>
     <w:p>
@@ -85,15 +124,11 @@
         <w:t xml:space="preserve">Data: 4 de julho de 2026</w:t>
       </w:r>
     </w:p>
-    <w:p>
-      <w:r>
-        <w:br w:type="page"/>
-      </w:r>
-    </w:p>
-    <w:bookmarkStart w:id="28" w:name="resumo"/>
+    <w:bookmarkStart w:id="31" w:name="resumo"/>
     <w:p>
       <w:pPr>
         <w:pStyle w:val="Heading2"/>
+        <w:pageBreakBefore/>
       </w:pPr>
       <w:r>
         <w:t xml:space="preserve">Resumo</w:t>
@@ -104,7 +139,7 @@
         <w:pStyle w:val="FirstParagraph"/>
       </w:pPr>
       <w:r>
-        <w:t xml:space="preserve">Detectar fraude em cartões de crédito é um problema de classe rara — no benchmark público ULB/Worldline, apenas 0,173% das 284.807 transações são fraudulentas — e a literatura disputa há anos qual arquitetura de modelo detecta melhor. Este artigo mede uma pergunta anterior e mais prática: quanto do desempenho operacional vem da escolha da arquitetura, e quanto vem de um único escalar, o limiar de decisão (o ponto de operação) selecionado em validação sob reponderação de custo. Quatro famílias — Perceptron Multi-Camadas (MLP), Regressão Logística (LR), Autoencoder e Isolation Forest — são comparadas sob protocolo auditável, sem vazamento de pré-processamento, com dados ancorados por SHA-256 e determinismo verificado por re-execução idêntica. A assimetria encontrada é de duas ordens de magnitude: deslocar o limiar do MLP do valor-padrão 0,5 para o ótimo de validação (0,9994) eleva o F1 de teste de 0,267 para 0,812, enquanto trocar a arquitetura desloca −0,007, com intervalo bootstrap pareado de 95% [−0,055; +0,042] — indistinguível de zero e menor que o desvio-padrão de treino do próprio MLP sob 20 sementes (0,016). Uma aparente vitória do MLP (ΔF1 = +0,053, intervalo excluindo zero) é demonstrada como artefato de protocolo: a grade de limiares herdada do material precedente, truncada em 0,99, fabricava a diferença. Conclui-se que a alavanca dominante de engenharia e de governança é o acoplamento entre reponderação de custo e limiar auditável, não a família do modelo — e que micro-decisões de protocolo bastam para inverter conclusões de comparações de arquitetura.</w:t>
+        <w:t xml:space="preserve">Detectar fraude em cartões de crédito é um problema de classe rara — no benchmark público ULB/Worldline, apenas 0,173% das 284.807 transações são fraudulentas — e a literatura disputa há anos qual arquitetura de modelo detecta melhor. Este artigo mede uma pergunta anterior e mais prática: quanto do desempenho operacional vem da escolha da arquitetura, e quanto vem de um único escalar, o limiar de decisão (o ponto de operação) selecionado em validação sob reponderação de custo. Quatro famílias — Perceptron de Múltiplas Camadas (MLP), Regressão Logística (LR), Autoencoder e Isolation Forest — são comparadas sob protocolo auditável, sem vazamento de pré-processamento, com dados ancorados por SHA-256 e determinismo verificado por reexecução idêntica. A assimetria encontrada é de duas ordens de magnitude: deslocar o limiar do MLP do valor-padrão 0,5 para o ótimo de validação (0,9994) eleva o F1 de teste de 0,267 para 0,812, enquanto trocar a arquitetura desloca −0,007, com intervalo bootstrap pareado de 95% [−0,055; +0,042] — indistinguível de zero e menor que o desvio-padrão de treino do próprio MLP sob 20 sementes (0,016). Uma aparente vitória do MLP (ΔF1 = +0,053, intervalo excluindo zero) é demonstrada como artefato de protocolo: a grade de limiares herdada do material precedente, truncada em 0,99, fabricava a diferença. Conclui-se que a alavanca dominante de engenharia e de governança é o acoplamento entre reponderação de custo e limiar auditável, não a família do modelo — e que micro-decisões de protocolo bastam para inverter conclusões de comparações de arquitetura.</w:t>
       </w:r>
     </w:p>
     <w:p>
@@ -125,16 +160,12 @@
         <w:t xml:space="preserve">detecção de fraude; classe rara; ponto de operação; aprendizado sensível a custo; vazamento de dados; reprodutibilidade</w:t>
       </w:r>
     </w:p>
-    <w:p>
-      <w:r>
-        <w:br w:type="page"/>
-      </w:r>
-    </w:p>
-    <w:bookmarkEnd w:id="28"/>
-    <w:bookmarkStart w:id="29" w:name="abstract"/>
+    <w:bookmarkEnd w:id="31"/>
+    <w:bookmarkStart w:id="32" w:name="abstract"/>
     <w:p>
       <w:pPr>
         <w:pStyle w:val="Heading2"/>
+        <w:pageBreakBefore/>
       </w:pPr>
       <w:r>
         <w:t xml:space="preserve">Abstract</w:t>
@@ -166,16 +197,12 @@
         <w:t xml:space="preserve">fraud detection; rare class; operating point; cost-sensitive learning; data leakage; reproducibility</w:t>
       </w:r>
     </w:p>
-    <w:p>
-      <w:r>
-        <w:br w:type="page"/>
-      </w:r>
-    </w:p>
-    <w:bookmarkEnd w:id="29"/>
-    <w:bookmarkStart w:id="30" w:name="introdução"/>
+    <w:bookmarkEnd w:id="32"/>
+    <w:bookmarkStart w:id="33" w:name="introdução"/>
     <w:p>
       <w:pPr>
         <w:pStyle w:val="Heading2"/>
+        <w:pageBreakBefore/>
       </w:pPr>
       <w:r>
         <w:t xml:space="preserve">1. Introdução</w:t>
@@ -186,7 +213,7 @@
         <w:pStyle w:val="FirstParagraph"/>
       </w:pPr>
       <w:r>
-        <w:t xml:space="preserve">A literatura de detecção de fraude em cartões acumula, há duas décadas, ganhos reportados de arquitetura que raramente sobrevivem a escrutínio metodológico — o fenômeno que Hand (2006) denominou ilusão de progresso e que Hayat e Magnier (2025) documentaram especificamente no benchmark ULB/Worldline: vazamento de pré-processamento, validação temporal inadequada e reporte seletivo de métricas produzem, juntos, redes neurais triviais com 99,9% de revocação aparente. Este artigo aborda uma pergunta complementar: mesmo sob protocolo correto, quanto do desempenho operacional reportado se deve à arquitetura escolhida — e quanto se deve a um único escalar, o limiar de decisão?</w:t>
+        <w:t xml:space="preserve">A literatura de detecção de fraude em cartões acumula, há duas décadas, ganhos reportados de arquitetura que raramente sobrevivem a escrutínio metodológico — o fenômeno que Hand (2006) denominou ilusão de progresso. Hayat e Magnier (2025) documentaram essa dinâmica especificamente no benchmark ULB/Worldline: vazamento de pré-processamento, validação temporal inadequada e reporte seletivo de métricas produzem, juntos, redes neurais triviais com 99,9% de revocação aparente. Este artigo aborda uma pergunta complementar: mesmo sob protocolo correto, quanto do desempenho operacional reportado se deve à arquitetura escolhida — e quanto se deve a um único escalar, o limiar de decisão?</w:t>
       </w:r>
     </w:p>
     <w:p>
@@ -194,7 +221,7 @@
         <w:pStyle w:val="BodyText"/>
       </w:pPr>
       <w:r>
-        <w:t xml:space="preserve">A pergunta importa porque as duas alavancas têm custos de engenharia radicalmente distintos. Trocar a família do modelo custa re-treino, re-validação e re-homologação; deslocar o ponto de operação custa a escolha de um número em validação, é auditável linha a linha e é reversível. Se o efeito do segundo domina o efeito do primeiro, a prioridade de esforço da engenharia antifraude — e o objeto adequado da governança de modelo — está historicamente invertida. Evidência multi-domínio nesta direção já existe: em 9.000 experimentos sobre 30 conjuntos de dados, a calibração do limiar de decisão foi a intervenção mais consistentemente eficaz contra desbalanceamento, à frente de SMOTE e de reponderação de classe (Abdelhamid &amp; Desai, 2024). O delta deste trabalho é deliberadamente modesto: dar a essa decomposição — já indicada, sem inferência pareada, por Leevy et al. (2023) e por Abdelhamid e Desai (2024) — intervalos pareados, uma régua de variância de treino e um protocolo auditável, no benchmark canônico da literatura de fraude, cuja comunidade citante de Hayat e Magnier (2025) segue não adotando as práticas que cita.</w:t>
+        <w:t xml:space="preserve">A pergunta importa porque as duas alavancas têm custos de engenharia radicalmente distintos. Trocar a família do modelo custa retreino, revalidação e nova homologação; deslocar o ponto de operação custa a escolha de um número em validação, é auditável linha a linha e é reversível. Se o efeito do segundo domina o efeito do primeiro, a prioridade de esforço da engenharia antifraude — e o objeto adequado da governança de modelo — está historicamente invertida. Evidência multi-domínio nesta direção já existe: em 9.000 experimentos sobre 30 conjuntos de dados, a calibração do limiar de decisão foi a intervenção mais consistentemente eficaz contra desbalanceamento, à frente de SMOTE e de reponderação de classe (Abdelhamid &amp; Desai, 2024). O delta deste trabalho é deliberadamente modesto: dar a essa decomposição — já indicada, sem inferência pareada, por Leevy et al. (2023) e por Abdelhamid e Desai (2024) — intervalos pareados, uma régua de variância de treino e um protocolo auditável, no benchmark canônico da literatura de fraude, cuja comunidade citante de Hayat e Magnier (2025) segue não adotando as práticas que cita.</w:t>
       </w:r>
     </w:p>
     <w:p>
@@ -202,7 +229,7 @@
         <w:pStyle w:val="BodyText"/>
       </w:pPr>
       <w:r>
-        <w:t xml:space="preserve">Este é, deliberadamente, um estudo de caso confirmatório e auditável — não a proposição de uma tese nova. As contribuições são três, mais uma nota. Primeira, a decomposição: com bootstrap pareado de 10.000 réplicas e um estudo de variância de treino com 20 sementes, mostra-se que o deslocamento do limiar move o F1 de teste do MLP em +0,545 (de 0,267 para 0,812), enquanto o gap entre MLP e Regressão Logística no regime correto de seleção é −0,007 [−0,055; +0,042] — indistinguível de zero, menor que o desvio-padrão de treino do próprio MLP (0,016) e com sinal que se inverte em 12 das 20 sementes. Segunda, a operacionalização reprodutível da crítica: padronização ajustada só no treino, reponderação de custo em lugar de qualquer sobreamostragem sintética, limiar selecionado exclusivamente em validação, dados ancorados por SHA-256, invariantes de protocolo cobertos por testes automatizados e determinismo verificado por re-execução bit-idêntica. Terceira, uma forense de reprodutibilidade do material precedente do próprio autor, da qual resultam dois achados: a aparente superioridade do MLP produzida pela censura da grade de limiares (Seção 6.2) e um defeito de reamostragem que invalidava o teste de robustez a prevalência (Seção 6.5). As implicações regulatórias da tese — incluindo a correção de uma leitura corrente do Regulamento (UE) 2024/1689 — são tratadas na Discussão (Seção 7).</w:t>
+        <w:t xml:space="preserve">Este é, deliberadamente, um estudo de caso confirmatório e auditável — não a proposição de uma tese nova. As contribuições são três, mais uma nota. Primeira, a decomposição: com bootstrap pareado de 10.000 réplicas e um estudo de variância de treino com 20 sementes, mostra-se que o deslocamento do limiar move o F1 de teste do MLP em +0,545 (de 0,267 para 0,812), enquanto o gap entre MLP e Regressão Logística no regime correto de seleção é −0,007 [−0,055; +0,042] — indistinguível de zero, menor que o desvio-padrão de treino do próprio MLP (0,016) e com sinal que se inverte em 12 das 20 sementes. Segunda, a operacionalização reprodutível da crítica: padronização ajustada só no treino, reponderação de custo em lugar de qualquer sobreamostragem sintética, limiar selecionado exclusivamente em validação, dados ancorados por SHA-256, invariantes de protocolo cobertos por testes automatizados e determinismo verificado por reexecução bit-idêntica. Terceira, uma forense de reprodutibilidade do material precedente do próprio autor, da qual resultam dois achados: a aparente superioridade do MLP produzida pela censura da grade de limiares (Seção 6.2) e um defeito de reamostragem que invalidava o teste de robustez a prevalência (Seção 6.5). As implicações regulatórias da tese — incluindo a correção de uma leitura corrente do Regulamento (UE) 2024/1689 — são tratadas na Discussão (Seção 7).</w:t>
       </w:r>
     </w:p>
     <w:p>
@@ -223,8 +250,8 @@
         <w:t xml:space="preserve">) central do problema tem nome clássico: é a fronteira de decisão de Neyman-Pearson no espaço precisão-revocação, sob assimetria de custo em que falsos negativos (fraude não detectada) custam ordens de magnitude mais que falsos positivos (transação legítima bloqueada) (Bishop, 2006; Cherif et al., 2023; Fawcett, 2006).</w:t>
       </w:r>
     </w:p>
-    <w:bookmarkEnd w:id="30"/>
-    <w:bookmarkStart w:id="31" w:name="trabalhos-relacionados"/>
+    <w:bookmarkEnd w:id="33"/>
+    <w:bookmarkStart w:id="34" w:name="trabalhos-relacionados"/>
     <w:p>
       <w:pPr>
         <w:pStyle w:val="Heading2"/>
@@ -257,8 +284,8 @@
         <w:t xml:space="preserve">A terceira linhagem explica por que o empate entre arquiteturas era esperável a priori. Grinsztajn et al. (2022) identificaram que redes neurais são aproximadamente invariantes a rotação, enquanto árvores exploram o alinhamento axial das variáveis originais — e as variáveis V1–V28 do conjunto ULB são componentes principais (PCA, na sigla em inglês), isto é, o resultado de uma rotação. Se a projeção PCA torna as classes aproximadamente separáveis por fronteira linear, modelos lineares e MLPs saturam o mesmo teto de sinal (Hastie et al., 2009). McElfresh et al. (2023) acrescentam, sobre 176 conjuntos tabulares, que ajuste leve de hiperparâmetros em árvores impulsionadas importa com frequência mais que a própria escolha entre redes neurais e árvores. Por fim, a instabilidade de treino de redes profundas está documentada por Bouthillier et al. (2021): fontes de variância rotineiramente ignoradas — amostragem dos dados, inicialização de pesos, escolha de hiperparâmetros — impactam marcadamente os resultados e distorcem a detecção de melhorias entre métodos; este estudo mede essa variância diretamente no caso em questão (Seção 6.3).</w:t>
       </w:r>
     </w:p>
-    <w:bookmarkEnd w:id="31"/>
-    <w:bookmarkStart w:id="35" w:name="dados"/>
+    <w:bookmarkEnd w:id="34"/>
+    <w:bookmarkStart w:id="38" w:name="dados"/>
     <w:p>
       <w:pPr>
         <w:pStyle w:val="Heading2"/>
@@ -272,7 +299,7 @@
         <w:pStyle w:val="FirstParagraph"/>
       </w:pPr>
       <w:r>
-        <w:t xml:space="preserve">O conjunto ULB/Worldline (Machine Learning Group da Université Libre de Bruxelles; Kaggle) contém 284.807 transações de dois dias de setembro de 2013, com 30 variáveis preditoras — 28 componentes principais anonimizados (V1–V28), o tempo decorrido (Time) e o valor (Amount) — e rótulo binário Class com 492 fraudes (prevalência de 0,173%; Figura 1) (Dal Pozzolo, 2015; ULB/Worldline, 2013). A cópia utilizada foi verificada contra o SHA-256 registrado na execução original do material precedente (76274b691b16a6c49d3f159c883398e03ccd6d1ee12d9d8ee38f4b4b98551a89), garantindo identidade bit a bit da cadeia de dados entre as duas execuções.</w:t>
+        <w:t xml:space="preserve">O conjunto ULB/Worldline, mantido pelo Machine Learning Group da Université Libre de Bruxelles e distribuído via Kaggle, contém 284.807 transações de dois dias de setembro de 2013, com 30 variáveis preditoras — 28 componentes principais anonimizados (V1–V28), o tempo decorrido (Time) e o valor (Amount) — e rótulo binário Class com 492 fraudes (prevalência de 0,173%; Figura 1) (Dal Pozzolo, 2015; ULB/Worldline, 2013). A cópia utilizada foi verificada contra o SHA-256 registrado na execução original do material precedente (76274b691b16a6c49d3f159c883398e03ccd6d1ee12d9d8ee38f4b4b98551a89), garantindo identidade bit a bit da cadeia de dados entre as duas execuções.</w:t>
       </w:r>
     </w:p>
     <w:p>
@@ -300,18 +327,18 @@
           <wp:inline>
             <wp:extent cx="5029200" cy="3108960"/>
             <wp:effectExtent b="0" l="0" r="0" t="0"/>
-            <wp:docPr descr="" title="" id="33" name="Picture"/>
+            <wp:docPr descr="" title="" id="36" name="Picture"/>
             <a:graphic>
               <a:graphicData uri="http://schemas.openxmlformats.org/drawingml/2006/picture">
                 <pic:pic>
                   <pic:nvPicPr>
-                    <pic:cNvPr descr="../../output/figures/fig1_class_distribution.png" id="34" name="Picture"/>
+                    <pic:cNvPr descr="../../output/figures/fig1_class_distribution.png" id="37" name="Picture"/>
                     <pic:cNvPicPr>
                       <a:picLocks noChangeArrowheads="1" noChangeAspect="1"/>
                     </pic:cNvPicPr>
                   </pic:nvPicPr>
                   <pic:blipFill>
-                    <a:blip r:embed="rId32"/>
+                    <a:blip r:embed="rId35"/>
                     <a:stretch>
                       <a:fillRect/>
                     </a:stretch>
@@ -346,8 +373,8 @@
         <w:t xml:space="preserve">O papel científico atribuído ao benchmark aqui é deliberadamente restrito. Como leaderboard, o conjunto está saturado e comprometido: métricas acima de 99% são sintoma de vazamento, não de avanço (Hayat &amp; Magnier, 2025; Kabane, 2024); a anonimização por PCA pode, no limite, preservar 99,9999% da variância e ainda assim destruir o sinal decisório (Tembine, 2026); e as suítes tabulares curadas modernas o excluem pelo desbalanceamento extremo. Como instrumento metodológico para decompor efeitos de protocolo — o uso feito neste artigo — ele permanece adequado, precisamente porque é o benchmark sobre o qual as conclusões enviesadas da literatura foram construídas.</w:t>
       </w:r>
     </w:p>
-    <w:bookmarkEnd w:id="35"/>
-    <w:bookmarkStart w:id="36" w:name="métodos"/>
+    <w:bookmarkEnd w:id="38"/>
+    <w:bookmarkStart w:id="39" w:name="métodos"/>
     <w:p>
       <w:pPr>
         <w:pStyle w:val="Heading2"/>
@@ -407,11 +434,11 @@
         <w:pStyle w:val="BodyText"/>
       </w:pPr>
       <w:r>
-        <w:t xml:space="preserve">A seleção de limiares ocorre exclusivamente em validação, em dois regimes reportados separadamente. O regime de fidelidade reproduz a grade do material precedente, 99 pontos uniformes em [0,01; 0,99] — grade censurada à direita, pois o ótimo pode residir além de 0,99. O regime primário elimina a censura, avaliando todos os pontos de corte da curva precisão-revocação da validação. Para Autoencoder e Isolation Forest, o corte é selecionado sobre percentis (50 a 99,9) da pontuação em validação, como no material precedente. A inferência sobre o gap entre MLP e Regressão Logística usa bootstrap pareado de 10.000 réplicas sobre os índices do teste, reportando intervalos percentílicos de 95% para F1 de cada modelo, para a diferença pareada de F1 e para a diferença pareada de AUC-PR; esses intervalos capturam a variância de amostragem do teste condicional aos modelos treinados e limiares fixos — não a variância de treino, medida separadamente por 20 re-treinos do MLP com sementes 1–20 sobre partição e padronização fixas. A execução é determinística (sementes fixas, thread única, algoritmos determinísticos): duas execuções completas produziram resultados idênticos em todos os blocos, e todos os artefatos — código, configuração, resultados, tabelas e figuras — são registrados em manifesto com SHA-256 individual.</w:t>
-      </w:r>
-    </w:p>
-    <w:bookmarkEnd w:id="36"/>
-    <w:bookmarkStart w:id="37" w:name="protocolo-de-avaliação"/>
+        <w:t xml:space="preserve">A seleção de limiares ocorre exclusivamente em validação, em dois regimes reportados separadamente. O regime de fidelidade reproduz a grade do material precedente, 99 pontos uniformes em [0,01; 0,99] — grade censurada à direita, pois o ótimo pode residir além de 0,99. O regime primário elimina a censura, avaliando todos os pontos de corte da curva precisão-revocação da validação. Para Autoencoder e Isolation Forest, o corte é selecionado sobre percentis (50 a 99,9) da pontuação em validação, como no material precedente. A inferência sobre o gap entre MLP e Regressão Logística usa bootstrap pareado de 10.000 réplicas sobre os índices do teste, reportando intervalos percentílicos de 95% para F1 de cada modelo, para a diferença pareada de F1 e para a diferença pareada de AUC-PR; esses intervalos capturam a variância de amostragem do teste condicional aos modelos treinados e limiares fixos — não a variância de treino, medida separadamente por 20 retreinos do MLP com sementes 1–20 sobre partição e padronização fixas. A execução é determinística (sementes fixas, thread única, algoritmos determinísticos): duas execuções completas produziram resultados idênticos em todos os blocos, e todos os artefatos — código, configuração, resultados, tabelas e figuras — são registrados em manifesto com SHA-256 individual.</w:t>
+      </w:r>
+    </w:p>
+    <w:bookmarkEnd w:id="39"/>
+    <w:bookmarkStart w:id="40" w:name="protocolo-de-avaliação"/>
     <w:p>
       <w:pPr>
         <w:pStyle w:val="Heading2"/>
@@ -428,8 +455,8 @@
         <w:t xml:space="preserve">A métrica primária é a área sob a curva precisão-revocação (AUC-PR), mais informativa que a ROC sob desbalanceamento severo porque ignora os verdadeiros negativos abundantes (Davis &amp; Goadrich, 2006; Saito &amp; Rehmsmeier, 2015); a ROC é reportada por tradição (Fawcett, 2006). O desempenho pontual usa F1 e Fβ com β=2 no limiar selecionado em validação — a ponderação da revocação sobre a precisão reflete o custo assimétrico do domínio, prática recorrente na literatura de fraude (Hernandez Aros et al., 2024) —, matrizes de confusão completas e acurácia apenas como ilustração de sua inutilidade no regime de classe rara (99,2% no limiar 0,5 coexistindo com precisão de 0,157). A interpretabilidade usa importância por permutação em validação (5 repetições, com desvio-padrão). A sensibilidade à prevalência é tratada analiticamente na Seção 6.5.</w:t>
       </w:r>
     </w:p>
-    <w:bookmarkEnd w:id="37"/>
-    <w:bookmarkStart w:id="62" w:name="resultados"/>
+    <w:bookmarkEnd w:id="40"/>
+    <w:bookmarkStart w:id="65" w:name="resultados"/>
     <w:p>
       <w:pPr>
         <w:pStyle w:val="Heading2"/>
@@ -460,651 +487,6 @@
       </w:pPr>
       <w:r>
         <w:t xml:space="preserve">Curvas precisão-revocação no teste para as quatro famílias de modelos, com AUC-PR por modelo. Os supervisionados (MLP e LR) dominam os não supervisionados em todo o espaço de revocação</w:t>
-      </w:r>
-    </w:p>
-    <w:p>
-      <w:pPr>
-        <w:pStyle w:val="FigureImage"/>
-      </w:pPr>
-      <w:r>
-        <w:drawing>
-          <wp:inline>
-            <wp:extent cx="5029200" cy="3657600"/>
-            <wp:effectExtent b="0" l="0" r="0" t="0"/>
-            <wp:docPr descr="" title="" id="39" name="Picture"/>
-            <a:graphic>
-              <a:graphicData uri="http://schemas.openxmlformats.org/drawingml/2006/picture">
-                <pic:pic>
-                  <pic:nvPicPr>
-                    <pic:cNvPr descr="../../output/figures/fig2_pr_curves_test.png" id="40" name="Picture"/>
-                    <pic:cNvPicPr>
-                      <a:picLocks noChangeArrowheads="1" noChangeAspect="1"/>
-                    </pic:cNvPicPr>
-                  </pic:nvPicPr>
-                  <pic:blipFill>
-                    <a:blip r:embed="rId38"/>
-                    <a:stretch>
-                      <a:fillRect/>
-                    </a:stretch>
-                  </pic:blipFill>
-                  <pic:spPr bwMode="auto">
-                    <a:xfrm>
-                      <a:off x="0" y="0"/>
-                      <a:ext cx="5029200" cy="3657600"/>
-                    </a:xfrm>
-                    <a:prstGeom prst="rect">
-                      <a:avLst/>
-                    </a:prstGeom>
-                    <a:noFill/>
-                    <a:ln w="9525">
-                      <a:noFill/>
-                      <a:headEnd/>
-                      <a:tailEnd/>
-                    </a:ln>
-                  </pic:spPr>
-                </pic:pic>
-              </a:graphicData>
-            </a:graphic>
-          </wp:inline>
-        </w:drawing>
-      </w:r>
-    </w:p>
-    <w:p>
-      <w:pPr>
-        <w:pStyle w:val="CaptionLabel"/>
-      </w:pPr>
-      <w:r>
-        <w:t xml:space="preserve">Tabela 1</w:t>
-      </w:r>
-    </w:p>
-    <w:p>
-      <w:pPr>
-        <w:pStyle w:val="CaptionText"/>
-      </w:pPr>
-      <w:r>
-        <w:t xml:space="preserve">Desempenho no teste por modelo e ponto de operação</w:t>
-      </w:r>
-    </w:p>
-    <w:tbl>
-      <w:tblPr>
-        <w:tblLayout w:type="fixed"/>
-        <w:tblStyle w:val="Table"/>
-        <w:tblW w:type="auto" w:w="0"/>
-        <w:tblLook w:firstRow="1" w:lastRow="0" w:firstColumn="0" w:lastColumn="0" w:noHBand="0" w:noVBand="0" w:val="0020"/>
-      </w:tblPr>
-      <w:tblGrid>
-        <w:gridCol w:w="2674"/>
-        <w:gridCol w:w="1337"/>
-        <w:gridCol w:w="1337"/>
-        <w:gridCol w:w="1337"/>
-        <w:gridCol w:w="1337"/>
-        <w:gridCol w:w="1338"/>
-      </w:tblGrid>
-      <w:tr>
-        <w:trPr>
-          <w:tblHeader w:val="on"/>
-        </w:trPr>
-        <w:tc>
-          <w:tcPr/>
-          <w:p>
-            <w:pPr>
-              <w:keepNext/>
-              <w:pStyle w:val="Compact"/>
-            </w:pPr>
-            <w:r>
-              <w:t xml:space="preserve">Modelo e limiar</w:t>
-            </w:r>
-          </w:p>
-        </w:tc>
-        <w:tc>
-          <w:tcPr/>
-          <w:p>
-            <w:pPr>
-              <w:keepNext/>
-              <w:pStyle w:val="Compact"/>
-            </w:pPr>
-            <w:r>
-              <w:t xml:space="preserve">Precisão</w:t>
-            </w:r>
-          </w:p>
-        </w:tc>
-        <w:tc>
-          <w:tcPr/>
-          <w:p>
-            <w:pPr>
-              <w:keepNext/>
-              <w:pStyle w:val="Compact"/>
-            </w:pPr>
-            <w:r>
-              <w:t xml:space="preserve">Revocação</w:t>
-            </w:r>
-          </w:p>
-        </w:tc>
-        <w:tc>
-          <w:tcPr/>
-          <w:p>
-            <w:pPr>
-              <w:keepNext/>
-              <w:pStyle w:val="Compact"/>
-            </w:pPr>
-            <w:r>
-              <w:t xml:space="preserve">F1</w:t>
-            </w:r>
-          </w:p>
-        </w:tc>
-        <w:tc>
-          <w:tcPr/>
-          <w:p>
-            <w:pPr>
-              <w:keepNext/>
-              <w:pStyle w:val="Compact"/>
-            </w:pPr>
-            <w:r>
-              <w:t xml:space="preserve">FP</w:t>
-            </w:r>
-          </w:p>
-        </w:tc>
-        <w:tc>
-          <w:tcPr/>
-          <w:p>
-            <w:pPr>
-              <w:keepNext/>
-              <w:pStyle w:val="Compact"/>
-            </w:pPr>
-            <w:r>
-              <w:t xml:space="preserve">FN</w:t>
-            </w:r>
-          </w:p>
-        </w:tc>
-      </w:tr>
-      <w:tr>
-        <w:tc>
-          <w:tcPr/>
-          <w:p>
-            <w:pPr>
-              <w:keepNext/>
-              <w:pStyle w:val="Compact"/>
-            </w:pPr>
-            <w:r>
-              <w:t xml:space="preserve">MLP, 0,50</w:t>
-            </w:r>
-          </w:p>
-        </w:tc>
-        <w:tc>
-          <w:tcPr/>
-          <w:p>
-            <w:pPr>
-              <w:keepNext/>
-              <w:pStyle w:val="Compact"/>
-            </w:pPr>
-            <w:r>
-              <w:t xml:space="preserve">0,157</w:t>
-            </w:r>
-          </w:p>
-        </w:tc>
-        <w:tc>
-          <w:tcPr/>
-          <w:p>
-            <w:pPr>
-              <w:keepNext/>
-              <w:pStyle w:val="Compact"/>
-            </w:pPr>
-            <w:r>
-              <w:t xml:space="preserve">0,878</w:t>
-            </w:r>
-          </w:p>
-        </w:tc>
-        <w:tc>
-          <w:tcPr/>
-          <w:p>
-            <w:pPr>
-              <w:keepNext/>
-              <w:pStyle w:val="Compact"/>
-            </w:pPr>
-            <w:r>
-              <w:t xml:space="preserve">0,267</w:t>
-            </w:r>
-          </w:p>
-        </w:tc>
-        <w:tc>
-          <w:tcPr/>
-          <w:p>
-            <w:pPr>
-              <w:keepNext/>
-              <w:pStyle w:val="Compact"/>
-            </w:pPr>
-            <w:r>
-              <w:t xml:space="preserve">348</w:t>
-            </w:r>
-          </w:p>
-        </w:tc>
-        <w:tc>
-          <w:tcPr/>
-          <w:p>
-            <w:pPr>
-              <w:keepNext/>
-              <w:pStyle w:val="Compact"/>
-            </w:pPr>
-            <w:r>
-              <w:t xml:space="preserve">9</w:t>
-            </w:r>
-          </w:p>
-        </w:tc>
-      </w:tr>
-      <w:tr>
-        <w:tc>
-          <w:tcPr/>
-          <w:p>
-            <w:pPr>
-              <w:keepNext/>
-              <w:pStyle w:val="Compact"/>
-            </w:pPr>
-            <w:r>
-              <w:t xml:space="preserve">MLP, 0,99</w:t>
-            </w:r>
-          </w:p>
-        </w:tc>
-        <w:tc>
-          <w:tcPr/>
-          <w:p>
-            <w:pPr>
-              <w:keepNext/>
-              <w:pStyle w:val="Compact"/>
-            </w:pPr>
-            <w:r>
-              <w:t xml:space="preserve">0,769</w:t>
-            </w:r>
-          </w:p>
-        </w:tc>
-        <w:tc>
-          <w:tcPr/>
-          <w:p>
-            <w:pPr>
-              <w:keepNext/>
-              <w:pStyle w:val="Compact"/>
-            </w:pPr>
-            <w:r>
-              <w:t xml:space="preserve">0,811</w:t>
-            </w:r>
-          </w:p>
-        </w:tc>
-        <w:tc>
-          <w:tcPr/>
-          <w:p>
-            <w:pPr>
-              <w:keepNext/>
-              <w:pStyle w:val="Compact"/>
-            </w:pPr>
-            <w:r>
-              <w:t xml:space="preserve">0,790</w:t>
-            </w:r>
-          </w:p>
-        </w:tc>
-        <w:tc>
-          <w:tcPr/>
-          <w:p>
-            <w:pPr>
-              <w:keepNext/>
-              <w:pStyle w:val="Compact"/>
-            </w:pPr>
-            <w:r>
-              <w:t xml:space="preserve">18</w:t>
-            </w:r>
-          </w:p>
-        </w:tc>
-        <w:tc>
-          <w:tcPr/>
-          <w:p>
-            <w:pPr>
-              <w:keepNext/>
-              <w:pStyle w:val="Compact"/>
-            </w:pPr>
-            <w:r>
-              <w:t xml:space="preserve">14</w:t>
-            </w:r>
-          </w:p>
-        </w:tc>
-      </w:tr>
-      <w:tr>
-        <w:tc>
-          <w:tcPr/>
-          <w:p>
-            <w:pPr>
-              <w:keepNext/>
-              <w:pStyle w:val="Compact"/>
-            </w:pPr>
-            <w:r>
-              <w:t xml:space="preserve">MLP, τ*</w:t>
-            </w:r>
-          </w:p>
-        </w:tc>
-        <w:tc>
-          <w:tcPr/>
-          <w:p>
-            <w:pPr>
-              <w:keepNext/>
-              <w:pStyle w:val="Compact"/>
-            </w:pPr>
-            <w:r>
-              <w:t xml:space="preserve">0,875</w:t>
-            </w:r>
-          </w:p>
-        </w:tc>
-        <w:tc>
-          <w:tcPr/>
-          <w:p>
-            <w:pPr>
-              <w:keepNext/>
-              <w:pStyle w:val="Compact"/>
-            </w:pPr>
-            <w:r>
-              <w:t xml:space="preserve">0,757</w:t>
-            </w:r>
-          </w:p>
-        </w:tc>
-        <w:tc>
-          <w:tcPr/>
-          <w:p>
-            <w:pPr>
-              <w:keepNext/>
-              <w:pStyle w:val="Compact"/>
-            </w:pPr>
-            <w:r>
-              <w:t xml:space="preserve">0,812</w:t>
-            </w:r>
-          </w:p>
-        </w:tc>
-        <w:tc>
-          <w:tcPr/>
-          <w:p>
-            <w:pPr>
-              <w:keepNext/>
-              <w:pStyle w:val="Compact"/>
-            </w:pPr>
-            <w:r>
-              <w:t xml:space="preserve">8</w:t>
-            </w:r>
-          </w:p>
-        </w:tc>
-        <w:tc>
-          <w:tcPr/>
-          <w:p>
-            <w:pPr>
-              <w:keepNext/>
-              <w:pStyle w:val="Compact"/>
-            </w:pPr>
-            <w:r>
-              <w:t xml:space="preserve">18</w:t>
-            </w:r>
-          </w:p>
-        </w:tc>
-      </w:tr>
-      <w:tr>
-        <w:tc>
-          <w:tcPr/>
-          <w:p>
-            <w:pPr>
-              <w:keepNext/>
-              <w:pStyle w:val="Compact"/>
-            </w:pPr>
-            <w:r>
-              <w:t xml:space="preserve">LR, τ*</w:t>
-            </w:r>
-          </w:p>
-        </w:tc>
-        <w:tc>
-          <w:tcPr/>
-          <w:p>
-            <w:pPr>
-              <w:keepNext/>
-              <w:pStyle w:val="Compact"/>
-            </w:pPr>
-            <w:r>
-              <w:t xml:space="preserve">0,931</w:t>
-            </w:r>
-          </w:p>
-        </w:tc>
-        <w:tc>
-          <w:tcPr/>
-          <w:p>
-            <w:pPr>
-              <w:keepNext/>
-              <w:pStyle w:val="Compact"/>
-            </w:pPr>
-            <w:r>
-              <w:t xml:space="preserve">0,730</w:t>
-            </w:r>
-          </w:p>
-        </w:tc>
-        <w:tc>
-          <w:tcPr/>
-          <w:p>
-            <w:pPr>
-              <w:keepNext/>
-              <w:pStyle w:val="Compact"/>
-            </w:pPr>
-            <w:r>
-              <w:t xml:space="preserve">0,818</w:t>
-            </w:r>
-          </w:p>
-        </w:tc>
-        <w:tc>
-          <w:tcPr/>
-          <w:p>
-            <w:pPr>
-              <w:keepNext/>
-              <w:pStyle w:val="Compact"/>
-            </w:pPr>
-            <w:r>
-              <w:t xml:space="preserve">4</w:t>
-            </w:r>
-          </w:p>
-        </w:tc>
-        <w:tc>
-          <w:tcPr/>
-          <w:p>
-            <w:pPr>
-              <w:keepNext/>
-              <w:pStyle w:val="Compact"/>
-            </w:pPr>
-            <w:r>
-              <w:t xml:space="preserve">20</w:t>
-            </w:r>
-          </w:p>
-        </w:tc>
-      </w:tr>
-      <w:tr>
-        <w:tc>
-          <w:tcPr/>
-          <w:p>
-            <w:pPr>
-              <w:keepNext/>
-              <w:pStyle w:val="Compact"/>
-            </w:pPr>
-            <w:r>
-              <w:t xml:space="preserve">Autoencoder</w:t>
-            </w:r>
-          </w:p>
-        </w:tc>
-        <w:tc>
-          <w:tcPr/>
-          <w:p>
-            <w:pPr>
-              <w:keepNext/>
-              <w:pStyle w:val="Compact"/>
-            </w:pPr>
-            <w:r>
-              <w:t xml:space="preserve">0,769</w:t>
-            </w:r>
-          </w:p>
-        </w:tc>
-        <w:tc>
-          <w:tcPr/>
-          <w:p>
-            <w:pPr>
-              <w:keepNext/>
-              <w:pStyle w:val="Compact"/>
-            </w:pPr>
-            <w:r>
-              <w:t xml:space="preserve">0,405</w:t>
-            </w:r>
-          </w:p>
-        </w:tc>
-        <w:tc>
-          <w:tcPr/>
-          <w:p>
-            <w:pPr>
-              <w:keepNext/>
-              <w:pStyle w:val="Compact"/>
-            </w:pPr>
-            <w:r>
-              <w:t xml:space="preserve">0,531</w:t>
-            </w:r>
-          </w:p>
-        </w:tc>
-        <w:tc>
-          <w:tcPr/>
-          <w:p>
-            <w:pPr>
-              <w:keepNext/>
-              <w:pStyle w:val="Compact"/>
-            </w:pPr>
-            <w:r>
-              <w:t xml:space="preserve">9</w:t>
-            </w:r>
-          </w:p>
-        </w:tc>
-        <w:tc>
-          <w:tcPr/>
-          <w:p>
-            <w:pPr>
-              <w:keepNext/>
-              <w:pStyle w:val="Compact"/>
-            </w:pPr>
-            <w:r>
-              <w:t xml:space="preserve">44</w:t>
-            </w:r>
-          </w:p>
-        </w:tc>
-      </w:tr>
-      <w:tr>
-        <w:tc>
-          <w:tcPr/>
-          <w:p>
-            <w:pPr>
-              <w:pStyle w:val="Compact"/>
-            </w:pPr>
-            <w:r>
-              <w:t xml:space="preserve">Isolation Forest</w:t>
-            </w:r>
-          </w:p>
-        </w:tc>
-        <w:tc>
-          <w:tcPr/>
-          <w:p>
-            <w:pPr>
-              <w:pStyle w:val="Compact"/>
-            </w:pPr>
-            <w:r>
-              <w:t xml:space="preserve">0,112</w:t>
-            </w:r>
-          </w:p>
-        </w:tc>
-        <w:tc>
-          <w:tcPr/>
-          <w:p>
-            <w:pPr>
-              <w:pStyle w:val="Compact"/>
-            </w:pPr>
-            <w:r>
-              <w:t xml:space="preserve">0,459</w:t>
-            </w:r>
-          </w:p>
-        </w:tc>
-        <w:tc>
-          <w:tcPr/>
-          <w:p>
-            <w:pPr>
-              <w:pStyle w:val="Compact"/>
-            </w:pPr>
-            <w:r>
-              <w:t xml:space="preserve">0,179</w:t>
-            </w:r>
-          </w:p>
-        </w:tc>
-        <w:tc>
-          <w:tcPr/>
-          <w:p>
-            <w:pPr>
-              <w:pStyle w:val="Compact"/>
-            </w:pPr>
-            <w:r>
-              <w:t xml:space="preserve">271</w:t>
-            </w:r>
-          </w:p>
-        </w:tc>
-        <w:tc>
-          <w:tcPr/>
-          <w:p>
-            <w:pPr>
-              <w:pStyle w:val="Compact"/>
-            </w:pPr>
-            <w:r>
-              <w:t xml:space="preserve">40</w:t>
-            </w:r>
-          </w:p>
-        </w:tc>
-      </w:tr>
-    </w:tbl>
-    <w:p>
-      <w:pPr>
-        <w:pStyle w:val="TableNote"/>
-      </w:pPr>
-      <w:r>
-        <w:rPr>
-          <w:i/>
-          <w:iCs/>
-        </w:rPr>
-        <w:t xml:space="preserve">Nota.</w:t>
-      </w:r>
-      <w:r>
-        <w:t xml:space="preserve"> </w:t>
-      </w:r>
-      <w:r>
-        <w:t xml:space="preserve">0,50 = limiar-padrão das bibliotecas; 0,99 = teto da grade censurada (fidelidade v3.2); τ* = ótimo de validação sem censura (MLP 0,9994; LR ≈1,0); Autoencoder e Isolation Forest no corte F1-ótimo de validação.</w:t>
-      </w:r>
-    </w:p>
-    <w:bookmarkStart w:id="47" w:name="o-efeito-do-ponto-de-operação"/>
-    <w:p>
-      <w:pPr>
-        <w:pStyle w:val="Heading3"/>
-      </w:pPr>
-      <w:r>
-        <w:t xml:space="preserve">6.1. O efeito do ponto de operação</w:t>
-      </w:r>
-    </w:p>
-    <w:p>
-      <w:pPr>
-        <w:pStyle w:val="FirstParagraph"/>
-      </w:pPr>
-      <w:r>
-        <w:t xml:space="preserve">Deslocar o limiar do MLP de 0,5 para o ótimo selecionado em validação sem censura (τ* = 0,9994) move o F1 de teste de 0,267 para 0,812 — um ganho de +0,545 obtido por um único escalar, sem tocar em arquitetura, pesos ou dados (Figura 3).</w:t>
-      </w:r>
-    </w:p>
-    <w:p>
-      <w:pPr>
-        <w:pStyle w:val="CaptionLabel"/>
-      </w:pPr>
-      <w:r>
-        <w:t xml:space="preserve">Figura 3</w:t>
-      </w:r>
-    </w:p>
-    <w:p>
-      <w:pPr>
-        <w:pStyle w:val="CaptionText"/>
-      </w:pPr>
-      <w:r>
-        <w:t xml:space="preserve">Varredura de limiar do MLP (validação e teste) sobre a grade 0,01–0,99, com o default 0,5, o teto da grade (0,99) e o ótimo não-censurado τ*=0,9994 (estrela) marcados. O deslocamento do ponto de operação move o F1 mais do que qualquer troca de arquitetura da Tabela 1</w:t>
       </w:r>
     </w:p>
     <w:p>
@@ -1121,7 +503,7 @@
               <a:graphicData uri="http://schemas.openxmlformats.org/drawingml/2006/picture">
                 <pic:pic>
                   <pic:nvPicPr>
-                    <pic:cNvPr descr="../../output/figures/fig3_threshold_sweep.png" id="43" name="Picture"/>
+                    <pic:cNvPr descr="../../output/figures/fig2_pr_curves_test.png" id="43" name="Picture"/>
                     <pic:cNvPicPr>
                       <a:picLocks noChangeArrowheads="1" noChangeAspect="1"/>
                     </pic:cNvPicPr>
@@ -1156,18 +538,10 @@
     </w:p>
     <w:p>
       <w:pPr>
-        <w:pStyle w:val="BodyText"/>
-      </w:pPr>
-      <w:r>
-        <w:t xml:space="preserve">Em termos operacionais, os falsos positivos caem de 348 para 8 (−97,7%) ao custo de 9 verdadeiros positivos (65→56); a Figura 4 contrasta as matrizes de confusão nos dois pontos.</w:t>
-      </w:r>
-    </w:p>
-    <w:p>
-      <w:pPr>
         <w:pStyle w:val="CaptionLabel"/>
       </w:pPr>
       <w:r>
-        <w:t xml:space="preserve">Figura 4</w:t>
+        <w:t xml:space="preserve">Tabela 1</w:t>
       </w:r>
     </w:p>
     <w:p>
@@ -1175,7 +549,626 @@
         <w:pStyle w:val="CaptionText"/>
       </w:pPr>
       <w:r>
-        <w:t xml:space="preserve">Matrizes de confusão do MLP no teste nos dois pontos de operação: no default 0,5, 348 falsos positivos e 9 falsos negativos; em τ*=0,9994, 8 falsos positivos e 18 falsos negativos. O mesmo modelo, dois comportamentos operacionais</w:t>
+        <w:t xml:space="preserve">Desempenho no teste por modelo e ponto de operação</w:t>
+      </w:r>
+    </w:p>
+    <w:tbl>
+      <w:tblPr>
+        <w:tblLayout w:type="fixed"/>
+        <w:tblLayout w:type="fixed"/>
+        <w:tblStyle w:val="Table"/>
+        <w:tblW w:type="auto" w:w="0"/>
+        <w:tblLook w:firstRow="1" w:lastRow="0" w:firstColumn="0" w:lastColumn="0" w:noHBand="0" w:noVBand="0" w:val="0020"/>
+      </w:tblPr>
+      <w:tblGrid>
+        <w:gridCol w:w="2674"/>
+        <w:gridCol w:w="1337"/>
+        <w:gridCol w:w="1337"/>
+        <w:gridCol w:w="1337"/>
+        <w:gridCol w:w="1337"/>
+        <w:gridCol w:w="1338"/>
+      </w:tblGrid>
+      <w:tr>
+        <w:trPr>
+          <w:tblHeader w:val="on"/>
+        </w:trPr>
+        <w:tc>
+          <w:tcPr/>
+          <w:p>
+            <w:pPr>
+              <w:keepNext/>
+              __KN__
+              <w:pStyle w:val="Compact"/>
+            </w:pPr>
+            <w:r>
+              <w:t xml:space="preserve">Modelo e limiar</w:t>
+            </w:r>
+          </w:p>
+        </w:tc>
+        <w:tc>
+          <w:tcPr/>
+          <w:p>
+            <w:pPr>
+              <w:keepNext/>
+              __KN__
+              <w:pStyle w:val="Compact"/>
+            </w:pPr>
+            <w:r>
+              <w:t xml:space="preserve">Precisão</w:t>
+            </w:r>
+          </w:p>
+        </w:tc>
+        <w:tc>
+          <w:tcPr/>
+          <w:p>
+            <w:pPr>
+              <w:keepNext/>
+              __KN__
+              <w:pStyle w:val="Compact"/>
+            </w:pPr>
+            <w:r>
+              <w:t xml:space="preserve">Revocação</w:t>
+            </w:r>
+          </w:p>
+        </w:tc>
+        <w:tc>
+          <w:tcPr/>
+          <w:p>
+            <w:pPr>
+              <w:keepNext/>
+              __KN__
+              <w:pStyle w:val="Compact"/>
+            </w:pPr>
+            <w:r>
+              <w:t xml:space="preserve">F1</w:t>
+            </w:r>
+          </w:p>
+        </w:tc>
+        <w:tc>
+          <w:tcPr/>
+          <w:p>
+            <w:pPr>
+              <w:keepNext/>
+              __KN__
+              <w:pStyle w:val="Compact"/>
+            </w:pPr>
+            <w:r>
+              <w:t xml:space="preserve">FP</w:t>
+            </w:r>
+          </w:p>
+        </w:tc>
+        <w:tc>
+          <w:tcPr/>
+          <w:p>
+            <w:pPr>
+              <w:keepNext/>
+              __KN__
+              <w:pStyle w:val="Compact"/>
+            </w:pPr>
+            <w:r>
+              <w:t xml:space="preserve">FN</w:t>
+            </w:r>
+          </w:p>
+        </w:tc>
+      </w:tr>
+      <w:tr>
+        <w:tc>
+          <w:tcPr/>
+          <w:p>
+            <w:pPr>
+              <w:keepNext/>
+              __KN__
+              <w:pStyle w:val="Compact"/>
+            </w:pPr>
+            <w:r>
+              <w:t xml:space="preserve">MLP, 0,50</w:t>
+            </w:r>
+          </w:p>
+        </w:tc>
+        <w:tc>
+          <w:tcPr/>
+          <w:p>
+            <w:pPr>
+              <w:keepNext/>
+              __KN__
+              <w:pStyle w:val="Compact"/>
+            </w:pPr>
+            <w:r>
+              <w:t xml:space="preserve">0,157</w:t>
+            </w:r>
+          </w:p>
+        </w:tc>
+        <w:tc>
+          <w:tcPr/>
+          <w:p>
+            <w:pPr>
+              <w:keepNext/>
+              __KN__
+              <w:pStyle w:val="Compact"/>
+            </w:pPr>
+            <w:r>
+              <w:t xml:space="preserve">0,878</w:t>
+            </w:r>
+          </w:p>
+        </w:tc>
+        <w:tc>
+          <w:tcPr/>
+          <w:p>
+            <w:pPr>
+              <w:keepNext/>
+              __KN__
+              <w:pStyle w:val="Compact"/>
+            </w:pPr>
+            <w:r>
+              <w:t xml:space="preserve">0,267</w:t>
+            </w:r>
+          </w:p>
+        </w:tc>
+        <w:tc>
+          <w:tcPr/>
+          <w:p>
+            <w:pPr>
+              <w:keepNext/>
+              __KN__
+              <w:pStyle w:val="Compact"/>
+            </w:pPr>
+            <w:r>
+              <w:t xml:space="preserve">348</w:t>
+            </w:r>
+          </w:p>
+        </w:tc>
+        <w:tc>
+          <w:tcPr/>
+          <w:p>
+            <w:pPr>
+              <w:keepNext/>
+              __KN__
+              <w:pStyle w:val="Compact"/>
+            </w:pPr>
+            <w:r>
+              <w:t xml:space="preserve">9</w:t>
+            </w:r>
+          </w:p>
+        </w:tc>
+      </w:tr>
+      <w:tr>
+        <w:tc>
+          <w:tcPr/>
+          <w:p>
+            <w:pPr>
+              <w:keepNext/>
+              __KN__
+              <w:pStyle w:val="Compact"/>
+            </w:pPr>
+            <w:r>
+              <w:t xml:space="preserve">MLP, 0,99</w:t>
+            </w:r>
+          </w:p>
+        </w:tc>
+        <w:tc>
+          <w:tcPr/>
+          <w:p>
+            <w:pPr>
+              <w:keepNext/>
+              __KN__
+              <w:pStyle w:val="Compact"/>
+            </w:pPr>
+            <w:r>
+              <w:t xml:space="preserve">0,769</w:t>
+            </w:r>
+          </w:p>
+        </w:tc>
+        <w:tc>
+          <w:tcPr/>
+          <w:p>
+            <w:pPr>
+              <w:keepNext/>
+              __KN__
+              <w:pStyle w:val="Compact"/>
+            </w:pPr>
+            <w:r>
+              <w:t xml:space="preserve">0,811</w:t>
+            </w:r>
+          </w:p>
+        </w:tc>
+        <w:tc>
+          <w:tcPr/>
+          <w:p>
+            <w:pPr>
+              <w:keepNext/>
+              __KN__
+              <w:pStyle w:val="Compact"/>
+            </w:pPr>
+            <w:r>
+              <w:t xml:space="preserve">0,790</w:t>
+            </w:r>
+          </w:p>
+        </w:tc>
+        <w:tc>
+          <w:tcPr/>
+          <w:p>
+            <w:pPr>
+              <w:keepNext/>
+              __KN__
+              <w:pStyle w:val="Compact"/>
+            </w:pPr>
+            <w:r>
+              <w:t xml:space="preserve">18</w:t>
+            </w:r>
+          </w:p>
+        </w:tc>
+        <w:tc>
+          <w:tcPr/>
+          <w:p>
+            <w:pPr>
+              <w:keepNext/>
+              __KN__
+              <w:pStyle w:val="Compact"/>
+            </w:pPr>
+            <w:r>
+              <w:t xml:space="preserve">14</w:t>
+            </w:r>
+          </w:p>
+        </w:tc>
+      </w:tr>
+      <w:tr>
+        <w:tc>
+          <w:tcPr/>
+          <w:p>
+            <w:pPr>
+              <w:keepNext/>
+              __KN__
+              <w:pStyle w:val="Compact"/>
+            </w:pPr>
+            <w:r>
+              <w:t xml:space="preserve">MLP, τ*</w:t>
+            </w:r>
+          </w:p>
+        </w:tc>
+        <w:tc>
+          <w:tcPr/>
+          <w:p>
+            <w:pPr>
+              <w:keepNext/>
+              __KN__
+              <w:pStyle w:val="Compact"/>
+            </w:pPr>
+            <w:r>
+              <w:t xml:space="preserve">0,875</w:t>
+            </w:r>
+          </w:p>
+        </w:tc>
+        <w:tc>
+          <w:tcPr/>
+          <w:p>
+            <w:pPr>
+              <w:keepNext/>
+              __KN__
+              <w:pStyle w:val="Compact"/>
+            </w:pPr>
+            <w:r>
+              <w:t xml:space="preserve">0,757</w:t>
+            </w:r>
+          </w:p>
+        </w:tc>
+        <w:tc>
+          <w:tcPr/>
+          <w:p>
+            <w:pPr>
+              <w:keepNext/>
+              __KN__
+              <w:pStyle w:val="Compact"/>
+            </w:pPr>
+            <w:r>
+              <w:t xml:space="preserve">0,812</w:t>
+            </w:r>
+          </w:p>
+        </w:tc>
+        <w:tc>
+          <w:tcPr/>
+          <w:p>
+            <w:pPr>
+              <w:keepNext/>
+              __KN__
+              <w:pStyle w:val="Compact"/>
+            </w:pPr>
+            <w:r>
+              <w:t xml:space="preserve">8</w:t>
+            </w:r>
+          </w:p>
+        </w:tc>
+        <w:tc>
+          <w:tcPr/>
+          <w:p>
+            <w:pPr>
+              <w:keepNext/>
+              __KN__
+              <w:pStyle w:val="Compact"/>
+            </w:pPr>
+            <w:r>
+              <w:t xml:space="preserve">18</w:t>
+            </w:r>
+          </w:p>
+        </w:tc>
+      </w:tr>
+      <w:tr>
+        <w:tc>
+          <w:tcPr/>
+          <w:p>
+            <w:pPr>
+              <w:keepNext/>
+              __KN__
+              <w:pStyle w:val="Compact"/>
+            </w:pPr>
+            <w:r>
+              <w:t xml:space="preserve">LR, τ*</w:t>
+            </w:r>
+          </w:p>
+        </w:tc>
+        <w:tc>
+          <w:tcPr/>
+          <w:p>
+            <w:pPr>
+              <w:keepNext/>
+              __KN__
+              <w:pStyle w:val="Compact"/>
+            </w:pPr>
+            <w:r>
+              <w:t xml:space="preserve">0,931</w:t>
+            </w:r>
+          </w:p>
+        </w:tc>
+        <w:tc>
+          <w:tcPr/>
+          <w:p>
+            <w:pPr>
+              <w:keepNext/>
+              __KN__
+              <w:pStyle w:val="Compact"/>
+            </w:pPr>
+            <w:r>
+              <w:t xml:space="preserve">0,730</w:t>
+            </w:r>
+          </w:p>
+        </w:tc>
+        <w:tc>
+          <w:tcPr/>
+          <w:p>
+            <w:pPr>
+              <w:keepNext/>
+              __KN__
+              <w:pStyle w:val="Compact"/>
+            </w:pPr>
+            <w:r>
+              <w:t xml:space="preserve">0,818</w:t>
+            </w:r>
+          </w:p>
+        </w:tc>
+        <w:tc>
+          <w:tcPr/>
+          <w:p>
+            <w:pPr>
+              <w:keepNext/>
+              __KN__
+              <w:pStyle w:val="Compact"/>
+            </w:pPr>
+            <w:r>
+              <w:t xml:space="preserve">4</w:t>
+            </w:r>
+          </w:p>
+        </w:tc>
+        <w:tc>
+          <w:tcPr/>
+          <w:p>
+            <w:pPr>
+              <w:keepNext/>
+              __KN__
+              <w:pStyle w:val="Compact"/>
+            </w:pPr>
+            <w:r>
+              <w:t xml:space="preserve">20</w:t>
+            </w:r>
+          </w:p>
+        </w:tc>
+      </w:tr>
+      <w:tr>
+        <w:tc>
+          <w:tcPr/>
+          <w:p>
+            <w:pPr>
+              <w:keepNext/>
+              __KN__
+              <w:pStyle w:val="Compact"/>
+            </w:pPr>
+            <w:r>
+              <w:t xml:space="preserve">Autoencoder</w:t>
+            </w:r>
+          </w:p>
+        </w:tc>
+        <w:tc>
+          <w:tcPr/>
+          <w:p>
+            <w:pPr>
+              <w:keepNext/>
+              __KN__
+              <w:pStyle w:val="Compact"/>
+            </w:pPr>
+            <w:r>
+              <w:t xml:space="preserve">0,769</w:t>
+            </w:r>
+          </w:p>
+        </w:tc>
+        <w:tc>
+          <w:tcPr/>
+          <w:p>
+            <w:pPr>
+              <w:keepNext/>
+              __KN__
+              <w:pStyle w:val="Compact"/>
+            </w:pPr>
+            <w:r>
+              <w:t xml:space="preserve">0,405</w:t>
+            </w:r>
+          </w:p>
+        </w:tc>
+        <w:tc>
+          <w:tcPr/>
+          <w:p>
+            <w:pPr>
+              <w:keepNext/>
+              __KN__
+              <w:pStyle w:val="Compact"/>
+            </w:pPr>
+            <w:r>
+              <w:t xml:space="preserve">0,531</w:t>
+            </w:r>
+          </w:p>
+        </w:tc>
+        <w:tc>
+          <w:tcPr/>
+          <w:p>
+            <w:pPr>
+              <w:keepNext/>
+              __KN__
+              <w:pStyle w:val="Compact"/>
+            </w:pPr>
+            <w:r>
+              <w:t xml:space="preserve">9</w:t>
+            </w:r>
+          </w:p>
+        </w:tc>
+        <w:tc>
+          <w:tcPr/>
+          <w:p>
+            <w:pPr>
+              <w:keepNext/>
+              __KN__
+              <w:pStyle w:val="Compact"/>
+            </w:pPr>
+            <w:r>
+              <w:t xml:space="preserve">44</w:t>
+            </w:r>
+          </w:p>
+        </w:tc>
+      </w:tr>
+      <w:tr>
+        <w:tc>
+          <w:tcPr/>
+          <w:p>
+            <w:pPr>
+              <w:pStyle w:val="Compact"/>
+            </w:pPr>
+            <w:r>
+              <w:t xml:space="preserve">Isolation Forest</w:t>
+            </w:r>
+          </w:p>
+        </w:tc>
+        <w:tc>
+          <w:tcPr/>
+          <w:p>
+            <w:pPr>
+              <w:pStyle w:val="Compact"/>
+            </w:pPr>
+            <w:r>
+              <w:t xml:space="preserve">0,112</w:t>
+            </w:r>
+          </w:p>
+        </w:tc>
+        <w:tc>
+          <w:tcPr/>
+          <w:p>
+            <w:pPr>
+              <w:pStyle w:val="Compact"/>
+            </w:pPr>
+            <w:r>
+              <w:t xml:space="preserve">0,459</w:t>
+            </w:r>
+          </w:p>
+        </w:tc>
+        <w:tc>
+          <w:tcPr/>
+          <w:p>
+            <w:pPr>
+              <w:pStyle w:val="Compact"/>
+            </w:pPr>
+            <w:r>
+              <w:t xml:space="preserve">0,179</w:t>
+            </w:r>
+          </w:p>
+        </w:tc>
+        <w:tc>
+          <w:tcPr/>
+          <w:p>
+            <w:pPr>
+              <w:pStyle w:val="Compact"/>
+            </w:pPr>
+            <w:r>
+              <w:t xml:space="preserve">271</w:t>
+            </w:r>
+          </w:p>
+        </w:tc>
+        <w:tc>
+          <w:tcPr/>
+          <w:p>
+            <w:pPr>
+              <w:pStyle w:val="Compact"/>
+            </w:pPr>
+            <w:r>
+              <w:t xml:space="preserve">40</w:t>
+            </w:r>
+          </w:p>
+        </w:tc>
+      </w:tr>
+    </w:tbl>
+    <w:p>
+      <w:pPr>
+        <w:pStyle w:val="TableNote"/>
+      </w:pPr>
+      <w:r>
+        <w:rPr>
+          <w:i/>
+          <w:iCs/>
+        </w:rPr>
+        <w:t xml:space="preserve">Nota.</w:t>
+      </w:r>
+      <w:r>
+        <w:t xml:space="preserve"> </w:t>
+      </w:r>
+      <w:r>
+        <w:t xml:space="preserve">Valores arredondados a três casas decimais. 0,50 = limiar-padrão das bibliotecas; 0,99 = teto da grade censurada (fidelidade v3.2); τ* = ótimo de validação sem censura (MLP 0,9994; LR ≈1,0); Autoencoder e Isolation Forest no corte F1-ótimo de validação.</w:t>
+      </w:r>
+    </w:p>
+    <w:bookmarkStart w:id="50" w:name="o-efeito-do-ponto-de-operação"/>
+    <w:p>
+      <w:pPr>
+        <w:pStyle w:val="Heading3"/>
+      </w:pPr>
+      <w:r>
+        <w:t xml:space="preserve">6.1. O efeito do ponto de operação</w:t>
+      </w:r>
+    </w:p>
+    <w:p>
+      <w:pPr>
+        <w:pStyle w:val="FirstParagraph"/>
+      </w:pPr>
+      <w:r>
+        <w:t xml:space="preserve">Deslocar o limiar do MLP de 0,5 para o ótimo selecionado em validação sem censura (τ* = 0,9994) move o F1 de teste de 0,267 para 0,812 — um ganho de +0,545 obtido por um único escalar, sem tocar em arquitetura, pesos ou dados (Figura 3).</w:t>
+      </w:r>
+    </w:p>
+    <w:p>
+      <w:pPr>
+        <w:pStyle w:val="CaptionLabel"/>
+      </w:pPr>
+      <w:r>
+        <w:t xml:space="preserve">Figura 3</w:t>
+      </w:r>
+    </w:p>
+    <w:p>
+      <w:pPr>
+        <w:pStyle w:val="CaptionText"/>
+      </w:pPr>
+      <w:r>
+        <w:t xml:space="preserve">Varredura de limiar do MLP (validação e teste) sobre a grade 0,01–0,99, com o default 0,5, o teto da grade (0,99) e o ótimo não-censurado τ*=0,9994 (estrela) marcados. O deslocamento do ponto de operação move o F1 mais do que qualquer troca de arquitetura da Tabela 1</w:t>
       </w:r>
     </w:p>
     <w:p>
@@ -1185,20 +1178,91 @@
       <w:r>
         <w:drawing>
           <wp:inline>
-            <wp:extent cx="5943600" cy="2717074"/>
+            <wp:extent cx="5029200" cy="3657600"/>
             <wp:effectExtent b="0" l="0" r="0" t="0"/>
             <wp:docPr descr="" title="" id="45" name="Picture"/>
             <a:graphic>
               <a:graphicData uri="http://schemas.openxmlformats.org/drawingml/2006/picture">
                 <pic:pic>
                   <pic:nvPicPr>
-                    <pic:cNvPr descr="../../output/figures/fig4_confusion_shift.png" id="46" name="Picture"/>
+                    <pic:cNvPr descr="../../output/figures/fig3_threshold_sweep.png" id="46" name="Picture"/>
                     <pic:cNvPicPr>
                       <a:picLocks noChangeArrowheads="1" noChangeAspect="1"/>
                     </pic:cNvPicPr>
                   </pic:nvPicPr>
                   <pic:blipFill>
                     <a:blip r:embed="rId44"/>
+                    <a:stretch>
+                      <a:fillRect/>
+                    </a:stretch>
+                  </pic:blipFill>
+                  <pic:spPr bwMode="auto">
+                    <a:xfrm>
+                      <a:off x="0" y="0"/>
+                      <a:ext cx="5029200" cy="3657600"/>
+                    </a:xfrm>
+                    <a:prstGeom prst="rect">
+                      <a:avLst/>
+                    </a:prstGeom>
+                    <a:noFill/>
+                    <a:ln w="9525">
+                      <a:noFill/>
+                      <a:headEnd/>
+                      <a:tailEnd/>
+                    </a:ln>
+                  </pic:spPr>
+                </pic:pic>
+              </a:graphicData>
+            </a:graphic>
+          </wp:inline>
+        </w:drawing>
+      </w:r>
+    </w:p>
+    <w:p>
+      <w:pPr>
+        <w:pStyle w:val="BodyText"/>
+      </w:pPr>
+      <w:r>
+        <w:t xml:space="preserve">Em termos operacionais, os falsos positivos caem de 348 para 8 (−97,7%) ao custo de 9 verdadeiros positivos (65→56); a Figura 4 contrasta as matrizes de confusão nos dois pontos.</w:t>
+      </w:r>
+    </w:p>
+    <w:p>
+      <w:pPr>
+        <w:pStyle w:val="CaptionLabel"/>
+      </w:pPr>
+      <w:r>
+        <w:t xml:space="preserve">Figura 4</w:t>
+      </w:r>
+    </w:p>
+    <w:p>
+      <w:pPr>
+        <w:pStyle w:val="CaptionText"/>
+      </w:pPr>
+      <w:r>
+        <w:t xml:space="preserve">Matrizes de confusão do MLP no teste nos dois pontos de operação: no default 0,5, 348 falsos positivos e 9 falsos negativos; em τ*=0,9994, 8 falsos positivos e 18 falsos negativos. O mesmo modelo, dois comportamentos operacionais</w:t>
+      </w:r>
+    </w:p>
+    <w:p>
+      <w:pPr>
+        <w:pStyle w:val="FigureImage"/>
+      </w:pPr>
+      <w:r>
+        <w:drawing>
+          <wp:inline>
+            <wp:extent cx="5943600" cy="2717074"/>
+            <wp:effectExtent b="0" l="0" r="0" t="0"/>
+            <wp:docPr descr="" title="" id="48" name="Picture"/>
+            <a:graphic>
+              <a:graphicData uri="http://schemas.openxmlformats.org/drawingml/2006/picture">
+                <pic:pic>
+                  <pic:nvPicPr>
+                    <pic:cNvPr descr="../../output/figures/fig4_confusion_shift.png" id="49" name="Picture"/>
+                    <pic:cNvPicPr>
+                      <a:picLocks noChangeArrowheads="1" noChangeAspect="1"/>
+                    </pic:cNvPicPr>
+                  </pic:nvPicPr>
+                  <pic:blipFill>
+                    <a:blip r:embed="rId47"/>
                     <a:stretch>
                       <a:fillRect/>
                     </a:stretch>
@@ -1233,8 +1297,8 @@
         <w:t xml:space="preserve">O Fβ=2, que pesa revocação sobre precisão, atinge 0,779 no teste no limiar correspondente. A comparação entre o swing de limiar e o gap entre arquiteturas exige uma ressalva de comensurabilidade: o primeiro corrige uma má configuração (o default 0,5 é um ponto operacional catastrófico sob reponderação de custo), enquanto o segundo compara alternativas ambas otimizadas. É exatamente essa a mensagem de engenharia: a correção barata e auditável precede — e excede em efeito, aqui por duas ordens de magnitude — a decisão cara de arquitetura.</w:t>
       </w:r>
     </w:p>
-    <w:bookmarkEnd w:id="47"/>
-    <w:bookmarkStart w:id="51" w:name="Xc02d3e2a94b1aced003c08d48f37645f0313521"/>
+    <w:bookmarkEnd w:id="50"/>
+    <w:bookmarkStart w:id="54" w:name="Xc02d3e2a94b1aced003c08d48f37645f0313521"/>
     <w:p>
       <w:pPr>
         <w:pStyle w:val="Heading3"/>
@@ -1256,7 +1320,7 @@
         <w:pStyle w:val="BodyText"/>
       </w:pPr>
       <w:r>
-        <w:t xml:space="preserve">A Tabela 2 confronta os dois regimes de seleção; a Figura 7 mostra a distribuição bootstrap da diferença pareada no regime primário.</w:t>
+        <w:t xml:space="preserve">A Tabela 2 confronta os dois regimes de seleção; a Figura 5 mostra a distribuição bootstrap da diferença pareada no regime primário.</w:t>
       </w:r>
     </w:p>
     <w:p>
@@ -1264,7 +1328,7 @@
         <w:pStyle w:val="CaptionLabel"/>
       </w:pPr>
       <w:r>
-        <w:t xml:space="preserve">Figura 7</w:t>
+        <w:t xml:space="preserve">Figura 5</w:t>
       </w:r>
     </w:p>
     <w:p>
@@ -1284,18 +1348,18 @@
           <wp:inline>
             <wp:extent cx="5029200" cy="3291840"/>
             <wp:effectExtent b="0" l="0" r="0" t="0"/>
-            <wp:docPr descr="" title="" id="49" name="Picture"/>
+            <wp:docPr descr="" title="" id="52" name="Picture"/>
             <a:graphic>
               <a:graphicData uri="http://schemas.openxmlformats.org/drawingml/2006/picture">
                 <pic:pic>
                   <pic:nvPicPr>
-                    <pic:cNvPr descr="../../output/figures/fig7_bootstrap_delta.png" id="50" name="Picture"/>
+                    <pic:cNvPr descr="../../output/figures/fig7_bootstrap_delta.png" id="53" name="Picture"/>
                     <pic:cNvPicPr>
                       <a:picLocks noChangeArrowheads="1" noChangeAspect="1"/>
                     </pic:cNvPicPr>
                   </pic:nvPicPr>
                   <pic:blipFill>
-                    <a:blip r:embed="rId48"/>
+                    <a:blip r:embed="rId51"/>
                     <a:stretch>
                       <a:fillRect/>
                     </a:stretch>
@@ -1341,6 +1405,7 @@
     <w:tbl>
       <w:tblPr>
         <w:tblLayout w:type="fixed"/>
+        <w:tblLayout w:type="fixed"/>
         <w:tblStyle w:val="Table"/>
         <w:tblW w:type="pct" w:w="5000"/>
         <w:tblLayout w:type="fixed"/>
@@ -1360,6 +1425,7 @@
           <w:p>
             <w:pPr>
               <w:keepNext/>
+              __KN__
               <w:pStyle w:val="Compact"/>
             </w:pPr>
             <w:r>
@@ -1372,6 +1438,7 @@
           <w:p>
             <w:pPr>
               <w:keepNext/>
+              __KN__
               <w:pStyle w:val="Compact"/>
             </w:pPr>
             <w:r>
@@ -1384,6 +1451,7 @@
           <w:p>
             <w:pPr>
               <w:keepNext/>
+              __KN__
               <w:pStyle w:val="Compact"/>
             </w:pPr>
             <w:r>
@@ -1398,6 +1466,7 @@
           <w:p>
             <w:pPr>
               <w:keepNext/>
+              __KN__
               <w:pStyle w:val="Compact"/>
             </w:pPr>
             <w:r>
@@ -1410,6 +1479,7 @@
           <w:p>
             <w:pPr>
               <w:keepNext/>
+              __KN__
               <w:pStyle w:val="Compact"/>
             </w:pPr>
             <w:r>
@@ -1422,6 +1492,7 @@
           <w:p>
             <w:pPr>
               <w:keepNext/>
+              __KN__
               <w:pStyle w:val="Compact"/>
             </w:pPr>
             <w:r>
@@ -1436,6 +1507,7 @@
           <w:p>
             <w:pPr>
               <w:keepNext/>
+              __KN__
               <w:pStyle w:val="Compact"/>
             </w:pPr>
             <w:r>
@@ -1448,6 +1520,7 @@
           <w:p>
             <w:pPr>
               <w:keepNext/>
+              __KN__
               <w:pStyle w:val="Compact"/>
             </w:pPr>
             <w:r>
@@ -1460,6 +1533,7 @@
           <w:p>
             <w:pPr>
               <w:keepNext/>
+              __KN__
               <w:pStyle w:val="Compact"/>
             </w:pPr>
             <w:r>
@@ -1474,6 +1548,7 @@
           <w:p>
             <w:pPr>
               <w:keepNext/>
+              __KN__
               <w:pStyle w:val="Compact"/>
             </w:pPr>
             <w:r>
@@ -1486,6 +1561,7 @@
           <w:p>
             <w:pPr>
               <w:keepNext/>
+              __KN__
               <w:pStyle w:val="Compact"/>
             </w:pPr>
             <w:r>
@@ -1498,6 +1574,7 @@
           <w:p>
             <w:pPr>
               <w:keepNext/>
+              __KN__
               <w:pStyle w:val="Compact"/>
             </w:pPr>
             <w:r>
@@ -1512,6 +1589,7 @@
           <w:p>
             <w:pPr>
               <w:keepNext/>
+              __KN__
               <w:pStyle w:val="Compact"/>
             </w:pPr>
             <w:r>
@@ -1524,6 +1602,7 @@
           <w:p>
             <w:pPr>
               <w:keepNext/>
+              __KN__
               <w:pStyle w:val="Compact"/>
             </w:pPr>
             <w:r>
@@ -1536,6 +1615,7 @@
           <w:p>
             <w:pPr>
               <w:keepNext/>
+              __KN__
               <w:pStyle w:val="Compact"/>
             </w:pPr>
             <w:r>
@@ -1550,6 +1630,7 @@
           <w:p>
             <w:pPr>
               <w:keepNext/>
+              __KN__
               <w:pStyle w:val="Compact"/>
             </w:pPr>
             <w:r>
@@ -1562,6 +1643,7 @@
           <w:p>
             <w:pPr>
               <w:keepNext/>
+              __KN__
               <w:pStyle w:val="Compact"/>
             </w:pPr>
             <w:r>
@@ -1574,6 +1656,7 @@
           <w:p>
             <w:pPr>
               <w:keepNext/>
+              __KN__
               <w:pStyle w:val="Compact"/>
             </w:pPr>
             <w:r>
@@ -1635,8 +1718,8 @@
         <w:t xml:space="preserve">. Um limite arbitrário de varredura, herdado sem exame, fabrica uma conclusão de arquitetura com aparência de rigor estatístico. Este é o resultado instrutivo central do estudo — um modo de falha previsível em retrospecto, porém rotineiramente herdado sem exame, dado que grades truncadas como [0,01; 0,99] são idiomáticas em tutoriais e códigos de referência: nem vazamento clássico nem acaso, mas uma micro-decisão de protocolo, basta para inverter a conclusão qualitativa de uma comparação de modelos.</w:t>
       </w:r>
     </w:p>
-    <w:bookmarkEnd w:id="51"/>
-    <w:bookmarkStart w:id="52" w:name="Xa10fb5b5c7ba9c13deb9641099c35782d746fc9"/>
+    <w:bookmarkEnd w:id="54"/>
+    <w:bookmarkStart w:id="55" w:name="Xa10fb5b5c7ba9c13deb9641099c35782d746fc9"/>
     <w:p>
       <w:pPr>
         <w:pStyle w:val="Heading3"/>
@@ -1650,11 +1733,11 @@
         <w:pStyle w:val="FirstParagraph"/>
       </w:pPr>
       <w:r>
-        <w:t xml:space="preserve">Vinte re-treinos do MLP (sementes 1–20; partição, padronização e protocolo fixos; limiar re-selecionado em validação por semente) produzem F1 de teste com média 0,814, desvio-padrão 0,016 e amplitude 0,7879–0,8429. A Regressão Logística, determinística, marca 0,8182 — dentro de meio desvio-padrão da média do MLP. O gap por semente varia de −0,030 a +0,025, e o MLP supera a LR em apenas 8 das 20 sementes. Ceteris paribus, re-treinar o mesmo modelo desloca o resultado mais do que trocá-lo pelo baseline linear — quantificação local do fenômeno que Bouthillier et al. (2021) documentaram em escala: fontes de variância ignoradas excedem os deltas publicados entre métodos. Registre-se ainda a observação inter-plataforma (n=2, ilustrativa): a mesma configuração com semente 42 produziu F1 de 0,747 no ambiente original (Colab, x86, multi-thread) e 0,789 na re-execução determinística local (ARM, thread única) — diferença de 0,042, novamente maior que o gap entre arquiteturas.</w:t>
-      </w:r>
-    </w:p>
-    <w:bookmarkEnd w:id="52"/>
-    <w:bookmarkStart w:id="53" w:name="detectores-não-supervisionados"/>
+        <w:t xml:space="preserve">Vinte retreinos do MLP (sementes 1–20; partição, padronização e protocolo fixos; limiar novamente selecionado em validação por semente) produzem F1 de teste com média 0,814, desvio-padrão 0,016 e amplitude 0,7879–0,8429. A Regressão Logística, determinística, marca 0,8182 — dentro de meio desvio-padrão da média do MLP. O gap por semente varia de −0,030 a +0,025, e o MLP supera a LR em apenas 8 das 20 sementes. Ceteris paribus, retreinar o mesmo modelo desloca o resultado mais do que trocá-lo pelo baseline linear — quantificação local do fenômeno que Bouthillier et al. (2021) documentaram em escala: fontes de variância ignoradas excedem os deltas publicados entre métodos. Registre-se ainda a observação inter-plataforma (n=2, ilustrativa): a mesma configuração com semente 42 produziu F1 de 0,747 no ambiente original (Colab, x86, multi-thread) e 0,789 na reexecução determinística local (ARM, thread única) — diferença de 0,042, novamente maior que o gap entre arquiteturas.</w:t>
+      </w:r>
+    </w:p>
+    <w:bookmarkEnd w:id="55"/>
+    <w:bookmarkStart w:id="56" w:name="detectores-não-supervisionados"/>
     <w:p>
       <w:pPr>
         <w:pStyle w:val="Heading3"/>
@@ -1671,8 +1754,8 @@
         <w:t xml:space="preserve">Autoencoder e Isolation Forest ficam substancialmente abaixo dos supervisionados (F1 de 0,531 e 0,179 contra ~0,81), confirmando que, com rótulos disponíveis, o aprendizado supervisionado com reponderação domina a detecção por desvio estrutural (Liu et al., 2008; Pang et al., 2021). O Autoencoder exibe ainda instabilidade qualitativa entre execuções do mesmo protocolo: na execução original alcançou F1 de 0,215 com 300 falsos positivos (precisão 0,130); nesta, 0,531 com 9 falsos positivos (precisão 0,769) — modos de falha opostos, produzidos pela sensibilidade do corte percentil sobre a cauda do erro de reconstrução. Observação com n=2, reportada como alerta prático: limiares percentílicos sobre pontuações de reconstrução são frágeis por construção.</w:t>
       </w:r>
     </w:p>
-    <w:bookmarkEnd w:id="53"/>
-    <w:bookmarkStart w:id="57" w:name="Xbbed02c4ed0d82cc91bda2e82b51b383cf1a8a3"/>
+    <w:bookmarkEnd w:id="56"/>
+    <w:bookmarkStart w:id="60" w:name="Xbbed02c4ed0d82cc91bda2e82b51b383cf1a8a3"/>
     <w:p>
       <w:pPr>
         <w:pStyle w:val="Heading3"/>
@@ -1731,7 +1814,7 @@
         <w:pStyle w:val="BodyText"/>
       </w:pPr>
       <w:r>
-        <w:t xml:space="preserve">Corrigido o defeito, a sensibilidade correta dispensa simulação: com ponto de operação fixo, as taxas de verdadeiros positivos (TPR) e de falsos positivos (FPR) são invariantes à prevalência π, e a precisão segue a identidade prec(π) = π·TPR / (π·TPR + (1−π)·FPR), da qual o F1 deriva em forma fechada (Figura 5, com verificação Monte Carlo pontual). Esta análise usa deliberadamente o ponto de operação da grade de fidelidade (τ=0,99), o mesmo do teste original que está sendo corrigido — não o regime primário da Seção 6.2 —, para que a comparação com a Tabela 3 do material precedente seja ponto a ponto. Para o MLP nesse corte (TPR 0,811; FPR 4,2×10⁻⁴), o F1 analítico cresce de 0,875 em π=1% a 0,895 em π=20% — crescimento mecânico da precisão com a prevalência, não melhoria do modelo; para o Isolation Forest (FPR 15 vezes maior), de 0,440 a 0,619. A leitura honesta é dupla: a métrica F1 é função da prevalência mesmo com detector congelado, e portanto um limiar fixado para 0,17% muda de significado operacional sob outra taxa-base — mais um argumento para tratar o ponto de operação, e não a arquitetura, como o artefato vivo de governança (Dal Pozzolo et al., 2018).</w:t>
+        <w:t xml:space="preserve">Corrigido o defeito, a sensibilidade correta dispensa simulação: com ponto de operação fixo, as taxas de verdadeiros positivos (TPR) e de falsos positivos (FPR) são invariantes à prevalência π, e a precisão segue a identidade prec(π) = π·TPR / (π·TPR + (1−π)·FPR), da qual o F1 deriva em forma fechada (Figura 6, com verificação Monte Carlo pontual). Esta análise usa deliberadamente o ponto de operação da grade de fidelidade (τ=0,99), o mesmo do teste original que está sendo corrigido — não o regime primário da Seção 6.2 —, para que a comparação com a Tabela 3 do material precedente seja ponto a ponto. Para o MLP nesse corte (TPR 0,811; FPR 4,2×10⁻⁴), o F1 analítico cresce de 0,875 em π=1% a 0,895 em π=20% — crescimento mecânico da precisão com a prevalência, não melhoria do modelo; para o Isolation Forest (FPR 15 vezes maior), de 0,440 a 0,619. A leitura honesta é dupla: a métrica F1 é função da prevalência mesmo com detector congelado, e portanto um limiar fixado para 0,17% muda de significado operacional sob outra taxa-base — mais um argumento para tratar o ponto de operação, e não a arquitetura, como o artefato vivo de governança (Dal Pozzolo et al., 2018).</w:t>
       </w:r>
     </w:p>
     <w:p>
@@ -1739,7 +1822,7 @@
         <w:pStyle w:val="CaptionLabel"/>
       </w:pPr>
       <w:r>
-        <w:t xml:space="preserve">Figura 5</w:t>
+        <w:t xml:space="preserve">Figura 6</w:t>
       </w:r>
     </w:p>
     <w:p>
@@ -1759,18 +1842,18 @@
           <wp:inline>
             <wp:extent cx="5029200" cy="3291840"/>
             <wp:effectExtent b="0" l="0" r="0" t="0"/>
-            <wp:docPr descr="" title="" id="55" name="Picture"/>
+            <wp:docPr descr="" title="" id="58" name="Picture"/>
             <a:graphic>
               <a:graphicData uri="http://schemas.openxmlformats.org/drawingml/2006/picture">
                 <pic:pic>
                   <pic:nvPicPr>
-                    <pic:cNvPr descr="../../output/figures/fig5_prior_shift.png" id="56" name="Picture"/>
+                    <pic:cNvPr descr="../../output/figures/fig5_prior_shift.png" id="59" name="Picture"/>
                     <pic:cNvPicPr>
                       <a:picLocks noChangeArrowheads="1" noChangeAspect="1"/>
                     </pic:cNvPicPr>
                   </pic:nvPicPr>
                   <pic:blipFill>
-                    <a:blip r:embed="rId54"/>
+                    <a:blip r:embed="rId57"/>
                     <a:stretch>
                       <a:fillRect/>
                     </a:stretch>
@@ -1797,8 +1880,8 @@
         </w:drawing>
       </w:r>
     </w:p>
-    <w:bookmarkEnd w:id="57"/>
-    <w:bookmarkStart w:id="61" w:name="importância-por-permutação"/>
+    <w:bookmarkEnd w:id="60"/>
+    <w:bookmarkStart w:id="64" w:name="importância-por-permutação"/>
     <w:p>
       <w:pPr>
         <w:pStyle w:val="Heading3"/>
@@ -1812,7 +1895,7 @@
         <w:pStyle w:val="FirstParagraph"/>
       </w:pPr>
       <w:r>
-        <w:t xml:space="preserve">V14 domina a importância por permutação em validação (0,091 ± 0,013; Figura 6), cerca de três vezes a segunda variável (V12, 0,030 ± 0,008) — mas o ranking secundário difere do obtido na execução original (V2 em segundo), reiterando a instabilidade de conclusões finas sob re-treino. Duas ressalvas impedem leitura causal: a importância por permutação marginal é enviesada na presença de correlação (Strobl et al., 2008) — mitigada, mas não eliminada, pela ortogonalidade construtiva dos componentes PCA — e um componente principal anônimo não é um mecanismo de fraude; a rotação que preserva variância pode inclusive destruir a informação decisória relevante (Tembine, 2026).</w:t>
+        <w:t xml:space="preserve">V14 domina a importância por permutação em validação (0,091 ± 0,013; Figura 7), cerca de três vezes a segunda variável (V12, 0,030 ± 0,008) — mas o ranking secundário difere do obtido na execução original (V2 em segundo), reiterando a instabilidade de conclusões finas sob retreino. Duas ressalvas impedem leitura causal: a importância por permutação marginal é enviesada na presença de correlação (Strobl et al., 2008) — mitigada, mas não eliminada, pela ortogonalidade construtiva dos componentes PCA — e um componente principal anônimo não é um mecanismo de fraude; a rotação que preserva variância pode inclusive destruir a informação decisória relevante (Tembine, 2026).</w:t>
       </w:r>
     </w:p>
     <w:p>
@@ -1820,7 +1903,7 @@
         <w:pStyle w:val="CaptionLabel"/>
       </w:pPr>
       <w:r>
-        <w:t xml:space="preserve">Figura 6</w:t>
+        <w:t xml:space="preserve">Figura 7</w:t>
       </w:r>
     </w:p>
     <w:p>
@@ -1828,7 +1911,7 @@
         <w:pStyle w:val="CaptionText"/>
       </w:pPr>
       <w:r>
-        <w:t xml:space="preserve">Importância por permutação do MLP na validação (top 20, queda média de F1 ao permutar). V14 domina com ≈3× a segunda variável; o ranking secundário não é estável entre re-execuções</w:t>
+        <w:t xml:space="preserve">Importância por permutação do MLP na validação (top 20, queda média de F1 ao permutar). V14 domina com ≈3× a segunda variável; o ranking secundário não é estável entre reexecuções</w:t>
       </w:r>
     </w:p>
     <w:p>
@@ -1840,18 +1923,18 @@
           <wp:inline>
             <wp:extent cx="5029200" cy="4114800"/>
             <wp:effectExtent b="0" l="0" r="0" t="0"/>
-            <wp:docPr descr="" title="" id="59" name="Picture"/>
+            <wp:docPr descr="" title="" id="62" name="Picture"/>
             <a:graphic>
               <a:graphicData uri="http://schemas.openxmlformats.org/drawingml/2006/picture">
                 <pic:pic>
                   <pic:nvPicPr>
-                    <pic:cNvPr descr="../../output/figures/fig6_permutation_importance.png" id="60" name="Picture"/>
+                    <pic:cNvPr descr="../../output/figures/fig6_permutation_importance.png" id="63" name="Picture"/>
                     <pic:cNvPicPr>
                       <a:picLocks noChangeArrowheads="1" noChangeAspect="1"/>
                     </pic:cNvPicPr>
                   </pic:nvPicPr>
                   <pic:blipFill>
-                    <a:blip r:embed="rId58"/>
+                    <a:blip r:embed="rId61"/>
                     <a:stretch>
                       <a:fillRect/>
                     </a:stretch>
@@ -1878,9 +1961,9 @@
         </w:drawing>
       </w:r>
     </w:p>
-    <w:bookmarkEnd w:id="61"/>
-    <w:bookmarkEnd w:id="62"/>
-    <w:bookmarkStart w:id="63" w:name="discussão"/>
+    <w:bookmarkEnd w:id="64"/>
+    <w:bookmarkEnd w:id="65"/>
+    <w:bookmarkStart w:id="66" w:name="discussão"/>
     <w:p>
       <w:pPr>
         <w:pStyle w:val="Heading2"/>
@@ -1939,7 +2022,7 @@
         <w:pStyle w:val="BodyText"/>
       </w:pPr>
       <w:r>
-        <w:t xml:space="preserve">Há, por fim, uma lição metaciêntífica no percurso deste artigo. A sequência de estados da própria análise —</w:t>
+        <w:t xml:space="preserve">Há, por fim, uma lição metacientífica no percurso deste artigo. A sequência de estados da própria análise —</w:t>
       </w:r>
       <w:r>
         <w:t xml:space="preserve"> </w:t>
@@ -1963,7 +2046,7 @@
         <w:t xml:space="preserve"> </w:t>
       </w:r>
       <w:r>
-        <w:t xml:space="preserve">na primeira re-execução;</w:t>
+        <w:t xml:space="preserve">na primeira reexecução;</w:t>
       </w:r>
       <w:r>
         <w:t xml:space="preserve"> </w:t>
@@ -1978,8 +2061,8 @@
         <w:t xml:space="preserve">após a remoção da censura de grade — não é um defeito narrativo: é a demonstração, em corpus próprio, de quão pouco protocolo basta para fabricar uma conclusão de arquitetura. A disciplina que desfez as conclusões espúrias não foi um modelo melhor, mas um protocolo melhor: testes de invariantes, hashes, determinismo verificado e validação adversarial da análise antes da redação.</w:t>
       </w:r>
     </w:p>
-    <w:bookmarkEnd w:id="63"/>
-    <w:bookmarkStart w:id="64" w:name="ameaças-à-validade-e-reprodutibilidade"/>
+    <w:bookmarkEnd w:id="66"/>
+    <w:bookmarkStart w:id="67" w:name="ameaças-à-validade-e-reprodutibilidade"/>
     <w:p>
       <w:pPr>
         <w:pStyle w:val="Heading2"/>
@@ -1993,7 +2076,7 @@
         <w:pStyle w:val="FirstParagraph"/>
       </w:pPr>
       <w:r>
-        <w:t xml:space="preserve">Sobre a validade externa: trata-se de um único conjunto de dados, de dois dias de 2013, anonimizado por PCA, com 74 positivos no teste — os intervalos são largos e discretos (limitação declarada dos ICs percentílicos), os rankings reportados são ilustrativos do protocolo e nenhuma extrapolação para</w:t>
+        <w:t xml:space="preserve">Sobre a validade externa: trata-se de um único conjunto de dados, de dois dias de 2013, anonimizado por PCA, com 74 positivos no teste — os intervalos são largos e discretos (limitação declarada dos ICs percentílicos) — com 74 positivos, o poder para detectar gaps de F1 menores que ~0,05 é baixo, e a indistinguibilidade reportada deve ser lida sob essa restrição, os rankings reportados são ilustrativos do protocolo e nenhuma extrapolação para</w:t>
       </w:r>
       <w:r>
         <w:t xml:space="preserve"> </w:t>
@@ -2016,8 +2099,8 @@
         <w:t xml:space="preserve">Sobre a reprodutibilidade: o pacote de replicação contém código, configuração declarativa, testes automatizados dos invariantes de protocolo (partições exatas, padronização só-treino, razão de reponderação, ausência de reamostragem sintética), resultados consolidados, tabelas, figuras em formato vetorial e manifesto de execução com SHA-256 de cada artefato e do conjunto de dados. Duas execuções completas independentes produziram todos os blocos de resultados bit-idênticos na mesma plataforma. O escopo da alegação é preciso: reprodutibilidade determinística de código→dados→resultados na plataforma documentada — não identidade numérica entre plataformas, cuja variação é, ela própria, um dos resultados (Seção 6.3).</w:t>
       </w:r>
     </w:p>
-    <w:bookmarkEnd w:id="64"/>
-    <w:bookmarkStart w:id="65" w:name="considerações-finais"/>
+    <w:bookmarkEnd w:id="67"/>
+    <w:bookmarkStart w:id="68" w:name="considerações-finais"/>
     <w:p>
       <w:pPr>
         <w:pStyle w:val="Heading2"/>
@@ -2031,7 +2114,7 @@
         <w:pStyle w:val="FirstParagraph"/>
       </w:pPr>
       <w:r>
-        <w:t xml:space="preserve">Neste estudo de caso auditável sobre o benchmark ULB/Worldline, a resposta à pergunta da Introdução é assimétrica em duas ordens de magnitude: o ponto de operação move o F1 operacional em +0,545; a troca de arquitetura, no regime correto de seleção, move −0,007 dentro do ruído — menos que re-treinar o mesmo MLP com outra semente. Os dois efeitos têm naturezas distintas — correção de má configuração versus escolha entre alternativas otimizadas — e é exatamente essa assimetria de natureza que fixa a prioridade de engenharia: a correção barata, auditável e de efeito grande precede a decisão cara de efeito indistinguível de ruído. As implicações práticas para engenharia antifraude são diretas: tratar o limiar como artefato de primeira classe — selecionado em validação, versionado, justificado por custo e revisado sob drift de prevalência (Dal Pozzolo et al., 2018) —, tratar reponderação de custo como alternativa preferível à sobreamostragem sintética, e desconfiar de qualquer vitória de arquitetura cujo intervalo de confiança não tenha sido confrontado com a variância de treino do próprio vencedor. Para a pesquisa, o percurso forense deste artigo sugere que parte não trivial das vitórias publicadas no benchmark é artefato de micro-decisões de protocolo — censura de grade, reamostragem defeituosa, vazamento de pré-processamento — detectáveis apenas quando código, dados e análise são publicados de forma verificável.</w:t>
+        <w:t xml:space="preserve">Neste estudo de caso auditável sobre o benchmark ULB/Worldline, a resposta à pergunta da Introdução é assimétrica em duas ordens de magnitude: o ponto de operação move o F1 operacional em +0,545; a troca de arquitetura, no regime correto de seleção, move −0,007 dentro do ruído — menos que retreinar o mesmo MLP com outra semente. Os dois efeitos têm naturezas distintas — correção de má configuração versus escolha entre alternativas otimizadas — e é exatamente essa assimetria de natureza que fixa a prioridade de engenharia: a correção barata, auditável e de efeito grande precede a decisão cara de efeito indistinguível de ruído. As implicações práticas para engenharia antifraude são diretas: tratar o limiar como artefato de primeira classe — selecionado em validação, versionado, justificado por custo e revisado sob drift de prevalência (Dal Pozzolo et al., 2018) —, tratar reponderação de custo como alternativa preferível à sobreamostragem sintética, e desconfiar de qualquer vitória de arquitetura cujo intervalo de confiança não tenha sido confrontado com a variância de treino do próprio vencedor. Para a pesquisa, o percurso forense deste artigo sugere que parte não trivial das vitórias publicadas no benchmark é artefato de micro-decisões de protocolo — censura de grade, reamostragem defeituosa, vazamento de pré-processamento — detectáveis apenas quando código, dados e análise são publicados de forma verificável.</w:t>
       </w:r>
     </w:p>
     <w:p>
@@ -2042,16 +2125,12 @@
         <w:t xml:space="preserve">Direções futuras: (a) replicar a decomposição efeito-limiar × efeito-arquitetura em benchmark com partição temporal e maior cardinalidade positiva (IEEE-CIS), quantificando também a variância de seleção de limiar; (b) acoplar calibração pós-reponderação (temperature scaling sobre a perda ponderada) à derivação de limiar por custo esperado explícito, fechando o elo calibração-decisão-governança; (c) elevar o reporte de variância de treino (multi-semente) e a publicação de manifesto com hashes à condição de prática mínima em comparações de arquitetura na literatura de fraude.</w:t>
       </w:r>
     </w:p>
-    <w:p>
-      <w:r>
-        <w:br w:type="page"/>
-      </w:r>
-    </w:p>
-    <w:bookmarkEnd w:id="65"/>
-    <w:bookmarkStart w:id="66" w:name="referências"/>
+    <w:bookmarkEnd w:id="68"/>
+    <w:bookmarkStart w:id="69" w:name="referências"/>
     <w:p>
       <w:pPr>
         <w:pStyle w:val="Heading2"/>
+        <w:pageBreakBefore/>
       </w:pPr>
       <w:r>
         <w:t xml:space="preserve">Referências</w:t>
@@ -2075,7 +2154,7 @@
         <w:t xml:space="preserve">Balancing the scales: A comprehensive study on tackling class imbalance in binary classification</w:t>
       </w:r>
       <w:r>
-        <w:t xml:space="preserve">. arXiv. https://arxiv.org/abs/2409.19751</w:t>
+        <w:t xml:space="preserve">. arXiv. https://doi.org/10.48550/arXiv.2409.19751</w:t>
       </w:r>
     </w:p>
     <w:p>
@@ -2138,7 +2217,7 @@
         <w:t xml:space="preserve">Proceedings of Machine Learning and Systems, 3</w:t>
       </w:r>
       <w:r>
-        <w:t xml:space="preserve">. https://arxiv.org/abs/2103.03098</w:t>
+        <w:t xml:space="preserve">. https://doi.org/10.48550/arXiv.2103.03098</w:t>
       </w:r>
     </w:p>
     <w:p>
@@ -2318,7 +2397,7 @@
         <w:t xml:space="preserve"> </w:t>
       </w:r>
       <w:r>
-        <w:t xml:space="preserve">arXiv. https://arxiv.org/abs/2201.08528</w:t>
+        <w:t xml:space="preserve">arXiv. https://doi.org/10.48550/arXiv.2201.08528</w:t>
       </w:r>
     </w:p>
     <w:p>
@@ -2426,7 +2505,7 @@
         <w:t xml:space="preserve">Advances in Neural Information Processing Systems 35 (NeurIPS 2022), Datasets and Benchmarks Track</w:t>
       </w:r>
       <w:r>
-        <w:t xml:space="preserve">. https://arxiv.org/abs/2207.08815</w:t>
+        <w:t xml:space="preserve">. https://doi.org/10.48550/arXiv.2207.08815</w:t>
       </w:r>
     </w:p>
     <w:p>
@@ -2468,7 +2547,7 @@
         <w:t xml:space="preserve">Validation-stage combinatorial fusion analysis for imbalanced credit-card fraud detection</w:t>
       </w:r>
       <w:r>
-        <w:t xml:space="preserve">. arXiv. https://arxiv.org/abs/2606.10393</w:t>
+        <w:t xml:space="preserve">. arXiv. https://doi.org/10.48550/arXiv.2606.10393</w:t>
       </w:r>
     </w:p>
     <w:p>
@@ -2576,7 +2655,7 @@
         <w:t xml:space="preserve">Impact of sampling techniques and data leakage on XGBoost performance in credit card fraud detection</w:t>
       </w:r>
       <w:r>
-        <w:t xml:space="preserve">. arXiv. https://arxiv.org/abs/2412.07437</w:t>
+        <w:t xml:space="preserve">. arXiv. https://doi.org/10.48550/arXiv.2412.07437</w:t>
       </w:r>
     </w:p>
     <w:p>
@@ -2657,10 +2736,13 @@
           <w:i/>
           <w:iCs/>
         </w:rPr>
-        <w:t xml:space="preserve">Machine Learning and Knowledge Discovery in Databases (ECML PKDD 2014)</w:t>
-      </w:r>
-      <w:r>
-        <w:t xml:space="preserve">. Springer. https://arxiv.org/abs/1402.1892</w:t>
+        <w:t xml:space="preserve">Machine Learning and Knowledge Discovery in Databases (ECML PKDD 2014), Lecture Notes in Computer Science</w:t>
+      </w:r>
+      <w:r>
+        <w:t xml:space="preserve"> </w:t>
+      </w:r>
+      <w:r>
+        <w:t xml:space="preserve">(pp. 225–239). Springer. https://doi.org/10.1007/978-3-662-44851-9_15</w:t>
       </w:r>
     </w:p>
     <w:p>
@@ -2705,7 +2787,7 @@
         <w:t xml:space="preserve">Advances in Neural Information Processing Systems 36 (NeurIPS 2023), Datasets and Benchmarks Track</w:t>
       </w:r>
       <w:r>
-        <w:t xml:space="preserve">. https://arxiv.org/abs/2305.02997</w:t>
+        <w:t xml:space="preserve">. https://doi.org/10.48550/arXiv.2305.02997</w:t>
       </w:r>
     </w:p>
     <w:p>
@@ -2855,7 +2937,7 @@
         <w:t xml:space="preserve">The risk shadow of principal component analysis: When 99.9999% variance preservation causes catastrophic decision errors</w:t>
       </w:r>
       <w:r>
-        <w:t xml:space="preserve">. arXiv. https://arxiv.org/abs/2606.14533</w:t>
+        <w:t xml:space="preserve">. arXiv. https://doi.org/10.48550/arXiv.2606.14533</w:t>
       </w:r>
     </w:p>
     <w:p>
@@ -2903,7 +2985,7 @@
         <w:t xml:space="preserve">(9), 1525–1534. https://doi.org/10.1093/jamia/ocac093</w:t>
       </w:r>
     </w:p>
-    <w:bookmarkEnd w:id="66"/>
+    <w:bookmarkEnd w:id="69"/>
     <w:sectPr>
       <w:headerReference r:id="rId14" w:type="even"/>
       <w:headerReference r:id="rId15" w:type="default"/>
@@ -3827,11 +3909,6 @@
       <w:sz w:val="20"/>
       <w:szCs w:val="20"/>
     </w:rPr>
-  </w:style>
-  <w:style w:styleId="Bibliography" w:type="paragraph">
-    <w:name w:val="Bibliography"/>
-    <w:basedOn w:val="Normal"/>
-    <w:qFormat/>
   </w:style>
   <w:style w:customStyle="1" w:styleId="Heading1Char" w:type="character">
     <w:name w:val="Heading 1 Char"/>

</xml_diff>